<commit_message>
Marketing: add final paste-ready "Post Today" set (all channels + Day Pass) (#28)
New docs/launch-posts-today.md: accurate, paste-ready posts for LinkedIn, X,
Facebook, Substack, Medium, and Reddit, plus a full features/benefits block and
the Day Pass woven through. All claims match the honest framing (powered by
Google Gemini 3.5; built for AI answer engines). Added as Part 1 of the MASTER
announcement docx and regenerated.

Co-Authored-By: Claude Opus 4.8 (1M context) <noreply@anthropic.com>
</commit_message>
<xml_diff>
--- a/docs/AEO-Analyzers-MASTER-Announcement.docx
+++ b/docs/AEO-Analyzers-MASTER-Announcement.docx
@@ -1657,7 +1657,2126 @@
           <w:sz w:val="30"/>
           <w:szCs w:val="30"/>
         </w:rPr>
-        <w:t xml:space="preserve">Part 1 — Posting Calendar &amp; Plan (when / where to post)</w:t>
+        <w:t xml:space="preserve">Part 1 — POST TODAY (final, accurate, paste-ready: all channels + features/benefits + Day Pass)</w:t>
+      </w:r>
+    </w:p>
+    <w:p>
+      <w:pPr>
+        <w:pStyle w:val="Heading1"/>
+        <w:spacing w:after="120" w:before="240"/>
+      </w:pPr>
+      <w:r>
+        <w:rPr>
+          <w:b/>
+          <w:bCs/>
+          <w:color w:val="1a1a2e"/>
+          <w:sz w:val="32"/>
+          <w:szCs w:val="32"/>
+        </w:rPr>
+        <w:t xml:space="preserve">AEO Analyzers — Post Today (final, accurate, paste-ready)</w:t>
+      </w:r>
+    </w:p>
+    <w:p>
+      <w:pPr>
+        <w:spacing w:after="80"/>
+      </w:pPr>
+    </w:p>
+    <w:p>
+      <w:pPr>
+        <w:spacing w:after="100"/>
+      </w:pPr>
+      <w:r>
+        <w:rPr>
+          <w:color w:val="333333"/>
+          <w:sz w:val="22"/>
+          <w:szCs w:val="22"/>
+        </w:rPr>
+        <w:t xml:space="preserve">*Owner: Lindsay Hiebert · 2026-06-02. Every claim here is accurate: the app is powered by Google Gemini 3.5 and scores how citable you are BY the major AI answer engines (Gemini, ChatGPT, Perplexity) using the universal AEO standards every engine shares. CTA everywhere → https://www.aeoanalyzers.com*</w:t>
+      </w:r>
+    </w:p>
+    <w:p>
+      <w:pPr>
+        <w:spacing w:after="80"/>
+      </w:pPr>
+    </w:p>
+    <w:p>
+      <w:pPr>
+        <w:pBdr>
+          <w:bottom w:val="single" w:color="cccccc" w:sz="1"/>
+        </w:pBdr>
+        <w:spacing w:after="120"/>
+      </w:pPr>
+    </w:p>
+    <w:p>
+      <w:pPr>
+        <w:spacing w:after="80"/>
+      </w:pPr>
+    </w:p>
+    <w:p>
+      <w:pPr>
+        <w:pStyle w:val="Heading2"/>
+        <w:spacing w:after="100" w:before="220"/>
+      </w:pPr>
+      <w:r>
+        <w:rPr>
+          <w:b/>
+          <w:bCs/>
+          <w:color w:val="1a1a2e"/>
+          <w:sz w:val="26"/>
+          <w:szCs w:val="26"/>
+        </w:rPr>
+        <w:t xml:space="preserve">0. One-liner + must-have line (reuse anywhere)</w:t>
+      </w:r>
+    </w:p>
+    <w:p>
+      <w:pPr>
+        <w:spacing w:after="80"/>
+      </w:pPr>
+    </w:p>
+    <w:p>
+      <w:pPr>
+        <w:spacing w:after="100"/>
+      </w:pPr>
+      <w:r>
+        <w:rPr>
+          <w:b/>
+          <w:bCs/>
+          <w:color w:val="333333"/>
+          <w:sz w:val="22"/>
+          <w:szCs w:val="22"/>
+        </w:rPr>
+        <w:t xml:space="preserve">AI search is zero-sum — one question, one answer, one cited source. AEO Analyzers shows you in ~90 seconds whether AI cites you and exactly what to fix. Be the answer AI gives.</w:t>
+      </w:r>
+    </w:p>
+    <w:p>
+      <w:pPr>
+        <w:spacing w:after="80"/>
+      </w:pPr>
+    </w:p>
+    <w:p>
+      <w:pPr>
+        <w:spacing w:after="100"/>
+      </w:pPr>
+      <w:r>
+        <w:rPr>
+          <w:color w:val="333333"/>
+          <w:sz w:val="22"/>
+          <w:szCs w:val="22"/>
+        </w:rPr>
+        <w:t xml:space="preserve">*If you want your business to show up in the era of answer engines and agentic AI, Answer Engine Optimization is a must-have for every business today.*</w:t>
+      </w:r>
+    </w:p>
+    <w:p>
+      <w:pPr>
+        <w:spacing w:after="80"/>
+      </w:pPr>
+    </w:p>
+    <w:p>
+      <w:pPr>
+        <w:pBdr>
+          <w:bottom w:val="single" w:color="cccccc" w:sz="1"/>
+        </w:pBdr>
+        <w:spacing w:after="120"/>
+      </w:pPr>
+    </w:p>
+    <w:p>
+      <w:pPr>
+        <w:spacing w:after="80"/>
+      </w:pPr>
+    </w:p>
+    <w:p>
+      <w:pPr>
+        <w:pStyle w:val="Heading2"/>
+        <w:spacing w:after="100" w:before="220"/>
+      </w:pPr>
+      <w:r>
+        <w:rPr>
+          <w:b/>
+          <w:bCs/>
+          <w:color w:val="1a1a2e"/>
+          <w:sz w:val="26"/>
+          <w:szCs w:val="26"/>
+        </w:rPr>
+        <w:t xml:space="preserve">1. What this app does — features &amp; benefits (say this about AEO Analyzers)</w:t>
+      </w:r>
+    </w:p>
+    <w:p>
+      <w:pPr>
+        <w:spacing w:after="80"/>
+      </w:pPr>
+    </w:p>
+    <w:p>
+      <w:pPr>
+        <w:spacing w:after="100"/>
+      </w:pPr>
+      <w:r>
+        <w:rPr>
+          <w:b/>
+          <w:bCs/>
+          <w:color w:val="333333"/>
+          <w:sz w:val="22"/>
+          <w:szCs w:val="22"/>
+        </w:rPr>
+        <w:t xml:space="preserve">The diagnosis (free):</w:t>
+      </w:r>
+    </w:p>
+    <w:p>
+      <w:pPr>
+        <w:pStyle w:val="ListParagraph"/>
+        <w:numPr>
+          <w:ilvl w:val="0"/>
+          <w:numId w:val="1"/>
+        </w:numPr>
+        <w:spacing w:after="40"/>
+      </w:pPr>
+      <w:r>
+        <w:rPr>
+          <w:b/>
+          <w:bCs/>
+          <w:color w:val="333333"/>
+          <w:sz w:val="22"/>
+          <w:szCs w:val="22"/>
+        </w:rPr>
+        <w:t xml:space="preserve">0–100 AEO score</w:t>
+      </w:r>
+      <w:r>
+        <w:rPr>
+          <w:color w:val="333333"/>
+          <w:sz w:val="22"/>
+          <w:szCs w:val="22"/>
+        </w:rPr>
+        <w:t xml:space="preserve"> across four dimensions — Entity, Density, Clarity, Structure.</w:t>
+      </w:r>
+    </w:p>
+    <w:p>
+      <w:pPr>
+        <w:pStyle w:val="ListParagraph"/>
+        <w:numPr>
+          <w:ilvl w:val="0"/>
+          <w:numId w:val="1"/>
+        </w:numPr>
+        <w:spacing w:after="40"/>
+      </w:pPr>
+      <w:r>
+        <w:rPr>
+          <w:b/>
+          <w:bCs/>
+          <w:color w:val="333333"/>
+          <w:sz w:val="22"/>
+          <w:szCs w:val="22"/>
+        </w:rPr>
+        <w:t xml:space="preserve">Citation Probability</w:t>
+      </w:r>
+      <w:r>
+        <w:rPr>
+          <w:color w:val="333333"/>
+          <w:sz w:val="22"/>
+          <w:szCs w:val="22"/>
+        </w:rPr>
+        <w:t xml:space="preserve"> — how likely AI is to cite you when answering questions in your domain.</w:t>
+      </w:r>
+    </w:p>
+    <w:p>
+      <w:pPr>
+        <w:pStyle w:val="ListParagraph"/>
+        <w:numPr>
+          <w:ilvl w:val="0"/>
+          <w:numId w:val="1"/>
+        </w:numPr>
+        <w:spacing w:after="40"/>
+      </w:pPr>
+      <w:r>
+        <w:rPr>
+          <w:b/>
+          <w:bCs/>
+          <w:color w:val="333333"/>
+          <w:sz w:val="22"/>
+          <w:szCs w:val="22"/>
+        </w:rPr>
+        <w:t xml:space="preserve">Competitive Duel</w:t>
+      </w:r>
+      <w:r>
+        <w:rPr>
+          <w:color w:val="333333"/>
+          <w:sz w:val="22"/>
+          <w:szCs w:val="22"/>
+        </w:rPr>
+        <w:t xml:space="preserve"> — head-to-head vs any competitor; see who AI would name.</w:t>
+      </w:r>
+    </w:p>
+    <w:p>
+      <w:pPr>
+        <w:pStyle w:val="ListParagraph"/>
+        <w:numPr>
+          <w:ilvl w:val="0"/>
+          <w:numId w:val="1"/>
+        </w:numPr>
+        <w:spacing w:after="40"/>
+      </w:pPr>
+      <w:r>
+        <w:rPr>
+          <w:b/>
+          <w:bCs/>
+          <w:color w:val="333333"/>
+          <w:sz w:val="22"/>
+          <w:szCs w:val="22"/>
+        </w:rPr>
+        <w:t xml:space="preserve">Brand-type detection</w:t>
+      </w:r>
+      <w:r>
+        <w:rPr>
+          <w:color w:val="333333"/>
+          <w:sz w:val="22"/>
+          <w:szCs w:val="22"/>
+        </w:rPr>
+        <w:t xml:space="preserve"> — editorial / news / SaaS / ecommerce / service (scoring adapts to your type).</w:t>
+      </w:r>
+    </w:p>
+    <w:p>
+      <w:pPr>
+        <w:spacing w:after="80"/>
+      </w:pPr>
+    </w:p>
+    <w:p>
+      <w:pPr>
+        <w:spacing w:after="100"/>
+      </w:pPr>
+      <w:r>
+        <w:rPr>
+          <w:b/>
+          <w:bCs/>
+          <w:color w:val="333333"/>
+          <w:sz w:val="22"/>
+          <w:szCs w:val="22"/>
+        </w:rPr>
+        <w:t xml:space="preserve">The cure (the part most "AI audit" tools don't give you):</w:t>
+      </w:r>
+    </w:p>
+    <w:p>
+      <w:pPr>
+        <w:pStyle w:val="ListParagraph"/>
+        <w:numPr>
+          <w:ilvl w:val="0"/>
+          <w:numId w:val="1"/>
+        </w:numPr>
+        <w:spacing w:after="40"/>
+      </w:pPr>
+      <w:r>
+        <w:rPr>
+          <w:b/>
+          <w:bCs/>
+          <w:color w:val="333333"/>
+          <w:sz w:val="22"/>
+          <w:szCs w:val="22"/>
+        </w:rPr>
+        <w:t xml:space="preserve">Paste-ready JSON-LD</w:t>
+      </w:r>
+      <w:r>
+        <w:rPr>
+          <w:color w:val="333333"/>
+          <w:sz w:val="22"/>
+          <w:szCs w:val="22"/>
+        </w:rPr>
+        <w:t xml:space="preserve">, split into </w:t>
+      </w:r>
+      <w:r>
+        <w:rPr>
+          <w:b/>
+          <w:bCs/>
+          <w:color w:val="333333"/>
+          <w:sz w:val="22"/>
+          <w:szCs w:val="22"/>
+        </w:rPr>
+        <w:t xml:space="preserve">Verified</w:t>
+      </w:r>
+      <w:r>
+        <w:rPr>
+          <w:color w:val="333333"/>
+          <w:sz w:val="22"/>
+          <w:szCs w:val="22"/>
+        </w:rPr>
+        <w:t xml:space="preserve"> (detected on your page) vs </w:t>
+      </w:r>
+      <w:r>
+        <w:rPr>
+          <w:b/>
+          <w:bCs/>
+          <w:color w:val="333333"/>
+          <w:sz w:val="22"/>
+          <w:szCs w:val="22"/>
+        </w:rPr>
+        <w:t xml:space="preserve">Candidate</w:t>
+      </w:r>
+      <w:r>
+        <w:rPr>
+          <w:color w:val="333333"/>
+          <w:sz w:val="22"/>
+          <w:szCs w:val="22"/>
+        </w:rPr>
+        <w:t xml:space="preserve"> (verify before publishing) — *so you never paste a guessed "fact" that teaches AI something wrong about you.*</w:t>
+      </w:r>
+    </w:p>
+    <w:p>
+      <w:pPr>
+        <w:pStyle w:val="ListParagraph"/>
+        <w:numPr>
+          <w:ilvl w:val="0"/>
+          <w:numId w:val="1"/>
+        </w:numPr>
+        <w:spacing w:after="40"/>
+      </w:pPr>
+      <w:r>
+        <w:rPr>
+          <w:b/>
+          <w:bCs/>
+          <w:color w:val="333333"/>
+          <w:sz w:val="22"/>
+          <w:szCs w:val="22"/>
+        </w:rPr>
+        <w:t xml:space="preserve">Before/after content rewrites</w:t>
+      </w:r>
+      <w:r>
+        <w:rPr>
+          <w:color w:val="333333"/>
+          <w:sz w:val="22"/>
+          <w:szCs w:val="22"/>
+        </w:rPr>
+        <w:t xml:space="preserve"> (vague marketing → citable, specific claims).</w:t>
+      </w:r>
+    </w:p>
+    <w:p>
+      <w:pPr>
+        <w:pStyle w:val="ListParagraph"/>
+        <w:numPr>
+          <w:ilvl w:val="0"/>
+          <w:numId w:val="1"/>
+        </w:numPr>
+        <w:spacing w:after="40"/>
+      </w:pPr>
+      <w:r>
+        <w:rPr>
+          <w:b/>
+          <w:bCs/>
+          <w:color w:val="333333"/>
+          <w:sz w:val="22"/>
+          <w:szCs w:val="22"/>
+        </w:rPr>
+        <w:t xml:space="preserve">Meta-description rewrite</w:t>
+      </w:r>
+      <w:r>
+        <w:rPr>
+          <w:color w:val="333333"/>
+          <w:sz w:val="22"/>
+          <w:szCs w:val="22"/>
+        </w:rPr>
+        <w:t xml:space="preserve">, a </w:t>
+      </w:r>
+      <w:r>
+        <w:rPr>
+          <w:b/>
+          <w:bCs/>
+          <w:color w:val="333333"/>
+          <w:sz w:val="22"/>
+          <w:szCs w:val="22"/>
+        </w:rPr>
+        <w:t xml:space="preserve">prioritized fix checklist</w:t>
+      </w:r>
+      <w:r>
+        <w:rPr>
+          <w:color w:val="333333"/>
+          <w:sz w:val="22"/>
+          <w:szCs w:val="22"/>
+        </w:rPr>
+        <w:t xml:space="preserve">, and a </w:t>
+      </w:r>
+      <w:r>
+        <w:rPr>
+          <w:b/>
+          <w:bCs/>
+          <w:color w:val="333333"/>
+          <w:sz w:val="22"/>
+          <w:szCs w:val="22"/>
+        </w:rPr>
+        <w:t xml:space="preserve">Word (.docx) report + web-team handoff</w:t>
+      </w:r>
+      <w:r>
+        <w:rPr>
+          <w:color w:val="333333"/>
+          <w:sz w:val="22"/>
+          <w:szCs w:val="22"/>
+        </w:rPr>
+        <w:t xml:space="preserve"> your developer can ship as-is.</w:t>
+      </w:r>
+    </w:p>
+    <w:p>
+      <w:pPr>
+        <w:pStyle w:val="ListParagraph"/>
+        <w:numPr>
+          <w:ilvl w:val="0"/>
+          <w:numId w:val="1"/>
+        </w:numPr>
+        <w:spacing w:after="40"/>
+      </w:pPr>
+      <w:r>
+        <w:rPr>
+          <w:b/>
+          <w:bCs/>
+          <w:color w:val="333333"/>
+          <w:sz w:val="22"/>
+          <w:szCs w:val="22"/>
+        </w:rPr>
+        <w:t xml:space="preserve">Brand-aware</w:t>
+      </w:r>
+      <w:r>
+        <w:rPr>
+          <w:color w:val="333333"/>
+          <w:sz w:val="22"/>
+          <w:szCs w:val="22"/>
+        </w:rPr>
+        <w:t xml:space="preserve"> — it won't corporatize an editorial voice.</w:t>
+      </w:r>
+    </w:p>
+    <w:p>
+      <w:pPr>
+        <w:spacing w:after="80"/>
+      </w:pPr>
+    </w:p>
+    <w:p>
+      <w:pPr>
+        <w:spacing w:after="100"/>
+      </w:pPr>
+      <w:r>
+        <w:rPr>
+          <w:b/>
+          <w:bCs/>
+          <w:color w:val="333333"/>
+          <w:sz w:val="22"/>
+          <w:szCs w:val="22"/>
+        </w:rPr>
+        <w:t xml:space="preserve">Advanced diagnostics:</w:t>
+      </w:r>
+      <w:r>
+        <w:rPr>
+          <w:color w:val="333333"/>
+          <w:sz w:val="22"/>
+          <w:szCs w:val="22"/>
+        </w:rPr>
+        <w:t xml:space="preserve"> Citation Hook Density · E-E-A-T Author Audit · LLM Summarization Test · Zero-Click / Snippet Predictor · Query-to-Content Gap · Semantic Chunking.</w:t>
+      </w:r>
+    </w:p>
+    <w:p>
+      <w:pPr>
+        <w:spacing w:after="80"/>
+      </w:pPr>
+    </w:p>
+    <w:p>
+      <w:pPr>
+        <w:spacing w:after="100"/>
+      </w:pPr>
+      <w:r>
+        <w:rPr>
+          <w:b/>
+          <w:bCs/>
+          <w:color w:val="333333"/>
+          <w:sz w:val="22"/>
+          <w:szCs w:val="22"/>
+        </w:rPr>
+        <w:t xml:space="preserve">Pricing:</w:t>
+      </w:r>
+    </w:p>
+    <w:p>
+      <w:pPr>
+        <w:pStyle w:val="ListParagraph"/>
+        <w:numPr>
+          <w:ilvl w:val="0"/>
+          <w:numId w:val="1"/>
+        </w:numPr>
+        <w:spacing w:after="40"/>
+      </w:pPr>
+      <w:r>
+        <w:rPr>
+          <w:b/>
+          <w:bCs/>
+          <w:color w:val="333333"/>
+          <w:sz w:val="22"/>
+          <w:szCs w:val="22"/>
+        </w:rPr>
+        <w:t xml:space="preserve">Free</w:t>
+      </w:r>
+      <w:r>
+        <w:rPr>
+          <w:color w:val="333333"/>
+          <w:sz w:val="22"/>
+          <w:szCs w:val="22"/>
+        </w:rPr>
+        <w:t xml:space="preserve"> — one full diagnosis (scores + gaps).</w:t>
+      </w:r>
+    </w:p>
+    <w:p>
+      <w:pPr>
+        <w:pStyle w:val="ListParagraph"/>
+        <w:numPr>
+          <w:ilvl w:val="0"/>
+          <w:numId w:val="1"/>
+        </w:numPr>
+        <w:spacing w:after="40"/>
+      </w:pPr>
+      <w:r>
+        <w:rPr>
+          <w:b/>
+          <w:bCs/>
+          <w:color w:val="333333"/>
+          <w:sz w:val="22"/>
+          <w:szCs w:val="22"/>
+        </w:rPr>
+        <w:t xml:space="preserve">Day Pass — $24, one-time:</w:t>
+      </w:r>
+      <w:r>
+        <w:rPr>
+          <w:color w:val="333333"/>
+          <w:sz w:val="22"/>
+          <w:szCs w:val="22"/>
+        </w:rPr>
+        <w:t xml:space="preserve"> unlock every fix, the paste-ready JSON-LD, and the Word report for </w:t>
+      </w:r>
+      <w:r>
+        <w:rPr>
+          <w:b/>
+          <w:bCs/>
+          <w:color w:val="333333"/>
+          <w:sz w:val="22"/>
+          <w:szCs w:val="22"/>
+        </w:rPr>
+        <w:t xml:space="preserve">24 hours. No subscription. Expires automatically.</w:t>
+      </w:r>
+      <w:r>
+        <w:rPr>
+          <w:color w:val="333333"/>
+          <w:sz w:val="22"/>
+          <w:szCs w:val="22"/>
+        </w:rPr>
+        <w:t xml:space="preserve"> Perfect if you just need to fix one site.</w:t>
+      </w:r>
+    </w:p>
+    <w:p>
+      <w:pPr>
+        <w:pStyle w:val="ListParagraph"/>
+        <w:numPr>
+          <w:ilvl w:val="0"/>
+          <w:numId w:val="1"/>
+        </w:numPr>
+        <w:spacing w:after="40"/>
+      </w:pPr>
+      <w:r>
+        <w:rPr>
+          <w:b/>
+          <w:bCs/>
+          <w:color w:val="333333"/>
+          <w:sz w:val="22"/>
+          <w:szCs w:val="22"/>
+        </w:rPr>
+        <w:t xml:space="preserve">Pro — $49/mo</w:t>
+      </w:r>
+      <w:r>
+        <w:rPr>
+          <w:color w:val="333333"/>
+          <w:sz w:val="22"/>
+          <w:szCs w:val="22"/>
+        </w:rPr>
+        <w:t xml:space="preserve"> (freelancers / small teams) · </w:t>
+      </w:r>
+      <w:r>
+        <w:rPr>
+          <w:b/>
+          <w:bCs/>
+          <w:color w:val="333333"/>
+          <w:sz w:val="22"/>
+          <w:szCs w:val="22"/>
+        </w:rPr>
+        <w:t xml:space="preserve">Business — $199/mo</w:t>
+      </w:r>
+      <w:r>
+        <w:rPr>
+          <w:color w:val="333333"/>
+          <w:sz w:val="22"/>
+          <w:szCs w:val="22"/>
+        </w:rPr>
+        <w:t xml:space="preserve"> (agencies / multi-site / SaaS).</w:t>
+      </w:r>
+    </w:p>
+    <w:p>
+      <w:pPr>
+        <w:spacing w:after="80"/>
+      </w:pPr>
+    </w:p>
+    <w:p>
+      <w:pPr>
+        <w:spacing w:after="100"/>
+      </w:pPr>
+      <w:r>
+        <w:rPr>
+          <w:b/>
+          <w:bCs/>
+          <w:color w:val="333333"/>
+          <w:sz w:val="22"/>
+          <w:szCs w:val="22"/>
+        </w:rPr>
+        <w:t xml:space="preserve">Powered by Google Gemini 3.5. ~90 seconds. The fixes are universal standards every answer engine uses.</w:t>
+      </w:r>
+    </w:p>
+    <w:p>
+      <w:pPr>
+        <w:spacing w:after="80"/>
+      </w:pPr>
+    </w:p>
+    <w:p>
+      <w:pPr>
+        <w:pBdr>
+          <w:bottom w:val="single" w:color="cccccc" w:sz="1"/>
+        </w:pBdr>
+        <w:spacing w:after="120"/>
+      </w:pPr>
+    </w:p>
+    <w:p>
+      <w:pPr>
+        <w:spacing w:after="80"/>
+      </w:pPr>
+    </w:p>
+    <w:p>
+      <w:pPr>
+        <w:pStyle w:val="Heading2"/>
+        <w:spacing w:after="100" w:before="220"/>
+      </w:pPr>
+      <w:r>
+        <w:rPr>
+          <w:b/>
+          <w:bCs/>
+          <w:color w:val="1a1a2e"/>
+          <w:sz w:val="26"/>
+          <w:szCs w:val="26"/>
+        </w:rPr>
+        <w:t xml:space="preserve">2. LinkedIn — post (founder voice) · 🖼 aeo-og-bta-2026.png</w:t>
+      </w:r>
+    </w:p>
+    <w:p>
+      <w:pPr>
+        <w:spacing w:after="80"/>
+      </w:pPr>
+    </w:p>
+    <w:p>
+      <w:pPr>
+        <w:spacing w:after="60"/>
+        <w:ind w:left="360"/>
+      </w:pPr>
+      <w:r>
+        <w:rPr>
+          <w:i/>
+          <w:iCs/>
+          <w:color w:val="555555"/>
+          <w:sz w:val="22"/>
+          <w:szCs w:val="22"/>
+        </w:rPr>
+        <w:t xml:space="preserve">Your customers stopped scrolling. They ask AI — and read </w:t>
+      </w:r>
+      <w:r>
+        <w:rPr>
+          <w:b/>
+          <w:bCs/>
+          <w:i/>
+          <w:iCs/>
+          <w:color w:val="555555"/>
+          <w:sz w:val="22"/>
+          <w:szCs w:val="22"/>
+        </w:rPr>
+        <w:t xml:space="preserve">one</w:t>
+      </w:r>
+      <w:r>
+        <w:rPr>
+          <w:i/>
+          <w:iCs/>
+          <w:color w:val="555555"/>
+          <w:sz w:val="22"/>
+          <w:szCs w:val="22"/>
+        </w:rPr>
+        <w:t xml:space="preserve"> answer.</w:t>
+      </w:r>
+    </w:p>
+    <w:p>
+      <w:pPr>
+        <w:spacing w:after="60"/>
+        <w:ind w:left="360"/>
+      </w:pPr>
+      <w:r>
+        <w:rPr>
+          <w:i/>
+          <w:iCs/>
+          <w:color w:val="555555"/>
+          <w:sz w:val="22"/>
+          <w:szCs w:val="22"/>
+        </w:rPr>
+        <w:t xml:space="preserve"/>
+      </w:r>
+    </w:p>
+    <w:p>
+      <w:pPr>
+        <w:spacing w:after="60"/>
+        <w:ind w:left="360"/>
+      </w:pPr>
+      <w:r>
+        <w:rPr>
+          <w:i/>
+          <w:iCs/>
+          <w:color w:val="555555"/>
+          <w:sz w:val="22"/>
+          <w:szCs w:val="22"/>
+        </w:rPr>
+        <w:t xml:space="preserve">That answer is built from the few sources the AI trusts. If a competitor is cited and you're not, you lose the sale and never see it in your analytics.</w:t>
+      </w:r>
+    </w:p>
+    <w:p>
+      <w:pPr>
+        <w:spacing w:after="60"/>
+        <w:ind w:left="360"/>
+      </w:pPr>
+      <w:r>
+        <w:rPr>
+          <w:i/>
+          <w:iCs/>
+          <w:color w:val="555555"/>
+          <w:sz w:val="22"/>
+          <w:szCs w:val="22"/>
+        </w:rPr>
+        <w:t xml:space="preserve"/>
+      </w:r>
+    </w:p>
+    <w:p>
+      <w:pPr>
+        <w:spacing w:after="60"/>
+        <w:ind w:left="360"/>
+      </w:pPr>
+      <w:r>
+        <w:rPr>
+          <w:i/>
+          <w:iCs/>
+          <w:color w:val="555555"/>
+          <w:sz w:val="22"/>
+          <w:szCs w:val="22"/>
+        </w:rPr>
+        <w:t xml:space="preserve">That's Answer Engine Optimization (AEO) — the new must-have. SEO got you onto the page; AEO decides whether you ARE the answer.</w:t>
+      </w:r>
+    </w:p>
+    <w:p>
+      <w:pPr>
+        <w:spacing w:after="60"/>
+        <w:ind w:left="360"/>
+      </w:pPr>
+      <w:r>
+        <w:rPr>
+          <w:i/>
+          <w:iCs/>
+          <w:color w:val="555555"/>
+          <w:sz w:val="22"/>
+          <w:szCs w:val="22"/>
+        </w:rPr>
+        <w:t xml:space="preserve"/>
+      </w:r>
+    </w:p>
+    <w:p>
+      <w:pPr>
+        <w:spacing w:after="60"/>
+        <w:ind w:left="360"/>
+      </w:pPr>
+      <w:r>
+        <w:rPr>
+          <w:i/>
+          <w:iCs/>
+          <w:color w:val="555555"/>
+          <w:sz w:val="22"/>
+          <w:szCs w:val="22"/>
+        </w:rPr>
+        <w:t xml:space="preserve">We just re-launched </w:t>
+      </w:r>
+      <w:r>
+        <w:rPr>
+          <w:b/>
+          <w:bCs/>
+          <w:i/>
+          <w:iCs/>
+          <w:color w:val="555555"/>
+          <w:sz w:val="22"/>
+          <w:szCs w:val="22"/>
+        </w:rPr>
+        <w:t xml:space="preserve">AEO Analyzers</w:t>
+      </w:r>
+      <w:r>
+        <w:rPr>
+          <w:i/>
+          <w:iCs/>
+          <w:color w:val="555555"/>
+          <w:sz w:val="22"/>
+          <w:szCs w:val="22"/>
+        </w:rPr>
+        <w:t xml:space="preserve">. Powered by Google Gemini 3.5, in ~90 seconds it gives you:</w:t>
+      </w:r>
+    </w:p>
+    <w:p>
+      <w:pPr>
+        <w:spacing w:after="60"/>
+        <w:ind w:left="360"/>
+      </w:pPr>
+      <w:r>
+        <w:rPr>
+          <w:i/>
+          <w:iCs/>
+          <w:color w:val="555555"/>
+          <w:sz w:val="22"/>
+          <w:szCs w:val="22"/>
+        </w:rPr>
+        <w:t xml:space="preserve">• your </w:t>
+      </w:r>
+      <w:r>
+        <w:rPr>
+          <w:b/>
+          <w:bCs/>
+          <w:i/>
+          <w:iCs/>
+          <w:color w:val="555555"/>
+          <w:sz w:val="22"/>
+          <w:szCs w:val="22"/>
+        </w:rPr>
+        <w:t xml:space="preserve">AEO score</w:t>
+      </w:r>
+      <w:r>
+        <w:rPr>
+          <w:i/>
+          <w:iCs/>
+          <w:color w:val="555555"/>
+          <w:sz w:val="22"/>
+          <w:szCs w:val="22"/>
+        </w:rPr>
+        <w:t xml:space="preserve"> + </w:t>
+      </w:r>
+      <w:r>
+        <w:rPr>
+          <w:b/>
+          <w:bCs/>
+          <w:i/>
+          <w:iCs/>
+          <w:color w:val="555555"/>
+          <w:sz w:val="22"/>
+          <w:szCs w:val="22"/>
+        </w:rPr>
+        <w:t xml:space="preserve">Citation Probability</w:t>
+      </w:r>
+    </w:p>
+    <w:p>
+      <w:pPr>
+        <w:spacing w:after="60"/>
+        <w:ind w:left="360"/>
+      </w:pPr>
+      <w:r>
+        <w:rPr>
+          <w:i/>
+          <w:iCs/>
+          <w:color w:val="555555"/>
+          <w:sz w:val="22"/>
+          <w:szCs w:val="22"/>
+        </w:rPr>
+        <w:t xml:space="preserve">• a </w:t>
+      </w:r>
+      <w:r>
+        <w:rPr>
+          <w:b/>
+          <w:bCs/>
+          <w:i/>
+          <w:iCs/>
+          <w:color w:val="555555"/>
+          <w:sz w:val="22"/>
+          <w:szCs w:val="22"/>
+        </w:rPr>
+        <w:t xml:space="preserve">head-to-head Competitive Duel</w:t>
+      </w:r>
+      <w:r>
+        <w:rPr>
+          <w:i/>
+          <w:iCs/>
+          <w:color w:val="555555"/>
+          <w:sz w:val="22"/>
+          <w:szCs w:val="22"/>
+        </w:rPr>
+        <w:t xml:space="preserve"> vs a rival</w:t>
+      </w:r>
+    </w:p>
+    <w:p>
+      <w:pPr>
+        <w:spacing w:after="60"/>
+        <w:ind w:left="360"/>
+      </w:pPr>
+      <w:r>
+        <w:rPr>
+          <w:i/>
+          <w:iCs/>
+          <w:color w:val="555555"/>
+          <w:sz w:val="22"/>
+          <w:szCs w:val="22"/>
+        </w:rPr>
+        <w:t xml:space="preserve">• the </w:t>
+      </w:r>
+      <w:r>
+        <w:rPr>
+          <w:b/>
+          <w:bCs/>
+          <w:i/>
+          <w:iCs/>
+          <w:color w:val="555555"/>
+          <w:sz w:val="22"/>
+          <w:szCs w:val="22"/>
+        </w:rPr>
+        <w:t xml:space="preserve">exact fixes</w:t>
+      </w:r>
+      <w:r>
+        <w:rPr>
+          <w:i/>
+          <w:iCs/>
+          <w:color w:val="555555"/>
+          <w:sz w:val="22"/>
+          <w:szCs w:val="22"/>
+        </w:rPr>
+        <w:t xml:space="preserve"> — paste-ready JSON-LD (verified vs candidate, so you never paste a guessed fact), content rewrites, and a Word report your dev can ship.</w:t>
+      </w:r>
+    </w:p>
+    <w:p>
+      <w:pPr>
+        <w:spacing w:after="60"/>
+        <w:ind w:left="360"/>
+      </w:pPr>
+      <w:r>
+        <w:rPr>
+          <w:i/>
+          <w:iCs/>
+          <w:color w:val="555555"/>
+          <w:sz w:val="22"/>
+          <w:szCs w:val="22"/>
+        </w:rPr>
+        <w:t xml:space="preserve"/>
+      </w:r>
+    </w:p>
+    <w:p>
+      <w:pPr>
+        <w:spacing w:after="60"/>
+        <w:ind w:left="360"/>
+      </w:pPr>
+      <w:r>
+        <w:rPr>
+          <w:i/>
+          <w:iCs/>
+          <w:color w:val="555555"/>
+          <w:sz w:val="22"/>
+          <w:szCs w:val="22"/>
+        </w:rPr>
+        <w:t xml:space="preserve">Only need to fix one site? There's a </w:t>
+      </w:r>
+      <w:r>
+        <w:rPr>
+          <w:b/>
+          <w:bCs/>
+          <w:i/>
+          <w:iCs/>
+          <w:color w:val="555555"/>
+          <w:sz w:val="22"/>
+          <w:szCs w:val="22"/>
+        </w:rPr>
+        <w:t xml:space="preserve">$24 Day Pass</w:t>
+      </w:r>
+      <w:r>
+        <w:rPr>
+          <w:i/>
+          <w:iCs/>
+          <w:color w:val="555555"/>
+          <w:sz w:val="22"/>
+          <w:szCs w:val="22"/>
+        </w:rPr>
+        <w:t xml:space="preserve"> — full access for 24 hours, no subscription.</w:t>
+      </w:r>
+    </w:p>
+    <w:p>
+      <w:pPr>
+        <w:spacing w:after="60"/>
+        <w:ind w:left="360"/>
+      </w:pPr>
+      <w:r>
+        <w:rPr>
+          <w:i/>
+          <w:iCs/>
+          <w:color w:val="555555"/>
+          <w:sz w:val="22"/>
+          <w:szCs w:val="22"/>
+        </w:rPr>
+        <w:t xml:space="preserve"/>
+      </w:r>
+    </w:p>
+    <w:p>
+      <w:pPr>
+        <w:spacing w:after="60"/>
+        <w:ind w:left="360"/>
+      </w:pPr>
+      <w:r>
+        <w:rPr>
+          <w:i/>
+          <w:iCs/>
+          <w:color w:val="555555"/>
+          <w:sz w:val="22"/>
+          <w:szCs w:val="22"/>
+        </w:rPr>
+        <w:t xml:space="preserve">We even ran it on ourselves, found we were invisible to AI, and fixed it.</w:t>
+      </w:r>
+    </w:p>
+    <w:p>
+      <w:pPr>
+        <w:spacing w:after="60"/>
+        <w:ind w:left="360"/>
+      </w:pPr>
+      <w:r>
+        <w:rPr>
+          <w:i/>
+          <w:iCs/>
+          <w:color w:val="555555"/>
+          <w:sz w:val="22"/>
+          <w:szCs w:val="22"/>
+        </w:rPr>
+        <w:t xml:space="preserve"/>
+      </w:r>
+    </w:p>
+    <w:p>
+      <w:pPr>
+        <w:spacing w:after="60"/>
+        <w:ind w:left="360"/>
+      </w:pPr>
+      <w:r>
+        <w:rPr>
+          <w:i/>
+          <w:iCs/>
+          <w:color w:val="555555"/>
+          <w:sz w:val="22"/>
+          <w:szCs w:val="22"/>
+        </w:rPr>
+        <w:t xml:space="preserve">Run a free audit on your site — then your top competitor. The gap between the two scores is the gap AI is using to choose between you. 🔗 Free audit — link in the first comment 👇</w:t>
+      </w:r>
+    </w:p>
+    <w:p>
+      <w:pPr>
+        <w:spacing w:after="60"/>
+        <w:ind w:left="360"/>
+      </w:pPr>
+      <w:r>
+        <w:rPr>
+          <w:i/>
+          <w:iCs/>
+          <w:color w:val="555555"/>
+          <w:sz w:val="22"/>
+          <w:szCs w:val="22"/>
+        </w:rPr>
+        <w:t xml:space="preserve">#AEO #GEO #AISearch #SEO #DigitalMarketing</w:t>
+      </w:r>
+    </w:p>
+    <w:p>
+      <w:pPr>
+        <w:spacing w:after="80"/>
+      </w:pPr>
+    </w:p>
+    <w:p>
+      <w:pPr>
+        <w:spacing w:after="100"/>
+      </w:pPr>
+      <w:r>
+        <w:rPr>
+          <w:b/>
+          <w:bCs/>
+          <w:color w:val="333333"/>
+          <w:sz w:val="22"/>
+          <w:szCs w:val="22"/>
+        </w:rPr>
+        <w:t xml:space="preserve">First comment (paste, then pin):</w:t>
+      </w:r>
+    </w:p>
+    <w:p>
+      <w:pPr>
+        <w:spacing w:after="60"/>
+        <w:ind w:left="360"/>
+      </w:pPr>
+      <w:r>
+        <w:rPr>
+          <w:i/>
+          <w:iCs/>
+          <w:color w:val="555555"/>
+          <w:sz w:val="22"/>
+          <w:szCs w:val="22"/>
+        </w:rPr>
+        <w:t xml:space="preserve">👉 See how AI describes and cites your brand — free, ~90 seconds, no signup for your score: https://aeoanalyzers.com</w:t>
+      </w:r>
+    </w:p>
+    <w:p>
+      <w:pPr>
+        <w:spacing w:after="60"/>
+        <w:ind w:left="360"/>
+      </w:pPr>
+      <w:r>
+        <w:rPr>
+          <w:i/>
+          <w:iCs/>
+          <w:color w:val="555555"/>
+          <w:sz w:val="22"/>
+          <w:szCs w:val="22"/>
+        </w:rPr>
+        <w:t xml:space="preserve">Then run your #1 competitor. The gap between the two scores is the gap AI is using to choose between you right now.</w:t>
+      </w:r>
+    </w:p>
+    <w:p>
+      <w:pPr>
+        <w:spacing w:after="60"/>
+        <w:ind w:left="360"/>
+      </w:pPr>
+      <w:r>
+        <w:rPr>
+          <w:i/>
+          <w:iCs/>
+          <w:color w:val="555555"/>
+          <w:sz w:val="22"/>
+          <w:szCs w:val="22"/>
+        </w:rPr>
+        <w:t xml:space="preserve">Only have one site? Grab a </w:t>
+      </w:r>
+      <w:r>
+        <w:rPr>
+          <w:b/>
+          <w:bCs/>
+          <w:i/>
+          <w:iCs/>
+          <w:color w:val="555555"/>
+          <w:sz w:val="22"/>
+          <w:szCs w:val="22"/>
+        </w:rPr>
+        <w:t xml:space="preserve">$24 Day Pass</w:t>
+      </w:r>
+      <w:r>
+        <w:rPr>
+          <w:i/>
+          <w:iCs/>
+          <w:color w:val="555555"/>
+          <w:sz w:val="22"/>
+          <w:szCs w:val="22"/>
+        </w:rPr>
+        <w:t xml:space="preserve"> — full access for 24 hours, no subscription.</w:t>
+      </w:r>
+    </w:p>
+    <w:p>
+      <w:pPr>
+        <w:spacing w:after="80"/>
+      </w:pPr>
+    </w:p>
+    <w:p>
+      <w:pPr>
+        <w:pBdr>
+          <w:bottom w:val="single" w:color="cccccc" w:sz="1"/>
+        </w:pBdr>
+        <w:spacing w:after="120"/>
+      </w:pPr>
+    </w:p>
+    <w:p>
+      <w:pPr>
+        <w:spacing w:after="80"/>
+      </w:pPr>
+    </w:p>
+    <w:p>
+      <w:pPr>
+        <w:pStyle w:val="Heading2"/>
+        <w:spacing w:after="100" w:before="220"/>
+      </w:pPr>
+      <w:r>
+        <w:rPr>
+          <w:b/>
+          <w:bCs/>
+          <w:color w:val="1a1a2e"/>
+          <w:sz w:val="26"/>
+          <w:szCs w:val="26"/>
+        </w:rPr>
+        <w:t xml:space="preserve">3. X / Twitter — thread · 🖼 tweet 1: aeo-og-bta-2026.png</w:t>
+      </w:r>
+    </w:p>
+    <w:p>
+      <w:pPr>
+        <w:spacing w:after="80"/>
+      </w:pPr>
+    </w:p>
+    <w:p>
+      <w:pPr>
+        <w:spacing w:after="40"/>
+        <w:ind w:left="360"/>
+      </w:pPr>
+      <w:r>
+        <w:rPr>
+          <w:color w:val="333333"/>
+          <w:sz w:val="22"/>
+          <w:szCs w:val="22"/>
+        </w:rPr>
+        <w:t xml:space="preserve">1. AI search is zero-sum. One question → one answer → one cited source. If it's your competitor and not you, you lose the customer and never see it. 🧵</w:t>
+      </w:r>
+    </w:p>
+    <w:p>
+      <w:pPr>
+        <w:spacing w:after="40"/>
+        <w:ind w:left="360"/>
+      </w:pPr>
+      <w:r>
+        <w:rPr>
+          <w:color w:val="333333"/>
+          <w:sz w:val="22"/>
+          <w:szCs w:val="22"/>
+        </w:rPr>
+        <w:t xml:space="preserve">2. That's AEO. SEO got you onto the results page. AEO decides whether you ARE the result.</w:t>
+      </w:r>
+    </w:p>
+    <w:p>
+      <w:pPr>
+        <w:spacing w:after="40"/>
+        <w:ind w:left="360"/>
+      </w:pPr>
+      <w:r>
+        <w:rPr>
+          <w:color w:val="333333"/>
+          <w:sz w:val="22"/>
+          <w:szCs w:val="22"/>
+        </w:rPr>
+        <w:t xml:space="preserve">3. We re-launched AEO Analyzers (powered by Gemini 3.5): ~90 sec → your AEO score + Citation Probability + a head-to-head Competitive Duel.</w:t>
+      </w:r>
+    </w:p>
+    <w:p>
+      <w:pPr>
+        <w:spacing w:after="40"/>
+        <w:ind w:left="360"/>
+      </w:pPr>
+      <w:r>
+        <w:rPr>
+          <w:color w:val="333333"/>
+          <w:sz w:val="22"/>
+          <w:szCs w:val="22"/>
+        </w:rPr>
+        <w:t xml:space="preserve">4. The part other tools skip: the </w:t>
+      </w:r>
+      <w:r>
+        <w:rPr>
+          <w:b/>
+          <w:bCs/>
+          <w:color w:val="333333"/>
+          <w:sz w:val="22"/>
+          <w:szCs w:val="22"/>
+        </w:rPr>
+        <w:t xml:space="preserve">cure</w:t>
+      </w:r>
+      <w:r>
+        <w:rPr>
+          <w:color w:val="333333"/>
+          <w:sz w:val="22"/>
+          <w:szCs w:val="22"/>
+        </w:rPr>
+        <w:t xml:space="preserve">. Paste-ready JSON-LD (verified vs candidate — never paste a guessed fact), content rewrites, and a Word report your dev can ship.</w:t>
+      </w:r>
+    </w:p>
+    <w:p>
+      <w:pPr>
+        <w:spacing w:after="40"/>
+        <w:ind w:left="360"/>
+      </w:pPr>
+      <w:r>
+        <w:rPr>
+          <w:color w:val="333333"/>
+          <w:sz w:val="22"/>
+          <w:szCs w:val="22"/>
+        </w:rPr>
+        <w:t xml:space="preserve">5. Just need to fix one site? </w:t>
+      </w:r>
+      <w:r>
+        <w:rPr>
+          <w:b/>
+          <w:bCs/>
+          <w:color w:val="333333"/>
+          <w:sz w:val="22"/>
+          <w:szCs w:val="22"/>
+        </w:rPr>
+        <w:t xml:space="preserve">$24 Day Pass</w:t>
+      </w:r>
+      <w:r>
+        <w:rPr>
+          <w:color w:val="333333"/>
+          <w:sz w:val="22"/>
+          <w:szCs w:val="22"/>
+        </w:rPr>
+        <w:t xml:space="preserve"> — 24 hours of full access, no subscription.</w:t>
+      </w:r>
+    </w:p>
+    <w:p>
+      <w:pPr>
+        <w:spacing w:after="40"/>
+        <w:ind w:left="360"/>
+      </w:pPr>
+      <w:r>
+        <w:rPr>
+          <w:color w:val="333333"/>
+          <w:sz w:val="22"/>
+          <w:szCs w:val="22"/>
+        </w:rPr>
+        <w:t xml:space="preserve">6. We ran it on ourselves, found we were invisible to AI, fixed it. Dogfooded.</w:t>
+      </w:r>
+    </w:p>
+    <w:p>
+      <w:pPr>
+        <w:spacing w:after="40"/>
+        <w:ind w:left="360"/>
+      </w:pPr>
+      <w:r>
+        <w:rPr>
+          <w:color w:val="333333"/>
+          <w:sz w:val="22"/>
+          <w:szCs w:val="22"/>
+        </w:rPr>
+        <w:t xml:space="preserve">7. Free audit on your site + your competitor 👉 https://aeoanalyzers.com</w:t>
+      </w:r>
+    </w:p>
+    <w:p>
+      <w:pPr>
+        <w:spacing w:after="80"/>
+      </w:pPr>
+    </w:p>
+    <w:p>
+      <w:pPr>
+        <w:pBdr>
+          <w:bottom w:val="single" w:color="cccccc" w:sz="1"/>
+        </w:pBdr>
+        <w:spacing w:after="120"/>
+      </w:pPr>
+    </w:p>
+    <w:p>
+      <w:pPr>
+        <w:spacing w:after="80"/>
+      </w:pPr>
+    </w:p>
+    <w:p>
+      <w:pPr>
+        <w:pStyle w:val="Heading2"/>
+        <w:spacing w:after="100" w:before="220"/>
+      </w:pPr>
+      <w:r>
+        <w:rPr>
+          <w:b/>
+          <w:bCs/>
+          <w:color w:val="1a1a2e"/>
+          <w:sz w:val="26"/>
+          <w:szCs w:val="26"/>
+        </w:rPr>
+        <w:t xml:space="preserve">4. Facebook — post · 🖼 aeo-og-bta-2026.png</w:t>
+      </w:r>
+    </w:p>
+    <w:p>
+      <w:pPr>
+        <w:spacing w:after="80"/>
+      </w:pPr>
+    </w:p>
+    <w:p>
+      <w:pPr>
+        <w:spacing w:after="60"/>
+        <w:ind w:left="360"/>
+      </w:pPr>
+      <w:r>
+        <w:rPr>
+          <w:i/>
+          <w:iCs/>
+          <w:color w:val="555555"/>
+          <w:sz w:val="22"/>
+          <w:szCs w:val="22"/>
+        </w:rPr>
+        <w:t xml:space="preserve">Search changed owners. Your customers now ask AI — Gemini, ChatGPT, Perplexity — and get </w:t>
+      </w:r>
+      <w:r>
+        <w:rPr>
+          <w:b/>
+          <w:bCs/>
+          <w:i/>
+          <w:iCs/>
+          <w:color w:val="555555"/>
+          <w:sz w:val="22"/>
+          <w:szCs w:val="22"/>
+        </w:rPr>
+        <w:t xml:space="preserve">one</w:t>
+      </w:r>
+      <w:r>
+        <w:rPr>
+          <w:i/>
+          <w:iCs/>
+          <w:color w:val="555555"/>
+          <w:sz w:val="22"/>
+          <w:szCs w:val="22"/>
+        </w:rPr>
+        <w:t xml:space="preserve"> answer, from the sites the AI trusts. If that's not you, your competitor wins the customer invisibly.</w:t>
+      </w:r>
+    </w:p>
+    <w:p>
+      <w:pPr>
+        <w:spacing w:after="60"/>
+        <w:ind w:left="360"/>
+      </w:pPr>
+      <w:r>
+        <w:rPr>
+          <w:i/>
+          <w:iCs/>
+          <w:color w:val="555555"/>
+          <w:sz w:val="22"/>
+          <w:szCs w:val="22"/>
+        </w:rPr>
+        <w:t xml:space="preserve"/>
+      </w:r>
+    </w:p>
+    <w:p>
+      <w:pPr>
+        <w:spacing w:after="60"/>
+        <w:ind w:left="360"/>
+      </w:pPr>
+      <w:r>
+        <w:rPr>
+          <w:i/>
+          <w:iCs/>
+          <w:color w:val="555555"/>
+          <w:sz w:val="22"/>
+          <w:szCs w:val="22"/>
+        </w:rPr>
+        <w:t xml:space="preserve">AEO Analyzers (just re-launched, powered by Google Gemini 3.5) shows in ~90 seconds whether AI cites you, how you stack up against a competitor, and </w:t>
+      </w:r>
+      <w:r>
+        <w:rPr>
+          <w:b/>
+          <w:bCs/>
+          <w:i/>
+          <w:iCs/>
+          <w:color w:val="555555"/>
+          <w:sz w:val="22"/>
+          <w:szCs w:val="22"/>
+        </w:rPr>
+        <w:t xml:space="preserve">exactly</w:t>
+      </w:r>
+      <w:r>
+        <w:rPr>
+          <w:i/>
+          <w:iCs/>
+          <w:color w:val="555555"/>
+          <w:sz w:val="22"/>
+          <w:szCs w:val="22"/>
+        </w:rPr>
+        <w:t xml:space="preserve"> what to fix — with paste-ready code and a report for your web team.</w:t>
+      </w:r>
+    </w:p>
+    <w:p>
+      <w:pPr>
+        <w:spacing w:after="60"/>
+        <w:ind w:left="360"/>
+      </w:pPr>
+      <w:r>
+        <w:rPr>
+          <w:i/>
+          <w:iCs/>
+          <w:color w:val="555555"/>
+          <w:sz w:val="22"/>
+          <w:szCs w:val="22"/>
+        </w:rPr>
+        <w:t xml:space="preserve"/>
+      </w:r>
+    </w:p>
+    <w:p>
+      <w:pPr>
+        <w:spacing w:after="60"/>
+        <w:ind w:left="360"/>
+      </w:pPr>
+      <w:r>
+        <w:rPr>
+          <w:i/>
+          <w:iCs/>
+          <w:color w:val="555555"/>
+          <w:sz w:val="22"/>
+          <w:szCs w:val="22"/>
+        </w:rPr>
+        <w:t xml:space="preserve">Just need to fix one site? A </w:t>
+      </w:r>
+      <w:r>
+        <w:rPr>
+          <w:b/>
+          <w:bCs/>
+          <w:i/>
+          <w:iCs/>
+          <w:color w:val="555555"/>
+          <w:sz w:val="22"/>
+          <w:szCs w:val="22"/>
+        </w:rPr>
+        <w:t xml:space="preserve">$24 Day Pass</w:t>
+      </w:r>
+      <w:r>
+        <w:rPr>
+          <w:i/>
+          <w:iCs/>
+          <w:color w:val="555555"/>
+          <w:sz w:val="22"/>
+          <w:szCs w:val="22"/>
+        </w:rPr>
+        <w:t xml:space="preserve"> unlocks everything for 24 hours — no subscription.</w:t>
+      </w:r>
+    </w:p>
+    <w:p>
+      <w:pPr>
+        <w:spacing w:after="60"/>
+        <w:ind w:left="360"/>
+      </w:pPr>
+      <w:r>
+        <w:rPr>
+          <w:i/>
+          <w:iCs/>
+          <w:color w:val="555555"/>
+          <w:sz w:val="22"/>
+          <w:szCs w:val="22"/>
+        </w:rPr>
+        <w:t xml:space="preserve"/>
+      </w:r>
+    </w:p>
+    <w:p>
+      <w:pPr>
+        <w:spacing w:after="60"/>
+        <w:ind w:left="360"/>
+      </w:pPr>
+      <w:r>
+        <w:rPr>
+          <w:i/>
+          <w:iCs/>
+          <w:color w:val="555555"/>
+          <w:sz w:val="22"/>
+          <w:szCs w:val="22"/>
+        </w:rPr>
+        <w:t xml:space="preserve">🔗 Free audit — link in the first comment 👇</w:t>
+      </w:r>
+    </w:p>
+    <w:p>
+      <w:pPr>
+        <w:spacing w:after="80"/>
+      </w:pPr>
+    </w:p>
+    <w:p>
+      <w:pPr>
+        <w:spacing w:after="100"/>
+      </w:pPr>
+      <w:r>
+        <w:rPr>
+          <w:b/>
+          <w:bCs/>
+          <w:color w:val="333333"/>
+          <w:sz w:val="22"/>
+          <w:szCs w:val="22"/>
+        </w:rPr>
+        <w:t xml:space="preserve">First comment (paste, then pin):</w:t>
+      </w:r>
+      <w:r>
+        <w:rPr>
+          <w:color w:val="333333"/>
+          <w:sz w:val="22"/>
+          <w:szCs w:val="22"/>
+        </w:rPr>
+        <w:t xml:space="preserve"> *(same as the LinkedIn first comment above)*</w:t>
+      </w:r>
+    </w:p>
+    <w:p>
+      <w:pPr>
+        <w:spacing w:after="80"/>
+      </w:pPr>
+    </w:p>
+    <w:p>
+      <w:pPr>
+        <w:pBdr>
+          <w:bottom w:val="single" w:color="cccccc" w:sz="1"/>
+        </w:pBdr>
+        <w:spacing w:after="120"/>
+      </w:pPr>
+    </w:p>
+    <w:p>
+      <w:pPr>
+        <w:spacing w:after="80"/>
+      </w:pPr>
+    </w:p>
+    <w:p>
+      <w:pPr>
+        <w:pStyle w:val="Heading2"/>
+        <w:spacing w:after="100" w:before="220"/>
+      </w:pPr>
+      <w:r>
+        <w:rPr>
+          <w:b/>
+          <w:bCs/>
+          <w:color w:val="1a1a2e"/>
+          <w:sz w:val="26"/>
+          <w:szCs w:val="26"/>
+        </w:rPr>
+        <w:t xml:space="preserve">5. Substack — subject + intro · 🖼 header aeo-og-bta-2026.png</w:t>
+      </w:r>
+    </w:p>
+    <w:p>
+      <w:pPr>
+        <w:spacing w:after="80"/>
+      </w:pPr>
+    </w:p>
+    <w:p>
+      <w:pPr>
+        <w:spacing w:after="60"/>
+        <w:ind w:left="360"/>
+      </w:pPr>
+      <w:r>
+        <w:rPr>
+          <w:b/>
+          <w:bCs/>
+          <w:i/>
+          <w:iCs/>
+          <w:color w:val="555555"/>
+          <w:sz w:val="22"/>
+          <w:szCs w:val="22"/>
+        </w:rPr>
+        <w:t xml:space="preserve">Subject:</w:t>
+      </w:r>
+      <w:r>
+        <w:rPr>
+          <w:i/>
+          <w:iCs/>
+          <w:color w:val="555555"/>
+          <w:sz w:val="22"/>
+          <w:szCs w:val="22"/>
+        </w:rPr>
+        <w:t xml:space="preserve"> Be the answer AI gives (we just re-launched)</w:t>
+      </w:r>
+    </w:p>
+    <w:p>
+      <w:pPr>
+        <w:spacing w:after="60"/>
+        <w:ind w:left="360"/>
+      </w:pPr>
+      <w:r>
+        <w:rPr>
+          <w:i/>
+          <w:iCs/>
+          <w:color w:val="555555"/>
+          <w:sz w:val="22"/>
+          <w:szCs w:val="22"/>
+        </w:rPr>
+        <w:t xml:space="preserve"/>
+      </w:r>
+    </w:p>
+    <w:p>
+      <w:pPr>
+        <w:spacing w:after="60"/>
+        <w:ind w:left="360"/>
+      </w:pPr>
+      <w:r>
+        <w:rPr>
+          <w:i/>
+          <w:iCs/>
+          <w:color w:val="555555"/>
+          <w:sz w:val="22"/>
+          <w:szCs w:val="22"/>
+        </w:rPr>
+        <w:t xml:space="preserve">AI assistants are replacing search results with single answers — and most brands have no idea whether they're the one being cited. We rebuilt </w:t>
+      </w:r>
+      <w:r>
+        <w:rPr>
+          <w:b/>
+          <w:bCs/>
+          <w:i/>
+          <w:iCs/>
+          <w:color w:val="555555"/>
+          <w:sz w:val="22"/>
+          <w:szCs w:val="22"/>
+        </w:rPr>
+        <w:t xml:space="preserve">AEO Analyzers</w:t>
+      </w:r>
+      <w:r>
+        <w:rPr>
+          <w:i/>
+          <w:iCs/>
+          <w:color w:val="555555"/>
+          <w:sz w:val="22"/>
+          <w:szCs w:val="22"/>
+        </w:rPr>
+        <w:t xml:space="preserve"> to fix that: powered by Google Gemini 3.5, it scores your Citation Probability in ~90 seconds, benchmarks you head-to-head against a competitor, and hands you the exact fixes — paste-ready JSON-LD, content rewrites, and a Word report your developer can ship. It's the rare AI-audit tool that won't make you paste a guessed "fact."</w:t>
+      </w:r>
+    </w:p>
+    <w:p>
+      <w:pPr>
+        <w:spacing w:after="60"/>
+        <w:ind w:left="360"/>
+      </w:pPr>
+      <w:r>
+        <w:rPr>
+          <w:i/>
+          <w:iCs/>
+          <w:color w:val="555555"/>
+          <w:sz w:val="22"/>
+          <w:szCs w:val="22"/>
+        </w:rPr>
+        <w:t xml:space="preserve"/>
+      </w:r>
+    </w:p>
+    <w:p>
+      <w:pPr>
+        <w:spacing w:after="60"/>
+        <w:ind w:left="360"/>
+      </w:pPr>
+      <w:r>
+        <w:rPr>
+          <w:i/>
+          <w:iCs/>
+          <w:color w:val="555555"/>
+          <w:sz w:val="22"/>
+          <w:szCs w:val="22"/>
+        </w:rPr>
+        <w:t xml:space="preserve">New: a </w:t>
+      </w:r>
+      <w:r>
+        <w:rPr>
+          <w:b/>
+          <w:bCs/>
+          <w:i/>
+          <w:iCs/>
+          <w:color w:val="555555"/>
+          <w:sz w:val="22"/>
+          <w:szCs w:val="22"/>
+        </w:rPr>
+        <w:t xml:space="preserve">$24 Day Pass</w:t>
+      </w:r>
+      <w:r>
+        <w:rPr>
+          <w:i/>
+          <w:iCs/>
+          <w:color w:val="555555"/>
+          <w:sz w:val="22"/>
+          <w:szCs w:val="22"/>
+        </w:rPr>
+        <w:t xml:space="preserve"> unlocks everything for 24 hours — no subscription. Run a free audit on your own site below. — Lindsay</w:t>
+      </w:r>
+    </w:p>
+    <w:p>
+      <w:pPr>
+        <w:spacing w:after="80"/>
+      </w:pPr>
+    </w:p>
+    <w:p>
+      <w:pPr>
+        <w:pBdr>
+          <w:bottom w:val="single" w:color="cccccc" w:sz="1"/>
+        </w:pBdr>
+        <w:spacing w:after="120"/>
+      </w:pPr>
+    </w:p>
+    <w:p>
+      <w:pPr>
+        <w:spacing w:after="80"/>
+      </w:pPr>
+    </w:p>
+    <w:p>
+      <w:pPr>
+        <w:pStyle w:val="Heading2"/>
+        <w:spacing w:after="100" w:before="220"/>
+      </w:pPr>
+      <w:r>
+        <w:rPr>
+          <w:b/>
+          <w:bCs/>
+          <w:color w:val="1a1a2e"/>
+          <w:sz w:val="26"/>
+          <w:szCs w:val="26"/>
+        </w:rPr>
+        <w:t xml:space="preserve">6. Medium — title + intro · cover aeo-og-bta-2026.png</w:t>
+      </w:r>
+    </w:p>
+    <w:p>
+      <w:pPr>
+        <w:spacing w:after="80"/>
+      </w:pPr>
+    </w:p>
+    <w:p>
+      <w:pPr>
+        <w:spacing w:after="60"/>
+        <w:ind w:left="360"/>
+      </w:pPr>
+      <w:r>
+        <w:rPr>
+          <w:b/>
+          <w:bCs/>
+          <w:i/>
+          <w:iCs/>
+          <w:color w:val="555555"/>
+          <w:sz w:val="22"/>
+          <w:szCs w:val="22"/>
+        </w:rPr>
+        <w:t xml:space="preserve">Title:</w:t>
+      </w:r>
+      <w:r>
+        <w:rPr>
+          <w:i/>
+          <w:iCs/>
+          <w:color w:val="555555"/>
+          <w:sz w:val="22"/>
+          <w:szCs w:val="22"/>
+        </w:rPr>
+        <w:t xml:space="preserve"> "Be the Answer AI Gives: Reintroducing AEO Analyzers" *(set canonical to your site/Substack)*</w:t>
+      </w:r>
+    </w:p>
+    <w:p>
+      <w:pPr>
+        <w:spacing w:after="60"/>
+        <w:ind w:left="360"/>
+      </w:pPr>
+      <w:r>
+        <w:rPr>
+          <w:i/>
+          <w:iCs/>
+          <w:color w:val="555555"/>
+          <w:sz w:val="22"/>
+          <w:szCs w:val="22"/>
+        </w:rPr>
+        <w:t xml:space="preserve">Open with the Substack intro above, then publish the full relaunch article (blog-relaunch-2026.md).</w:t>
+      </w:r>
+    </w:p>
+    <w:p>
+      <w:pPr>
+        <w:spacing w:after="80"/>
+      </w:pPr>
+    </w:p>
+    <w:p>
+      <w:pPr>
+        <w:pBdr>
+          <w:bottom w:val="single" w:color="cccccc" w:sz="1"/>
+        </w:pBdr>
+        <w:spacing w:after="120"/>
+      </w:pPr>
+    </w:p>
+    <w:p>
+      <w:pPr>
+        <w:spacing w:after="80"/>
+      </w:pPr>
+    </w:p>
+    <w:p>
+      <w:pPr>
+        <w:pStyle w:val="Heading2"/>
+        <w:spacing w:after="100" w:before="220"/>
+      </w:pPr>
+      <w:r>
+        <w:rPr>
+          <w:b/>
+          <w:bCs/>
+          <w:color w:val="1a1a2e"/>
+          <w:sz w:val="26"/>
+          <w:szCs w:val="26"/>
+        </w:rPr>
+        <w:t xml:space="preserve">7. Reddit — value-first (r/SEO, r/marketing, r/Entrepreneur)</w:t>
+      </w:r>
+    </w:p>
+    <w:p>
+      <w:pPr>
+        <w:spacing w:after="80"/>
+      </w:pPr>
+    </w:p>
+    <w:p>
+      <w:pPr>
+        <w:spacing w:after="100"/>
+      </w:pPr>
+      <w:r>
+        <w:rPr>
+          <w:color w:val="333333"/>
+          <w:sz w:val="22"/>
+          <w:szCs w:val="22"/>
+        </w:rPr>
+        <w:t xml:space="preserve">*Reddit punishes promotion. Lead with the idea, mention the tool once, no hashtags, no emojis.*</w:t>
+      </w:r>
+    </w:p>
+    <w:p>
+      <w:pPr>
+        <w:spacing w:after="80"/>
+      </w:pPr>
+    </w:p>
+    <w:p>
+      <w:pPr>
+        <w:spacing w:after="60"/>
+        <w:ind w:left="360"/>
+      </w:pPr>
+      <w:r>
+        <w:rPr>
+          <w:b/>
+          <w:bCs/>
+          <w:i/>
+          <w:iCs/>
+          <w:color w:val="555555"/>
+          <w:sz w:val="22"/>
+          <w:szCs w:val="22"/>
+        </w:rPr>
+        <w:t xml:space="preserve">Title:</w:t>
+      </w:r>
+      <w:r>
+        <w:rPr>
+          <w:i/>
+          <w:iCs/>
+          <w:color w:val="555555"/>
+          <w:sz w:val="22"/>
+          <w:szCs w:val="22"/>
+        </w:rPr>
+        <w:t xml:space="preserve"> Your customers are asking AI instead of Googling — here's how to check if AI actually cites you</w:t>
+      </w:r>
+    </w:p>
+    <w:p>
+      <w:pPr>
+        <w:spacing w:after="60"/>
+        <w:ind w:left="360"/>
+      </w:pPr>
+      <w:r>
+        <w:rPr>
+          <w:i/>
+          <w:iCs/>
+          <w:color w:val="555555"/>
+          <w:sz w:val="22"/>
+          <w:szCs w:val="22"/>
+        </w:rPr>
+        <w:t xml:space="preserve"/>
+      </w:r>
+    </w:p>
+    <w:p>
+      <w:pPr>
+        <w:spacing w:after="60"/>
+        <w:ind w:left="360"/>
+      </w:pPr>
+      <w:r>
+        <w:rPr>
+          <w:i/>
+          <w:iCs/>
+          <w:color w:val="555555"/>
+          <w:sz w:val="22"/>
+          <w:szCs w:val="22"/>
+        </w:rPr>
+        <w:t xml:space="preserve">SEO got you onto the results page. But more people now ask Gemini/ChatGPT/Perplexity and read a single answer assembled from the few sources the AI trusts. If you're not one of them, you lose the customer invisibly — it never shows in analytics.</w:t>
+      </w:r>
+    </w:p>
+    <w:p>
+      <w:pPr>
+        <w:spacing w:after="60"/>
+        <w:ind w:left="360"/>
+      </w:pPr>
+      <w:r>
+        <w:rPr>
+          <w:i/>
+          <w:iCs/>
+          <w:color w:val="555555"/>
+          <w:sz w:val="22"/>
+          <w:szCs w:val="22"/>
+        </w:rPr>
+        <w:t xml:space="preserve"/>
+      </w:r>
+    </w:p>
+    <w:p>
+      <w:pPr>
+        <w:spacing w:after="60"/>
+        <w:ind w:left="360"/>
+      </w:pPr>
+      <w:r>
+        <w:rPr>
+          <w:i/>
+          <w:iCs/>
+          <w:color w:val="555555"/>
+          <w:sz w:val="22"/>
+          <w:szCs w:val="22"/>
+        </w:rPr>
+        <w:t xml:space="preserve">The practical checklist that moves the needle: valid, accurate JSON-LD (don't publish schema with guessed values — it teaches the AI wrong facts), clear Q&amp;A-structured content, real E-E-A-T signals, and specific/measurable claims over adjectives.</w:t>
+      </w:r>
+    </w:p>
+    <w:p>
+      <w:pPr>
+        <w:spacing w:after="60"/>
+        <w:ind w:left="360"/>
+      </w:pPr>
+      <w:r>
+        <w:rPr>
+          <w:i/>
+          <w:iCs/>
+          <w:color w:val="555555"/>
+          <w:sz w:val="22"/>
+          <w:szCs w:val="22"/>
+        </w:rPr>
+        <w:t xml:space="preserve"/>
+      </w:r>
+    </w:p>
+    <w:p>
+      <w:pPr>
+        <w:spacing w:after="60"/>
+        <w:ind w:left="360"/>
+      </w:pPr>
+      <w:r>
+        <w:rPr>
+          <w:i/>
+          <w:iCs/>
+          <w:color w:val="555555"/>
+          <w:sz w:val="22"/>
+          <w:szCs w:val="22"/>
+        </w:rPr>
+        <w:t xml:space="preserve">I built a tool that scores this and generates the fixes (AEO Analyzers — there's a free audit and a $24 one-time day pass if you just need to fix one site), but the checklist above is the core of it regardless of what you use. Happy to answer AEO questions in the comments.</w:t>
+      </w:r>
+    </w:p>
+    <w:p>
+      <w:pPr>
+        <w:spacing w:after="80"/>
+      </w:pPr>
+    </w:p>
+    <w:p>
+      <w:pPr>
+        <w:pBdr>
+          <w:bottom w:val="single" w:color="cccccc" w:sz="1"/>
+        </w:pBdr>
+        <w:spacing w:after="120"/>
+      </w:pPr>
+    </w:p>
+    <w:p>
+      <w:pPr>
+        <w:spacing w:after="80"/>
+      </w:pPr>
+    </w:p>
+    <w:p>
+      <w:pPr>
+        <w:spacing w:after="100"/>
+      </w:pPr>
+      <w:r>
+        <w:rPr>
+          <w:color w:val="333333"/>
+          <w:sz w:val="22"/>
+          <w:szCs w:val="22"/>
+        </w:rPr>
+        <w:t xml:space="preserve">*Long-form article to link to: docs/blog-relaunch-2026.md. Image placement guide: docs/launch-announcement-kit.md.*</w:t>
+      </w:r>
+    </w:p>
+    <w:p>
+      <w:pPr>
+        <w:spacing w:after="80"/>
+      </w:pPr>
+    </w:p>
+    <w:p>
+      <w:pPr>
+        <w:pStyle w:val="Heading1"/>
+        <w:pageBreakBefore/>
+        <w:spacing w:after="160"/>
+      </w:pPr>
+      <w:r>
+        <w:rPr>
+          <w:b/>
+          <w:bCs/>
+          <w:color w:val="1a1a2e"/>
+          <w:sz w:val="30"/>
+          <w:szCs w:val="30"/>
+        </w:rPr>
+        <w:t xml:space="preserve">Part 2 — Posting Calendar &amp; Plan (when / where to post)</w:t>
       </w:r>
     </w:p>
     <w:p>
@@ -5673,7 +7792,7 @@
           <w:sz w:val="30"/>
           <w:szCs w:val="30"/>
         </w:rPr>
-        <w:t xml:space="preserve">Part 2 — Posts: ready to cut &amp; paste (with image references)</w:t>
+        <w:t xml:space="preserve">Part 3 — Full Post Library (all pieces, with image references)</w:t>
       </w:r>
     </w:p>
     <w:p>
@@ -9468,7 +11587,7 @@
           <w:sz w:val="30"/>
           <w:szCs w:val="30"/>
         </w:rPr>
-        <w:t xml:space="preserve">Part 3 — The Long-Form Article</w:t>
+        <w:t xml:space="preserve">Part 4 — The Long-Form Article</w:t>
       </w:r>
     </w:p>
     <w:p>
@@ -10811,7 +12930,7 @@
           <w:sz w:val="30"/>
           <w:szCs w:val="30"/>
         </w:rPr>
-        <w:t xml:space="preserve">Part 4 — Image Prompt Playbook (regenerate / enhance)</w:t>
+        <w:t xml:space="preserve">Part 5 — Image Prompt Playbook (regenerate / enhance)</w:t>
       </w:r>
     </w:p>
     <w:p>
@@ -14353,7 +16472,7 @@
           <w:sz w:val="30"/>
           <w:szCs w:val="30"/>
         </w:rPr>
-        <w:t xml:space="preserve">Part 5 — Visual Canon (existing-image ↔ story mapping)</w:t>
+        <w:t xml:space="preserve">Part 6 — Visual Canon (existing-image ↔ story mapping)</w:t>
       </w:r>
     </w:p>
     <w:p>

</xml_diff>

<commit_message>
Marketing: add the "hard CTA" urgency stakes block to Post-Today + docx (#30)
Adds the stakes/urgency CTA — invisible to answer engines = lost traffic,
customers, and money on a site AI can't see — with a paste-ready closer line and
short variants, honest about the free score / $24 Day Pass funnel. Regenerated docx.

Co-Authored-By: Claude Opus 4.8 (1M context) <noreply@anthropic.com>
</commit_message>
<xml_diff>
--- a/docs/AEO-Analyzers-MASTER-Announcement.docx
+++ b/docs/AEO-Analyzers-MASTER-Announcement.docx
@@ -1764,6 +1764,240 @@
           <w:szCs w:val="22"/>
         </w:rPr>
         <w:t xml:space="preserve">*If you want your business to show up in the era of answer engines and agentic AI, Answer Engine Optimization is a must-have for every business today.*</w:t>
+      </w:r>
+    </w:p>
+    <w:p>
+      <w:pPr>
+        <w:spacing w:after="80"/>
+      </w:pPr>
+    </w:p>
+    <w:p>
+      <w:pPr>
+        <w:pBdr>
+          <w:bottom w:val="single" w:color="cccccc" w:sz="1"/>
+        </w:pBdr>
+        <w:spacing w:after="120"/>
+      </w:pPr>
+    </w:p>
+    <w:p>
+      <w:pPr>
+        <w:spacing w:after="80"/>
+      </w:pPr>
+    </w:p>
+    <w:p>
+      <w:pPr>
+        <w:pStyle w:val="Heading2"/>
+        <w:spacing w:after="100" w:before="220"/>
+      </w:pPr>
+      <w:r>
+        <w:rPr>
+          <w:b/>
+          <w:bCs/>
+          <w:color w:val="1a1a2e"/>
+          <w:sz w:val="26"/>
+          <w:szCs w:val="26"/>
+        </w:rPr>
+        <w:t xml:space="preserve">0b. The hard CTA — the stakes (use as the closer on every post)</w:t>
+      </w:r>
+    </w:p>
+    <w:p>
+      <w:pPr>
+        <w:spacing w:after="80"/>
+      </w:pPr>
+    </w:p>
+    <w:p>
+      <w:pPr>
+        <w:spacing w:after="100"/>
+      </w:pPr>
+      <w:r>
+        <w:rPr>
+          <w:b/>
+          <w:bCs/>
+          <w:color w:val="333333"/>
+          <w:sz w:val="22"/>
+          <w:szCs w:val="22"/>
+        </w:rPr>
+        <w:t xml:space="preserve">Say this plainly:</w:t>
+      </w:r>
+      <w:r>
+        <w:rPr>
+          <w:color w:val="333333"/>
+          <w:sz w:val="22"/>
+          <w:szCs w:val="22"/>
+        </w:rPr>
+        <w:t xml:space="preserve"> Your customers now ask AI first. If your site isn't built for answer engines, AI can't cite you — so you lose the traffic, the customer, and the sale to a competitor, and it never even shows in your analytics. </w:t>
+      </w:r>
+      <w:r>
+        <w:rPr>
+          <w:b/>
+          <w:bCs/>
+          <w:color w:val="333333"/>
+          <w:sz w:val="22"/>
+          <w:szCs w:val="22"/>
+        </w:rPr>
+        <w:t xml:space="preserve">A website AI can't read is money spent on a storefront no one is ever shown.</w:t>
+      </w:r>
+      <w:r>
+        <w:rPr>
+          <w:color w:val="333333"/>
+          <w:sz w:val="22"/>
+          <w:szCs w:val="22"/>
+        </w:rPr>
+        <w:t xml:space="preserve"> AEO isn't optional anymore — it's how you stay visible in the age of answer engines and agentic AI search.</w:t>
+      </w:r>
+    </w:p>
+    <w:p>
+      <w:pPr>
+        <w:spacing w:after="80"/>
+      </w:pPr>
+    </w:p>
+    <w:p>
+      <w:pPr>
+        <w:spacing w:after="100"/>
+      </w:pPr>
+      <w:r>
+        <w:rPr>
+          <w:b/>
+          <w:bCs/>
+          <w:color w:val="333333"/>
+          <w:sz w:val="22"/>
+          <w:szCs w:val="22"/>
+        </w:rPr>
+        <w:t xml:space="preserve">Closer line (paste at the end of any post):</w:t>
+      </w:r>
+    </w:p>
+    <w:p>
+      <w:pPr>
+        <w:spacing w:after="60"/>
+        <w:ind w:left="360"/>
+      </w:pPr>
+      <w:r>
+        <w:rPr>
+          <w:i/>
+          <w:iCs/>
+          <w:color w:val="555555"/>
+          <w:sz w:val="22"/>
+          <w:szCs w:val="22"/>
+        </w:rPr>
+        <w:t xml:space="preserve">Don't pay for a website AI can't see. Find out in ~90 seconds whether AI cites you — </w:t>
+      </w:r>
+      <w:r>
+        <w:rPr>
+          <w:b/>
+          <w:bCs/>
+          <w:i/>
+          <w:iCs/>
+          <w:color w:val="555555"/>
+          <w:sz w:val="22"/>
+          <w:szCs w:val="22"/>
+        </w:rPr>
+        <w:t xml:space="preserve">free.</w:t>
+      </w:r>
+      <w:r>
+        <w:rPr>
+          <w:i/>
+          <w:iCs/>
+          <w:color w:val="555555"/>
+          <w:sz w:val="22"/>
+          <w:szCs w:val="22"/>
+        </w:rPr>
+        <w:t xml:space="preserve"> Then unlock the exact fixes with a </w:t>
+      </w:r>
+      <w:r>
+        <w:rPr>
+          <w:b/>
+          <w:bCs/>
+          <w:i/>
+          <w:iCs/>
+          <w:color w:val="555555"/>
+          <w:sz w:val="22"/>
+          <w:szCs w:val="22"/>
+        </w:rPr>
+        <w:t xml:space="preserve">$24 Day Pass.</w:t>
+      </w:r>
+      <w:r>
+        <w:rPr>
+          <w:i/>
+          <w:iCs/>
+          <w:color w:val="555555"/>
+          <w:sz w:val="22"/>
+          <w:szCs w:val="22"/>
+        </w:rPr>
+        <w:t xml:space="preserve"> 👉 https://www.aeoanalyzers.com</w:t>
+      </w:r>
+    </w:p>
+    <w:p>
+      <w:pPr>
+        <w:spacing w:after="80"/>
+      </w:pPr>
+    </w:p>
+    <w:p>
+      <w:pPr>
+        <w:spacing w:after="100"/>
+      </w:pPr>
+      <w:r>
+        <w:rPr>
+          <w:b/>
+          <w:bCs/>
+          <w:color w:val="333333"/>
+          <w:sz w:val="22"/>
+          <w:szCs w:val="22"/>
+        </w:rPr>
+        <w:t xml:space="preserve">Short variants:</w:t>
+      </w:r>
+    </w:p>
+    <w:p>
+      <w:pPr>
+        <w:pStyle w:val="ListParagraph"/>
+        <w:numPr>
+          <w:ilvl w:val="0"/>
+          <w:numId w:val="1"/>
+        </w:numPr>
+        <w:spacing w:after="40"/>
+      </w:pPr>
+      <w:r>
+        <w:rPr>
+          <w:color w:val="333333"/>
+          <w:sz w:val="22"/>
+          <w:szCs w:val="22"/>
+        </w:rPr>
+        <w:t xml:space="preserve">"If AI can't cite your site, your competitor gets the customer. Check your AEO score free 👉 aeoanalyzers.com"</w:t>
+      </w:r>
+    </w:p>
+    <w:p>
+      <w:pPr>
+        <w:pStyle w:val="ListParagraph"/>
+        <w:numPr>
+          <w:ilvl w:val="0"/>
+          <w:numId w:val="1"/>
+        </w:numPr>
+        <w:spacing w:after="40"/>
+      </w:pPr>
+      <w:r>
+        <w:rPr>
+          <w:color w:val="333333"/>
+          <w:sz w:val="22"/>
+          <w:szCs w:val="22"/>
+        </w:rPr>
+        <w:t xml:space="preserve">"A website that's invisible to AI is wasted spend. See your Citation Probability in ~90 seconds 👉 aeoanalyzers.com"</w:t>
+      </w:r>
+    </w:p>
+    <w:p>
+      <w:pPr>
+        <w:pStyle w:val="ListParagraph"/>
+        <w:numPr>
+          <w:ilvl w:val="0"/>
+          <w:numId w:val="1"/>
+        </w:numPr>
+        <w:spacing w:after="40"/>
+      </w:pPr>
+      <w:r>
+        <w:rPr>
+          <w:color w:val="333333"/>
+          <w:sz w:val="22"/>
+          <w:szCs w:val="22"/>
+        </w:rPr>
+        <w:t xml:space="preserve">"AEO is the new must-have. Be visible to answer engines today — or be invisible to your market 👉 aeoanalyzers.com"</w:t>
       </w:r>
     </w:p>
     <w:p>

</xml_diff>

<commit_message>
Marketing: add sourced AEO-shift stats to blog + announcement (not the site) (#31)
Per decision to keep the homepage uncluttered, the research lives only in the
long-form/announcement copy:
- blog-relaunch-2026.md: new "The shift, by the numbers" section (Gartner -25% by
  2026; ~60% zero-click / ~83% with AI Overviews; AI Overviews ~50% of searches,
  ChatGPT ~800-900M weekly) with source links + the honest "SEO isn't dead" nuance.
- launch-posts-today.md: "stats to cite" block + a stat-backed closer.
Regenerated the docx.

Co-Authored-By: Claude Opus 4.8 (1M context) <noreply@anthropic.com>
</commit_message>
<xml_diff>
--- a/docs/AEO-Analyzers-MASTER-Announcement.docx
+++ b/docs/AEO-Analyzers-MASTER-Announcement.docx
@@ -1998,6 +1998,201 @@
           <w:szCs w:val="22"/>
         </w:rPr>
         <w:t xml:space="preserve">"AEO is the new must-have. Be visible to answer engines today — or be invisible to your market 👉 aeoanalyzers.com"</w:t>
+      </w:r>
+    </w:p>
+    <w:p>
+      <w:pPr>
+        <w:spacing w:after="80"/>
+      </w:pPr>
+    </w:p>
+    <w:p>
+      <w:pPr>
+        <w:pBdr>
+          <w:bottom w:val="single" w:color="cccccc" w:sz="1"/>
+        </w:pBdr>
+        <w:spacing w:after="120"/>
+      </w:pPr>
+    </w:p>
+    <w:p>
+      <w:pPr>
+        <w:spacing w:after="80"/>
+      </w:pPr>
+    </w:p>
+    <w:p>
+      <w:pPr>
+        <w:pStyle w:val="Heading2"/>
+        <w:spacing w:after="100" w:before="220"/>
+      </w:pPr>
+      <w:r>
+        <w:rPr>
+          <w:b/>
+          <w:bCs/>
+          <w:color w:val="1a1a2e"/>
+          <w:sz w:val="26"/>
+          <w:szCs w:val="26"/>
+        </w:rPr>
+        <w:t xml:space="preserve">0c. The proof — stats to cite (for the blog &amp; longer posts)</w:t>
+      </w:r>
+    </w:p>
+    <w:p>
+      <w:pPr>
+        <w:spacing w:after="80"/>
+      </w:pPr>
+    </w:p>
+    <w:p>
+      <w:pPr>
+        <w:spacing w:after="100"/>
+      </w:pPr>
+      <w:r>
+        <w:rPr>
+          <w:color w:val="333333"/>
+          <w:sz w:val="22"/>
+          <w:szCs w:val="22"/>
+        </w:rPr>
+        <w:t xml:space="preserve">Use these to back the urgency. Keep the honest nuance: **SEO still matters; AEO is the new layer that makes you *citable*, not just ranked.**</w:t>
+      </w:r>
+    </w:p>
+    <w:p>
+      <w:pPr>
+        <w:spacing w:after="80"/>
+      </w:pPr>
+    </w:p>
+    <w:p>
+      <w:pPr>
+        <w:pStyle w:val="ListParagraph"/>
+        <w:numPr>
+          <w:ilvl w:val="0"/>
+          <w:numId w:val="1"/>
+        </w:numPr>
+        <w:spacing w:after="40"/>
+      </w:pPr>
+      <w:r>
+        <w:rPr>
+          <w:b/>
+          <w:bCs/>
+          <w:color w:val="333333"/>
+          <w:sz w:val="22"/>
+          <w:szCs w:val="22"/>
+        </w:rPr>
+        <w:t xml:space="preserve">Gartner: traditional search engine volume will drop 25% by 2026</w:t>
+      </w:r>
+      <w:r>
+        <w:rPr>
+          <w:color w:val="333333"/>
+          <w:sz w:val="22"/>
+          <w:szCs w:val="22"/>
+        </w:rPr>
+        <w:t xml:space="preserve"> as users shift to AI chatbots/answer engines. (gartner.com (https://www.gartner.com/en/newsroom/press-releases/2024-02-19-gartner-predicts-search-engine-volume-will-drop-25-percent-by-2026-due-to-ai-chatbots-and-other-virtual-agents))</w:t>
+      </w:r>
+    </w:p>
+    <w:p>
+      <w:pPr>
+        <w:pStyle w:val="ListParagraph"/>
+        <w:numPr>
+          <w:ilvl w:val="0"/>
+          <w:numId w:val="1"/>
+        </w:numPr>
+        <w:spacing w:after="40"/>
+      </w:pPr>
+      <w:r>
+        <w:rPr>
+          <w:b/>
+          <w:bCs/>
+          <w:color w:val="333333"/>
+          <w:sz w:val="22"/>
+          <w:szCs w:val="22"/>
+        </w:rPr>
+        <w:t xml:space="preserve">~60% of Google searches end with no click</w:t>
+      </w:r>
+      <w:r>
+        <w:rPr>
+          <w:color w:val="333333"/>
+          <w:sz w:val="22"/>
+          <w:szCs w:val="22"/>
+        </w:rPr>
+        <w:t xml:space="preserve"> — and </w:t>
+      </w:r>
+      <w:r>
+        <w:rPr>
+          <w:b/>
+          <w:bCs/>
+          <w:color w:val="333333"/>
+          <w:sz w:val="22"/>
+          <w:szCs w:val="22"/>
+        </w:rPr>
+        <w:t xml:space="preserve">~83% when an AI Overview answers</w:t>
+      </w:r>
+      <w:r>
+        <w:rPr>
+          <w:color w:val="333333"/>
+          <w:sz w:val="22"/>
+          <w:szCs w:val="22"/>
+        </w:rPr>
+        <w:t xml:space="preserve"> (≈93% in Google's AI Mode). (zero-click research, 2026 (https://www.digitalapplied.com/blog/zero-click-search-statistics-2026-complete-data))</w:t>
+      </w:r>
+    </w:p>
+    <w:p>
+      <w:pPr>
+        <w:pStyle w:val="ListParagraph"/>
+        <w:numPr>
+          <w:ilvl w:val="0"/>
+          <w:numId w:val="1"/>
+        </w:numPr>
+        <w:spacing w:after="40"/>
+      </w:pPr>
+      <w:r>
+        <w:rPr>
+          <w:b/>
+          <w:bCs/>
+          <w:color w:val="333333"/>
+          <w:sz w:val="22"/>
+          <w:szCs w:val="22"/>
+        </w:rPr>
+        <w:t xml:space="preserve">AI Overviews appear in ~50% of searches (~2B users/mo); ChatGPT ~800–900M weekly users.</w:t>
+      </w:r>
+      <w:r>
+        <w:rPr>
+          <w:color w:val="333333"/>
+          <w:sz w:val="22"/>
+          <w:szCs w:val="22"/>
+        </w:rPr>
+        <w:t xml:space="preserve"> (market data, 2026 (https://firstpagesage.com/seo-blog/google-vs-chatgpt-market-share-report/))</w:t>
+      </w:r>
+    </w:p>
+    <w:p>
+      <w:pPr>
+        <w:spacing w:after="80"/>
+      </w:pPr>
+    </w:p>
+    <w:p>
+      <w:pPr>
+        <w:spacing w:after="100"/>
+      </w:pPr>
+      <w:r>
+        <w:rPr>
+          <w:b/>
+          <w:bCs/>
+          <w:color w:val="333333"/>
+          <w:sz w:val="22"/>
+          <w:szCs w:val="22"/>
+        </w:rPr>
+        <w:t xml:space="preserve">Stat-backed closer (paste-ready):</w:t>
+      </w:r>
+    </w:p>
+    <w:p>
+      <w:pPr>
+        <w:spacing w:after="60"/>
+        <w:ind w:left="360"/>
+      </w:pPr>
+      <w:r>
+        <w:rPr>
+          <w:i/>
+          <w:iCs/>
+          <w:color w:val="555555"/>
+          <w:sz w:val="22"/>
+          <w:szCs w:val="22"/>
+        </w:rPr>
+        <w:t xml:space="preserve">Gartner says traditional search drops 25% by 2026, and ~60% of searches already end without a click. If AI can't cite you, you're invisible to where buyers now decide. See your AEO score free 👉 https://www.aeoanalyzers.com</w:t>
       </w:r>
     </w:p>
     <w:p>
@@ -12071,6 +12266,219 @@
           <w:szCs w:val="22"/>
         </w:rPr>
         <w:t xml:space="preserve">Run a free audit on your site (and your #1 competitor): https://www.aeoanalyzers.com (https://www.aeoanalyzers.com)</w:t>
+      </w:r>
+    </w:p>
+    <w:p>
+      <w:pPr>
+        <w:spacing w:after="80"/>
+      </w:pPr>
+    </w:p>
+    <w:p>
+      <w:pPr>
+        <w:pBdr>
+          <w:bottom w:val="single" w:color="cccccc" w:sz="1"/>
+        </w:pBdr>
+        <w:spacing w:after="120"/>
+      </w:pPr>
+    </w:p>
+    <w:p>
+      <w:pPr>
+        <w:spacing w:after="80"/>
+      </w:pPr>
+    </w:p>
+    <w:p>
+      <w:pPr>
+        <w:pStyle w:val="Heading2"/>
+        <w:spacing w:after="100" w:before="220"/>
+      </w:pPr>
+      <w:r>
+        <w:rPr>
+          <w:b/>
+          <w:bCs/>
+          <w:color w:val="1a1a2e"/>
+          <w:sz w:val="26"/>
+          <w:szCs w:val="26"/>
+        </w:rPr>
+        <w:t xml:space="preserve">The shift, by the numbers</w:t>
+      </w:r>
+    </w:p>
+    <w:p>
+      <w:pPr>
+        <w:spacing w:after="80"/>
+      </w:pPr>
+    </w:p>
+    <w:p>
+      <w:pPr>
+        <w:spacing w:after="100"/>
+      </w:pPr>
+      <w:r>
+        <w:rPr>
+          <w:color w:val="333333"/>
+          <w:sz w:val="22"/>
+          <w:szCs w:val="22"/>
+        </w:rPr>
+        <w:t xml:space="preserve">This isn't a hunch — the data is stark:</w:t>
+      </w:r>
+    </w:p>
+    <w:p>
+      <w:pPr>
+        <w:spacing w:after="80"/>
+      </w:pPr>
+    </w:p>
+    <w:p>
+      <w:pPr>
+        <w:pStyle w:val="ListParagraph"/>
+        <w:numPr>
+          <w:ilvl w:val="0"/>
+          <w:numId w:val="1"/>
+        </w:numPr>
+        <w:spacing w:after="40"/>
+      </w:pPr>
+      <w:r>
+        <w:rPr>
+          <w:b/>
+          <w:bCs/>
+          <w:color w:val="333333"/>
+          <w:sz w:val="22"/>
+          <w:szCs w:val="22"/>
+        </w:rPr>
+        <w:t xml:space="preserve">Gartner projects traditional search engine volume will fall 25% by 2026</w:t>
+      </w:r>
+      <w:r>
+        <w:rPr>
+          <w:color w:val="333333"/>
+          <w:sz w:val="22"/>
+          <w:szCs w:val="22"/>
+        </w:rPr>
+        <w:t xml:space="preserve"> as people turn to AI chatbots and answer engines instead. (Gartner (https://www.gartner.com/en/newsroom/press-releases/2024-02-19-gartner-predicts-search-engine-volume-will-drop-25-percent-by-2026-due-to-ai-chatbots-and-other-virtual-agents))</w:t>
+      </w:r>
+    </w:p>
+    <w:p>
+      <w:pPr>
+        <w:pStyle w:val="ListParagraph"/>
+        <w:numPr>
+          <w:ilvl w:val="0"/>
+          <w:numId w:val="1"/>
+        </w:numPr>
+        <w:spacing w:after="40"/>
+      </w:pPr>
+      <w:r>
+        <w:rPr>
+          <w:b/>
+          <w:bCs/>
+          <w:color w:val="333333"/>
+          <w:sz w:val="22"/>
+          <w:szCs w:val="22"/>
+        </w:rPr>
+        <w:t xml:space="preserve">Roughly 60% of Google searches now end without a click</w:t>
+      </w:r>
+      <w:r>
+        <w:rPr>
+          <w:color w:val="333333"/>
+          <w:sz w:val="22"/>
+          <w:szCs w:val="22"/>
+        </w:rPr>
+        <w:t xml:space="preserve"> — the answer is read right on the results page — and that climbs to </w:t>
+      </w:r>
+      <w:r>
+        <w:rPr>
+          <w:b/>
+          <w:bCs/>
+          <w:color w:val="333333"/>
+          <w:sz w:val="22"/>
+          <w:szCs w:val="22"/>
+        </w:rPr>
+        <w:t xml:space="preserve">~83% when an AI Overview appears</w:t>
+      </w:r>
+      <w:r>
+        <w:rPr>
+          <w:color w:val="333333"/>
+          <w:sz w:val="22"/>
+          <w:szCs w:val="22"/>
+        </w:rPr>
+        <w:t xml:space="preserve"> (and ~93% in Google's AI Mode). (zero-click research, 2026 (https://www.digitalapplied.com/blog/zero-click-search-statistics-2026-complete-data))</w:t>
+      </w:r>
+    </w:p>
+    <w:p>
+      <w:pPr>
+        <w:pStyle w:val="ListParagraph"/>
+        <w:numPr>
+          <w:ilvl w:val="0"/>
+          <w:numId w:val="1"/>
+        </w:numPr>
+        <w:spacing w:after="40"/>
+      </w:pPr>
+      <w:r>
+        <w:rPr>
+          <w:b/>
+          <w:bCs/>
+          <w:color w:val="333333"/>
+          <w:sz w:val="22"/>
+          <w:szCs w:val="22"/>
+        </w:rPr>
+        <w:t xml:space="preserve">AI Overviews now appear in about half of all searches</w:t>
+      </w:r>
+      <w:r>
+        <w:rPr>
+          <w:color w:val="333333"/>
+          <w:sz w:val="22"/>
+          <w:szCs w:val="22"/>
+        </w:rPr>
+        <w:t xml:space="preserve"> and reach ~2 billion users a month; </w:t>
+      </w:r>
+      <w:r>
+        <w:rPr>
+          <w:b/>
+          <w:bCs/>
+          <w:color w:val="333333"/>
+          <w:sz w:val="22"/>
+          <w:szCs w:val="22"/>
+        </w:rPr>
+        <w:t xml:space="preserve">ChatGPT alone has ~800–900 million weekly users.</w:t>
+      </w:r>
+      <w:r>
+        <w:rPr>
+          <w:color w:val="333333"/>
+          <w:sz w:val="22"/>
+          <w:szCs w:val="22"/>
+        </w:rPr>
+        <w:t xml:space="preserve"> (market data, 2026 (https://firstpagesage.com/seo-blog/google-vs-chatgpt-market-share-report/))</w:t>
+      </w:r>
+    </w:p>
+    <w:p>
+      <w:pPr>
+        <w:spacing w:after="80"/>
+      </w:pPr>
+    </w:p>
+    <w:p>
+      <w:pPr>
+        <w:spacing w:after="100"/>
+      </w:pPr>
+      <w:r>
+        <w:rPr>
+          <w:color w:val="333333"/>
+          <w:sz w:val="22"/>
+          <w:szCs w:val="22"/>
+        </w:rPr>
+        <w:t xml:space="preserve">The takeaway isn't "SEO is dead." SEO still earns the crawl and the ranking. But ranking on a page fewer people click is no longer the same as being </w:t>
+      </w:r>
+      <w:r>
+        <w:rPr>
+          <w:b/>
+          <w:bCs/>
+          <w:color w:val="333333"/>
+          <w:sz w:val="22"/>
+          <w:szCs w:val="22"/>
+        </w:rPr>
+        <w:t xml:space="preserve">the answer AI gives</w:t>
+      </w:r>
+      <w:r>
+        <w:rPr>
+          <w:color w:val="333333"/>
+          <w:sz w:val="22"/>
+          <w:szCs w:val="22"/>
+        </w:rPr>
+        <w:t xml:space="preserve"> — and that answer is increasingly where the customer decides. AEO is the layer that makes you citable in that moment.</w:t>
       </w:r>
     </w:p>
     <w:p>

</xml_diff>

<commit_message>
Marketing: regenerate price-free docx; harden generator against file locks (#37)
#36 committed a stale docx because the generator crashed (EACCES) when the repo
copy was open in Word. The Downloads-only fallback didn't cover the repo write.
- Regenerated the docx from the now price-free sources (verified: 0 $24/$49/$199).
- writeResilient(): both the repo and Downloads copies now fall back to a -v2 name
  on a lock instead of crashing, so one locked copy never blocks the other.

Co-Authored-By: Claude Opus 4.8 (1M context) <noreply@anthropic.com>
</commit_message>
<xml_diff>
--- a/docs/AEO-Analyzers-MASTER-Announcement.docx
+++ b/docs/AEO-Analyzers-MASTER-Announcement.docx
@@ -1031,7 +1031,7 @@
           <w:sz w:val="22"/>
           <w:szCs w:val="22"/>
         </w:rPr>
-        <w:t xml:space="preserve">Get cited by AI · stop losing customers you can't see · prove marketing impact with a repeatable score · hand your developer a deploy-ready fix · protect your brand voice · beat a named competitor to the citation · fix one site today for $24, no subscription.</w:t>
+        <w:t xml:space="preserve">Get cited by AI · stop losing customers you can't see · prove marketing impact with a repeatable score · hand your developer a deploy-ready fix · protect your brand voice · beat a named competitor to the citation · fix one site today with a Day Pass, no subscription.</w:t>
       </w:r>
     </w:p>
     <w:p>
@@ -1208,7 +1208,7 @@
           <w:sz w:val="22"/>
           <w:szCs w:val="22"/>
         </w:rPr>
-        <w:t xml:space="preserve">"Only have one site? $24 Day Pass — fix it today, no subscription."</w:t>
+        <w:t xml:space="preserve">"Only have one site? Day Pass — fix it today, no subscription."</w:t>
       </w:r>
     </w:p>
     <w:p>
@@ -1373,7 +1373,7 @@
           <w:sz w:val="22"/>
           <w:szCs w:val="22"/>
         </w:rPr>
-        <w:t xml:space="preserve"> (90 seconds, 0–100, 3 engines, free/$24) and the </w:t>
+        <w:t xml:space="preserve"> (90 seconds, 0–100, 3 engines, free) and the </w:t>
       </w:r>
       <w:r>
         <w:rPr>
@@ -1913,7 +1913,7 @@
           <w:sz w:val="22"/>
           <w:szCs w:val="22"/>
         </w:rPr>
-        <w:t xml:space="preserve">$24 Day Pass.</w:t>
+        <w:t xml:space="preserve">Day Pass.</w:t>
       </w:r>
       <w:r>
         <w:rPr>
@@ -2658,7 +2658,7 @@
           <w:sz w:val="22"/>
           <w:szCs w:val="22"/>
         </w:rPr>
-        <w:t xml:space="preserve">Day Pass — $24, one-time:</w:t>
+        <w:t xml:space="preserve">Day Pass — one-time:</w:t>
       </w:r>
       <w:r>
         <w:rPr>
@@ -2704,7 +2704,7 @@
           <w:sz w:val="22"/>
           <w:szCs w:val="22"/>
         </w:rPr>
-        <w:t xml:space="preserve">Pro — $49/mo</w:t>
+        <w:t xml:space="preserve">Pro</w:t>
       </w:r>
       <w:r>
         <w:rPr>
@@ -2722,7 +2722,7 @@
           <w:sz w:val="22"/>
           <w:szCs w:val="22"/>
         </w:rPr>
-        <w:t xml:space="preserve">Business — $199/mo</w:t>
+        <w:t xml:space="preserve">Business</w:t>
       </w:r>
       <w:r>
         <w:rPr>
@@ -3115,7 +3115,7 @@
           <w:sz w:val="22"/>
           <w:szCs w:val="22"/>
         </w:rPr>
-        <w:t xml:space="preserve">$24 Day Pass</w:t>
+        <w:t xml:space="preserve">Day Pass</w:t>
       </w:r>
       <w:r>
         <w:rPr>
@@ -3285,7 +3285,7 @@
           <w:sz w:val="22"/>
           <w:szCs w:val="22"/>
         </w:rPr>
-        <w:t xml:space="preserve">$24 Day Pass</w:t>
+        <w:t xml:space="preserve">Day Pass</w:t>
       </w:r>
       <w:r>
         <w:rPr>
@@ -3432,7 +3432,7 @@
           <w:sz w:val="22"/>
           <w:szCs w:val="22"/>
         </w:rPr>
-        <w:t xml:space="preserve">$24 Day Pass</w:t>
+        <w:t xml:space="preserve">Day Pass</w:t>
       </w:r>
       <w:r>
         <w:rPr>
@@ -3643,7 +3643,7 @@
           <w:sz w:val="22"/>
           <w:szCs w:val="22"/>
         </w:rPr>
-        <w:t xml:space="preserve">$24 Day Pass</w:t>
+        <w:t xml:space="preserve">Day Pass</w:t>
       </w:r>
       <w:r>
         <w:rPr>
@@ -3878,7 +3878,7 @@
           <w:sz w:val="22"/>
           <w:szCs w:val="22"/>
         </w:rPr>
-        <w:t xml:space="preserve">$24 Day Pass</w:t>
+        <w:t xml:space="preserve">Day Pass</w:t>
       </w:r>
       <w:r>
         <w:rPr>
@@ -4152,7 +4152,7 @@
           <w:sz w:val="22"/>
           <w:szCs w:val="22"/>
         </w:rPr>
-        <w:t xml:space="preserve">I built a tool that scores this and generates the fixes (AEO Analyzers — there's a free audit and a $24 one-time day pass if you just need to fix one site), but the checklist above is the core of it regardless of what you use. Happy to answer AEO questions in the comments.</w:t>
+        <w:t xml:space="preserve">I built a tool that scores this and generates the fixes (AEO Analyzers — there's a free audit and a one-time Day Pass if you just need to fix one site), but the checklist above is the core of it regardless of what you use. Happy to answer AEO questions in the comments.</w:t>
       </w:r>
     </w:p>
     <w:p>
@@ -5132,7 +5132,7 @@
                 <w:sz w:val="18"/>
                 <w:szCs w:val="18"/>
               </w:rPr>
-              <w:t xml:space="preserve"> — "only have one site? $24, fix it today" (adapt §1/§3)</w:t>
+              <w:t xml:space="preserve"> — "only have one site? fix it today" (adapt §1/§3)</w:t>
             </w:r>
           </w:p>
         </w:tc>
@@ -7290,7 +7290,7 @@
           <w:sz w:val="22"/>
           <w:szCs w:val="22"/>
         </w:rPr>
-        <w:t xml:space="preserve">Gemini · ChatGPT · Perplexity", "Citation Probability", "Free audit", "$24 Day</w:t>
+        <w:t xml:space="preserve">Gemini · ChatGPT · Perplexity", "Citation Probability", "Free audit", "Day</w:t>
       </w:r>
     </w:p>
     <w:p>
@@ -7739,7 +7739,7 @@
           <w:sz w:val="22"/>
           <w:szCs w:val="22"/>
         </w:rPr>
-        <w:t xml:space="preserve">Ink-navy, the glowing answer card centered, confident. Big line: "Be the answer AI gives." Amber CTA pill: "Free audit → aeoanalyzers.com". Small emerald row of chips: "Free · $24 Day Pass · no subscription". 1.91:1.</w:t>
+        <w:t xml:space="preserve">Ink-navy, the glowing answer card centered, confident. Big line: "Be the answer AI gives." Amber CTA pill: "Free audit → aeoanalyzers.com". Small emerald row of chips: "Free · Day Pass · no subscription". 1.91:1.</w:t>
       </w:r>
     </w:p>
     <w:p>
@@ -9286,7 +9286,7 @@
                 <w:sz w:val="18"/>
                 <w:szCs w:val="18"/>
               </w:rPr>
-              <w:t xml:space="preserve">Day Pass $24 tile (square)</w:t>
+              <w:t xml:space="preserve">Day Pass tile (square)</w:t>
             </w:r>
           </w:p>
         </w:tc>
@@ -10825,7 +10825,7 @@
           <w:sz w:val="32"/>
           <w:szCs w:val="32"/>
         </w:rPr>
-        <w:t xml:space="preserve">PIECE 6 — Day Pass offer ($24, one-time)</w:t>
+        <w:t xml:space="preserve">PIECE 6 — Day Pass offer (one-time)</w:t>
       </w:r>
     </w:p>
     <w:p>
@@ -10874,7 +10874,7 @@
           <w:sz w:val="22"/>
           <w:szCs w:val="22"/>
         </w:rPr>
-        <w:t xml:space="preserve">Day Pass — $24, 24 hours</w:t>
+        <w:t xml:space="preserve">Day Pass — 24 hours</w:t>
       </w:r>
       <w:r>
         <w:rPr>
@@ -10921,7 +10921,7 @@
           <w:sz w:val="22"/>
           <w:szCs w:val="22"/>
         </w:rPr>
-        <w:t xml:space="preserve">New: $24 Day Pass. 24 hours of full AEO access — every fix + the Word report. No subscription. Fix your site today 👉 aeoanalyzers.com</w:t>
+        <w:t xml:space="preserve">New: Day Pass. 24 hours of full AEO access — every fix + the Word report. No subscription. Fix your site today 👉 aeoanalyzers.com</w:t>
       </w:r>
     </w:p>
     <w:p>
@@ -11448,7 +11448,7 @@
           <w:sz w:val="22"/>
           <w:szCs w:val="22"/>
         </w:rPr>
-        <w:t xml:space="preserve">Only have one site? Grab a $24 Day Pass — full access for 24 hours, no subscription.</w:t>
+        <w:t xml:space="preserve">Only have one site? Grab a Day Pass — full access for 24 hours, no subscription.</w:t>
       </w:r>
     </w:p>
     <w:p>
@@ -11756,7 +11756,7 @@
           <w:sz w:val="22"/>
           <w:szCs w:val="22"/>
         </w:rPr>
-        <w:t xml:space="preserve">👉 $24 Day Pass — 24 hours of full access: every fix, the paste-ready JSON-LD, and the Word report. No subscription: https://aeoanalyzers.com</w:t>
+        <w:t xml:space="preserve">👉 Day Pass — 24 hours of full access: every fix, the paste-ready JSON-LD, and the Word report. No subscription: https://aeoanalyzers.com</w:t>
       </w:r>
     </w:p>
     <w:p>
@@ -13329,7 +13329,7 @@
           <w:sz w:val="22"/>
           <w:szCs w:val="22"/>
         </w:rPr>
-        <w:t xml:space="preserve">Day Pass — $24, one-time:</w:t>
+        <w:t xml:space="preserve">Day Pass — one-time:</w:t>
       </w:r>
       <w:r>
         <w:rPr>
@@ -13375,7 +13375,7 @@
           <w:sz w:val="22"/>
           <w:szCs w:val="22"/>
         </w:rPr>
-        <w:t xml:space="preserve">Pro — $49/mo:</w:t>
+        <w:t xml:space="preserve">Pro:</w:t>
       </w:r>
       <w:r>
         <w:rPr>
@@ -13403,7 +13403,7 @@
           <w:sz w:val="22"/>
           <w:szCs w:val="22"/>
         </w:rPr>
-        <w:t xml:space="preserve">Business — $199/mo:</w:t>
+        <w:t xml:space="preserve">Business:</w:t>
       </w:r>
       <w:r>
         <w:rPr>
@@ -16359,7 +16359,7 @@
           <w:sz w:val="22"/>
           <w:szCs w:val="22"/>
         </w:rPr>
-        <w:t xml:space="preserve">Premium pricing tile on ink-navy, amber accent + soft warm glow, clean SaaS card. Large "$24", a "24 hours" chip, a few abstract checkmark rows. Simple, trustworthy, no-subscription.</w:t>
+        <w:t xml:space="preserve">Premium pricing tile on ink-navy, amber accent + soft warm glow, clean SaaS card. A bold "Day Pass" title, a "24 hours" chip, a few abstract checkmark rows. Simple, trustworthy, no-subscription.</w:t>
       </w:r>
     </w:p>
     <w:p>
@@ -16375,7 +16375,7 @@
           <w:sz w:val="22"/>
           <w:szCs w:val="22"/>
         </w:rPr>
-        <w:t xml:space="preserve">Text: "Day Pass | $24 | 24 hours" · chip: "Start now"</w:t>
+        <w:t xml:space="preserve">Text: "Day Pass | 24 hours | no subscription" · chip: "Start now"</w:t>
       </w:r>
     </w:p>
     <w:p>
@@ -17092,7 +17092,7 @@
           <w:sz w:val="22"/>
           <w:szCs w:val="22"/>
         </w:rPr>
-        <w:t xml:space="preserve"> no invented outcome stats (no "10x traffic / +X% leads") and no internal economics in customer-facing images until we have real, citable data. True product facts (90s, 0–100, 3 engines, $24/free) and the market shift are fine.</w:t>
+        <w:t xml:space="preserve"> no invented outcome stats (no "10x traffic / +X% leads") and no internal economics in customer-facing images until we have real, citable data. True product facts (90s, 0–100, 3 engines, free) and the market shift are fine.</w:t>
       </w:r>
     </w:p>
     <w:p>

</xml_diff>

<commit_message>
Marketing: remove last "simulates / multiple engines" claims from doc sources (#40)
The docx still surfaced "AEO Analyzers simulates how/3 engines", a "3 AI engines
simulated" image-prompt chip, a "Multiple engines | One score" caption, and
"single-algorithm guess". Reframed all to the accurate single-engine wording
(scores citability BY the engines; powered by Gemini 3.5; "Built for every answer
engine"). Also softened image-prompt "official source" → "authoritative source".
Regenerated docx — verified 0 prices / 0 multi-engine / 0 simulation / 0 official.

Co-Authored-By: Claude Opus 4.8 (1M context) <noreply@anthropic.com>
</commit_message>
<xml_diff>
--- a/docs/AEO-Analyzers-MASTER-Announcement.docx
+++ b/docs/AEO-Analyzers-MASTER-Announcement.docx
@@ -499,7 +499,7 @@
           <w:sz w:val="22"/>
           <w:szCs w:val="22"/>
         </w:rPr>
-        <w:t xml:space="preserve"> AEO Analyzers simulates how Gemini, ChatGPT, and Perplexity see you, scores it, and hands you the exact fixes.</w:t>
+        <w:t xml:space="preserve"> AEO Analyzers scores how citable you are by Gemini, ChatGPT, and Perplexity, and hands you the exact fixes.</w:t>
       </w:r>
     </w:p>
     <w:p>
@@ -7649,7 +7649,7 @@
           <w:sz w:val="22"/>
           <w:szCs w:val="22"/>
         </w:rPr>
-        <w:t xml:space="preserve">Abstracted product dashboard: big "91 / 100" gauge, four sub-bars (Entity, Density, Clarity, Structure), a "Citation Probability" chip, a small "editorial site" tag. Stat chip: "3 AI engines simulated". Soft shadow, SaaS screenshot style. 16:9. (Or use the real screenshot section-hero.png.)</w:t>
+        <w:t xml:space="preserve">Abstracted product dashboard: big "91 / 100" gauge, four sub-bars (Entity, Density, Clarity, Structure), a "Citation Probability" chip, a small "editorial site" tag. Stat chip: "Built for 3 answer engines". Soft shadow, SaaS screenshot style. 16:9. (Or use the real screenshot section-hero.png.)</w:t>
       </w:r>
     </w:p>
     <w:p>
@@ -10465,7 +10465,7 @@
           <w:sz w:val="22"/>
           <w:szCs w:val="22"/>
         </w:rPr>
-        <w:t xml:space="preserve">AEO Analyzers simulates 3 engines (Gemini/ChatGPT/Perplexity) → one score → the exact fixes. Not a single-algorithm guess. Real-world results in ~90s. [link]</w:t>
+        <w:t xml:space="preserve">AEO Analyzers scores how citable you are by the 3 big answer engines (Gemini/ChatGPT/Perplexity) → one score → the exact fixes. Powered by Gemini 3.5. Real-world results in ~90s. [link]</w:t>
       </w:r>
     </w:p>
     <w:p>
@@ -16479,7 +16479,7 @@
           <w:sz w:val="22"/>
           <w:szCs w:val="22"/>
         </w:rPr>
-        <w:t xml:space="preserve">Serious premium editorial-SaaS on ink-navy. An official source card glowing emerald center; outdated blog/article cards fade behind. A subtle AI answer stream points to the official card. Calm, civic, trustworthy. No flags/seals/logos.</w:t>
+        <w:t xml:space="preserve">Serious premium editorial-SaaS on ink-navy. An authoritative source card glowing emerald center; outdated blog/article cards fade behind. A subtle AI answer stream points to the authoritative card. Calm, civic, trustworthy. No flags/seals/logos.</w:t>
       </w:r>
     </w:p>
     <w:p>
@@ -16827,7 +16827,7 @@
           <w:sz w:val="22"/>
           <w:szCs w:val="22"/>
         </w:rPr>
-        <w:t xml:space="preserve">4 Multi-Engine: three nodes → one score card. "Multiple engines | One score."</w:t>
+        <w:t xml:space="preserve">4 Multi-Engine: three nodes → one score card. "Built for every answer engine | One score."</w:t>
       </w:r>
     </w:p>
     <w:p>

</xml_diff>

<commit_message>
Marketing: add ready-to-publish Substack/Medium article to the master doc (#41)
New docs/article-be-the-answer.md — a polished, self-contained long-form article
for Substack / Medium / LinkedIn Articles: Substack subject + Medium title +
subtitle, the "shift by the numbers" stats, the "Unlike tools that hand you a
score and stop" wedge, the dogfood story, and a free-audit/Day-Pass CTA (no
prices). Added as Part 4 of the docx (relaunch article moves to Part 5).
Full accuracy scan clean: 0 prices / multi-engine / simulation / first / pioneer.

Co-Authored-By: Claude Opus 4.8 (1M context) <noreply@anthropic.com>
</commit_message>
<xml_diff>
--- a/docs/AEO-Analyzers-MASTER-Announcement.docx
+++ b/docs/AEO-Analyzers-MASTER-Announcement.docx
@@ -12016,7 +12016,7 @@
           <w:sz w:val="30"/>
           <w:szCs w:val="30"/>
         </w:rPr>
-        <w:t xml:space="preserve">Part 4 — The Long-Form Article</w:t>
+        <w:t xml:space="preserve">Part 4 — Substack / Medium Article (ready to publish: title + intro + full body)</w:t>
       </w:r>
     </w:p>
     <w:p>
@@ -12032,7 +12032,7 @@
           <w:sz w:val="32"/>
           <w:szCs w:val="32"/>
         </w:rPr>
-        <w:t xml:space="preserve">AEO Analyzers, Reintroduced: The AI-Visibility Tool You Can Actually Trust — and Act On</w:t>
+        <w:t xml:space="preserve">Be the Answer AI Gives: Why Every Business Needs Answer Engine Optimization Now</w:t>
       </w:r>
     </w:p>
     <w:p>
@@ -12046,13 +12046,11 @@
       </w:pPr>
       <w:r>
         <w:rPr>
-          <w:b/>
-          <w:bCs/>
-          <w:color w:val="333333"/>
-          <w:sz w:val="22"/>
-          <w:szCs w:val="22"/>
-        </w:rPr>
-        <w:t xml:space="preserve">By Lindsay Hiebert, Founder · PI GenAI LLC</w:t>
+          <w:color w:val="333333"/>
+          <w:sz w:val="22"/>
+          <w:szCs w:val="22"/>
+        </w:rPr>
+        <w:t xml:space="preserve">*Ready-to-publish for Substack / Medium / LinkedIn Articles.*</w:t>
       </w:r>
     </w:p>
     <w:p>
@@ -12065,7 +12063,89 @@
           <w:sz w:val="22"/>
           <w:szCs w:val="22"/>
         </w:rPr>
-        <w:t xml:space="preserve">*Re-launch announcement · 2026*</w:t>
+        <w:t xml:space="preserve">*Substack subject line:* </w:t>
+      </w:r>
+      <w:r>
+        <w:rPr>
+          <w:b/>
+          <w:bCs/>
+          <w:color w:val="333333"/>
+          <w:sz w:val="22"/>
+          <w:szCs w:val="22"/>
+        </w:rPr>
+        <w:t xml:space="preserve">Be the answer AI gives (we just re-launched AEO Analyzers)</w:t>
+      </w:r>
+    </w:p>
+    <w:p>
+      <w:pPr>
+        <w:spacing w:after="100"/>
+      </w:pPr>
+      <w:r>
+        <w:rPr>
+          <w:color w:val="333333"/>
+          <w:sz w:val="22"/>
+          <w:szCs w:val="22"/>
+        </w:rPr>
+        <w:t xml:space="preserve">*Medium title:* </w:t>
+      </w:r>
+      <w:r>
+        <w:rPr>
+          <w:b/>
+          <w:bCs/>
+          <w:color w:val="333333"/>
+          <w:sz w:val="22"/>
+          <w:szCs w:val="22"/>
+        </w:rPr>
+        <w:t xml:space="preserve">Be the Answer AI Gives: Why Every Business Needs Answer Engine Optimization Now</w:t>
+      </w:r>
+      <w:r>
+        <w:rPr>
+          <w:color w:val="333333"/>
+          <w:sz w:val="22"/>
+          <w:szCs w:val="22"/>
+        </w:rPr>
+        <w:t xml:space="preserve"> — set the canonical URL to your Substack/site copy.</w:t>
+      </w:r>
+    </w:p>
+    <w:p>
+      <w:pPr>
+        <w:spacing w:after="100"/>
+      </w:pPr>
+      <w:r>
+        <w:rPr>
+          <w:color w:val="333333"/>
+          <w:sz w:val="22"/>
+          <w:szCs w:val="22"/>
+        </w:rPr>
+        <w:t xml:space="preserve">*By Lindsay Hiebert, Founder · PI GenAI LLC*</w:t>
+      </w:r>
+    </w:p>
+    <w:p>
+      <w:pPr>
+        <w:spacing w:after="80"/>
+      </w:pPr>
+    </w:p>
+    <w:p>
+      <w:pPr>
+        <w:spacing w:after="100"/>
+      </w:pPr>
+      <w:r>
+        <w:rPr>
+          <w:b/>
+          <w:bCs/>
+          <w:color w:val="333333"/>
+          <w:sz w:val="22"/>
+          <w:szCs w:val="22"/>
+        </w:rPr>
+        <w:t xml:space="preserve">Subtitle / preview:</w:t>
+      </w:r>
+      <w:r>
+        <w:rPr>
+          <w:color w:val="333333"/>
+          <w:sz w:val="22"/>
+          <w:szCs w:val="22"/>
+        </w:rPr>
+        <w:t xml:space="preserve"> Search is being replaced by answers. Here's how to find out whether AI cites your business — and exactly how to fix it — in about 90 seconds.</w:t>
       </w:r>
     </w:p>
     <w:p>
@@ -12099,7 +12179,7 @@
           <w:sz w:val="26"/>
           <w:szCs w:val="26"/>
         </w:rPr>
-        <w:t xml:space="preserve">Start here: your customers stopped scrolling. They're asking AI.</w:t>
+        <w:t xml:space="preserve">The shift nobody put on your dashboard</w:t>
       </w:r>
     </w:p>
     <w:p>
@@ -12117,25 +12197,7 @@
           <w:sz w:val="22"/>
           <w:szCs w:val="22"/>
         </w:rPr>
-        <w:t xml:space="preserve">Your buyers no longer scan ten blue links. They ask </w:t>
-      </w:r>
-      <w:r>
-        <w:rPr>
-          <w:b/>
-          <w:bCs/>
-          <w:color w:val="333333"/>
-          <w:sz w:val="22"/>
-          <w:szCs w:val="22"/>
-        </w:rPr>
-        <w:t xml:space="preserve">Gemini, ChatGPT, or Perplexity</w:t>
-      </w:r>
-      <w:r>
-        <w:rPr>
-          <w:color w:val="333333"/>
-          <w:sz w:val="22"/>
-          <w:szCs w:val="22"/>
-        </w:rPr>
-        <w:t xml:space="preserve"> a question and read </w:t>
+        <w:t xml:space="preserve">Your customers stopped scrolling. They no longer scan ten blue links — they ask Gemini, ChatGPT, or Perplexity a question and read </w:t>
       </w:r>
       <w:r>
         <w:rPr>
@@ -12153,25 +12215,7 @@
           <w:sz w:val="22"/>
           <w:szCs w:val="22"/>
         </w:rPr>
-        <w:t xml:space="preserve"> — stitched together from the handful of sites the AI decided to trust. If that's you, you win the customer before they even compare options. If it's your competitor, </w:t>
-      </w:r>
-      <w:r>
-        <w:rPr>
-          <w:b/>
-          <w:bCs/>
-          <w:color w:val="333333"/>
-          <w:sz w:val="22"/>
-          <w:szCs w:val="22"/>
-        </w:rPr>
-        <w:t xml:space="preserve">you lose the sale and never see it happen</w:t>
-      </w:r>
-      <w:r>
-        <w:rPr>
-          <w:color w:val="333333"/>
-          <w:sz w:val="22"/>
-          <w:szCs w:val="22"/>
-        </w:rPr>
-        <w:t xml:space="preserve"> — it doesn't show up in your analytics, your rankings, or your dashboards. It's an invisible leak.</w:t>
+        <w:t xml:space="preserve">, stitched together from the handful of sources the AI decided to trust.</w:t>
       </w:r>
     </w:p>
     <w:p>
@@ -12189,7 +12233,43 @@
           <w:sz w:val="22"/>
           <w:szCs w:val="22"/>
         </w:rPr>
-        <w:t xml:space="preserve">That's the new game. It's called </w:t>
+        <w:t xml:space="preserve">If that source is you, you win the customer before they even compare options. If it's your competitor, you lose the sale </w:t>
+      </w:r>
+      <w:r>
+        <w:rPr>
+          <w:b/>
+          <w:bCs/>
+          <w:color w:val="333333"/>
+          <w:sz w:val="22"/>
+          <w:szCs w:val="22"/>
+        </w:rPr>
+        <w:t xml:space="preserve">and never see it happen</w:t>
+      </w:r>
+      <w:r>
+        <w:rPr>
+          <w:color w:val="333333"/>
+          <w:sz w:val="22"/>
+          <w:szCs w:val="22"/>
+        </w:rPr>
+        <w:t xml:space="preserve"> — it doesn't show up in your analytics, your rankings, or your dashboards. It's an invisible leak, and it's getting bigger every quarter.</w:t>
+      </w:r>
+    </w:p>
+    <w:p>
+      <w:pPr>
+        <w:spacing w:after="80"/>
+      </w:pPr>
+    </w:p>
+    <w:p>
+      <w:pPr>
+        <w:spacing w:after="100"/>
+      </w:pPr>
+      <w:r>
+        <w:rPr>
+          <w:color w:val="333333"/>
+          <w:sz w:val="22"/>
+          <w:szCs w:val="22"/>
+        </w:rPr>
+        <w:t xml:space="preserve">This is the new game. It's called </w:t>
       </w:r>
       <w:r>
         <w:rPr>
@@ -12207,79 +12287,8 @@
           <w:sz w:val="22"/>
           <w:szCs w:val="22"/>
         </w:rPr>
-        <w:t xml:space="preserve">, and it is *not* SEO with a new label. SEO got you onto a results page. AEO decides whether </w:t>
-      </w:r>
-      <w:r>
-        <w:rPr>
-          <w:b/>
-          <w:bCs/>
-          <w:color w:val="333333"/>
-          <w:sz w:val="22"/>
-          <w:szCs w:val="22"/>
-        </w:rPr>
-        <w:t xml:space="preserve">you are the result.</w:t>
-      </w:r>
-    </w:p>
-    <w:p>
-      <w:pPr>
-        <w:spacing w:after="80"/>
-      </w:pPr>
-    </w:p>
-    <w:p>
-      <w:pPr>
-        <w:spacing w:after="100"/>
-      </w:pPr>
-      <w:r>
-        <w:rPr>
-          <w:b/>
-          <w:bCs/>
-          <w:color w:val="333333"/>
-          <w:sz w:val="22"/>
-          <w:szCs w:val="22"/>
-        </w:rPr>
-        <w:t xml:space="preserve">AEO Analyzers tells you — in about 90 seconds — whether AI engines cite you, and exactly what to change so they do.</w:t>
-      </w:r>
-    </w:p>
-    <w:p>
-      <w:pPr>
-        <w:spacing w:after="80"/>
-      </w:pPr>
-    </w:p>
-    <w:p>
-      <w:pPr>
-        <w:spacing w:after="100"/>
-      </w:pPr>
-      <w:r>
-        <w:rPr>
-          <w:color w:val="333333"/>
-          <w:sz w:val="22"/>
-          <w:szCs w:val="22"/>
-        </w:rPr>
-        <w:t xml:space="preserve">👉 </w:t>
-      </w:r>
-      <w:r>
-        <w:rPr>
-          <w:b/>
-          <w:bCs/>
-          <w:color w:val="333333"/>
-          <w:sz w:val="22"/>
-          <w:szCs w:val="22"/>
-        </w:rPr>
-        <w:t xml:space="preserve">Run a free audit on your site (and your #1 competitor): https://www.aeoanalyzers.com (https://www.aeoanalyzers.com)</w:t>
-      </w:r>
-    </w:p>
-    <w:p>
-      <w:pPr>
-        <w:spacing w:after="80"/>
-      </w:pPr>
-    </w:p>
-    <w:p>
-      <w:pPr>
-        <w:pBdr>
-          <w:bottom w:val="single" w:color="cccccc" w:sz="1"/>
-        </w:pBdr>
-        <w:spacing w:after="120"/>
-      </w:pPr>
+        <w:t xml:space="preserve">, and it is not SEO with a new label.</w:t>
+      </w:r>
     </w:p>
     <w:p>
       <w:pPr>
@@ -12299,7 +12308,7 @@
           <w:sz w:val="26"/>
           <w:szCs w:val="26"/>
         </w:rPr>
-        <w:t xml:space="preserve">The shift, by the numbers</w:t>
+        <w:t xml:space="preserve">The data is already stark</w:t>
       </w:r>
     </w:p>
     <w:p>
@@ -12317,7 +12326,7 @@
           <w:sz w:val="22"/>
           <w:szCs w:val="22"/>
         </w:rPr>
-        <w:t xml:space="preserve">This isn't a hunch — the data is stark:</w:t>
+        <w:t xml:space="preserve">This isn't a hunch:</w:t>
       </w:r>
     </w:p>
     <w:p>
@@ -12350,7 +12359,7 @@
           <w:sz w:val="22"/>
           <w:szCs w:val="22"/>
         </w:rPr>
-        <w:t xml:space="preserve"> as people turn to AI chatbots and answer engines instead. (Gartner (https://www.gartner.com/en/newsroom/press-releases/2024-02-19-gartner-predicts-search-engine-volume-will-drop-25-percent-by-2026-due-to-ai-chatbots-and-other-virtual-agents))</w:t>
+        <w:t xml:space="preserve"> as people shift to AI chatbots and answer engines. (Gartner (https://www.gartner.com/en/newsroom/press-releases/2024-02-19-gartner-predicts-search-engine-volume-will-drop-25-percent-by-2026-due-to-ai-chatbots-and-other-virtual-agents))</w:t>
       </w:r>
     </w:p>
     <w:p>
@@ -12378,25 +12387,25 @@
           <w:sz w:val="22"/>
           <w:szCs w:val="22"/>
         </w:rPr>
-        <w:t xml:space="preserve"> — the answer is read right on the results page — and that climbs to </w:t>
-      </w:r>
-      <w:r>
-        <w:rPr>
-          <w:b/>
-          <w:bCs/>
-          <w:color w:val="333333"/>
-          <w:sz w:val="22"/>
-          <w:szCs w:val="22"/>
-        </w:rPr>
-        <w:t xml:space="preserve">~83% when an AI Overview appears</w:t>
-      </w:r>
-      <w:r>
-        <w:rPr>
-          <w:color w:val="333333"/>
-          <w:sz w:val="22"/>
-          <w:szCs w:val="22"/>
-        </w:rPr>
-        <w:t xml:space="preserve"> (and ~93% in Google's AI Mode). (zero-click research, 2026 (https://www.digitalapplied.com/blog/zero-click-search-statistics-2026-complete-data))</w:t>
+        <w:t xml:space="preserve"> — the answer is read right on the page — climbing to </w:t>
+      </w:r>
+      <w:r>
+        <w:rPr>
+          <w:b/>
+          <w:bCs/>
+          <w:color w:val="333333"/>
+          <w:sz w:val="22"/>
+          <w:szCs w:val="22"/>
+        </w:rPr>
+        <w:t xml:space="preserve">~83% when an AI Overview appears.</w:t>
+      </w:r>
+      <w:r>
+        <w:rPr>
+          <w:color w:val="333333"/>
+          <w:sz w:val="22"/>
+          <w:szCs w:val="22"/>
+        </w:rPr>
+        <w:t xml:space="preserve"> (zero-click research, 2026 (https://www.digitalapplied.com/blog/zero-click-search-statistics-2026-complete-data))</w:t>
       </w:r>
     </w:p>
     <w:p>
@@ -12424,17 +12433,17 @@
           <w:sz w:val="22"/>
           <w:szCs w:val="22"/>
         </w:rPr>
-        <w:t xml:space="preserve"> and reach ~2 billion users a month; </w:t>
-      </w:r>
-      <w:r>
-        <w:rPr>
-          <w:b/>
-          <w:bCs/>
-          <w:color w:val="333333"/>
-          <w:sz w:val="22"/>
-          <w:szCs w:val="22"/>
-        </w:rPr>
-        <w:t xml:space="preserve">ChatGPT alone has ~800–900 million weekly users.</w:t>
+        <w:t xml:space="preserve"> and reach billions of users a month; </w:t>
+      </w:r>
+      <w:r>
+        <w:rPr>
+          <w:b/>
+          <w:bCs/>
+          <w:color w:val="333333"/>
+          <w:sz w:val="22"/>
+          <w:szCs w:val="22"/>
+        </w:rPr>
+        <w:t xml:space="preserve">ChatGPT alone has hundreds of millions of weekly users.</w:t>
       </w:r>
       <w:r>
         <w:rPr>
@@ -12460,7 +12469,7 @@
           <w:sz w:val="22"/>
           <w:szCs w:val="22"/>
         </w:rPr>
-        <w:t xml:space="preserve">The takeaway isn't "SEO is dead." SEO still earns the crawl and the ranking. But ranking on a page fewer people click is no longer the same as being </w:t>
+        <w:t xml:space="preserve">The takeaway isn't "SEO is dead." SEO still earns the crawl and the ranking. But ranking on a page fewer and fewer people click is no longer the same as being </w:t>
       </w:r>
       <w:r>
         <w:rPr>
@@ -12478,21 +12487,8 @@
           <w:sz w:val="22"/>
           <w:szCs w:val="22"/>
         </w:rPr>
-        <w:t xml:space="preserve"> — and that answer is increasingly where the customer decides. AEO is the layer that makes you citable in that moment.</w:t>
-      </w:r>
-    </w:p>
-    <w:p>
-      <w:pPr>
-        <w:spacing w:after="80"/>
-      </w:pPr>
-    </w:p>
-    <w:p>
-      <w:pPr>
-        <w:pBdr>
-          <w:bottom w:val="single" w:color="cccccc" w:sz="1"/>
-        </w:pBdr>
-        <w:spacing w:after="120"/>
-      </w:pPr>
+        <w:t xml:space="preserve"> — and that answer is increasingly where the customer actually decides.</w:t>
+      </w:r>
     </w:p>
     <w:p>
       <w:pPr>
@@ -12512,7 +12508,7 @@
           <w:sz w:val="26"/>
           <w:szCs w:val="26"/>
         </w:rPr>
-        <w:t xml:space="preserve">Why we're reintroducing it</w:t>
+        <w:t xml:space="preserve">SEO got you ranked. AEO gets you cited.</w:t>
       </w:r>
     </w:p>
     <w:p>
@@ -12530,39 +12526,44 @@
           <w:sz w:val="22"/>
           <w:szCs w:val="22"/>
         </w:rPr>
-        <w:t xml:space="preserve">We've rebuilt AEO Analyzers around one standard: </w:t>
-      </w:r>
-      <w:r>
-        <w:rPr>
-          <w:b/>
-          <w:bCs/>
-          <w:color w:val="333333"/>
-          <w:sz w:val="22"/>
-          <w:szCs w:val="22"/>
-        </w:rPr>
-        <w:t xml:space="preserve">a report a sophisticated brand owner can't catch making a mistake — and can hand straight to their web team.</w:t>
-      </w:r>
-      <w:r>
-        <w:rPr>
-          <w:color w:val="333333"/>
-          <w:sz w:val="22"/>
-          <w:szCs w:val="22"/>
-        </w:rPr>
-        <w:t xml:space="preserve"> Along the way we even fixed our *own* site (more on that below). This is the version worth your attention.</w:t>
-      </w:r>
-    </w:p>
-    <w:p>
-      <w:pPr>
-        <w:spacing w:after="80"/>
-      </w:pPr>
-    </w:p>
-    <w:p>
-      <w:pPr>
-        <w:pBdr>
-          <w:bottom w:val="single" w:color="cccccc" w:sz="1"/>
-        </w:pBdr>
-        <w:spacing w:after="120"/>
-      </w:pPr>
+        <w:t xml:space="preserve">SEO got you onto the results page. AEO decides whether you </w:t>
+      </w:r>
+      <w:r>
+        <w:rPr>
+          <w:b/>
+          <w:bCs/>
+          <w:color w:val="333333"/>
+          <w:sz w:val="22"/>
+          <w:szCs w:val="22"/>
+        </w:rPr>
+        <w:t xml:space="preserve">are</w:t>
+      </w:r>
+      <w:r>
+        <w:rPr>
+          <w:color w:val="333333"/>
+          <w:sz w:val="22"/>
+          <w:szCs w:val="22"/>
+        </w:rPr>
+        <w:t xml:space="preserve"> the result. The two share a foundation — crawlable pages, clean structure, real authority — but AEO is the new layer that determines whether an AI engine trusts you enough to quote you in its answer.</w:t>
+      </w:r>
+    </w:p>
+    <w:p>
+      <w:pPr>
+        <w:spacing w:after="80"/>
+      </w:pPr>
+    </w:p>
+    <w:p>
+      <w:pPr>
+        <w:spacing w:after="100"/>
+      </w:pPr>
+      <w:r>
+        <w:rPr>
+          <w:color w:val="333333"/>
+          <w:sz w:val="22"/>
+          <w:szCs w:val="22"/>
+        </w:rPr>
+        <w:t xml:space="preserve">The problem most businesses have: they have no idea where they stand. There's no "AI rank tracker" in their marketing stack. They're flying blind in the exact channel that's quietly replacing search.</w:t>
+      </w:r>
     </w:p>
     <w:p>
       <w:pPr>
@@ -12582,7 +12583,7 @@
           <w:sz w:val="26"/>
           <w:szCs w:val="26"/>
         </w:rPr>
-        <w:t xml:space="preserve">What makes it different — and why it's better</w:t>
+        <w:t xml:space="preserve">Unlike tools that hand you a score and stop</w:t>
       </w:r>
     </w:p>
     <w:p>
@@ -12600,25 +12601,25 @@
           <w:sz w:val="22"/>
           <w:szCs w:val="22"/>
         </w:rPr>
-        <w:t xml:space="preserve">Most "AI audit" tools hand you a plausible-looking score and some generic advice. Plausible isn't the same as correct, and a smart marketer spots the difference in five seconds. Here's what AEO Analyzers does that we haven't seen done this way anywhere else — each tied to an </w:t>
-      </w:r>
-      <w:r>
-        <w:rPr>
-          <w:b/>
-          <w:bCs/>
-          <w:color w:val="333333"/>
-          <w:sz w:val="22"/>
-          <w:szCs w:val="22"/>
-        </w:rPr>
-        <w:t xml:space="preserve">outcome</w:t>
-      </w:r>
-      <w:r>
-        <w:rPr>
-          <w:color w:val="333333"/>
-          <w:sz w:val="22"/>
-          <w:szCs w:val="22"/>
-        </w:rPr>
-        <w:t xml:space="preserve">, not a feature.</w:t>
+        <w:t xml:space="preserve">We just re-launched </w:t>
+      </w:r>
+      <w:r>
+        <w:rPr>
+          <w:b/>
+          <w:bCs/>
+          <w:color w:val="333333"/>
+          <w:sz w:val="22"/>
+          <w:szCs w:val="22"/>
+        </w:rPr>
+        <w:t xml:space="preserve">AEO Analyzers</w:t>
+      </w:r>
+      <w:r>
+        <w:rPr>
+          <w:color w:val="333333"/>
+          <w:sz w:val="22"/>
+          <w:szCs w:val="22"/>
+        </w:rPr>
+        <w:t xml:space="preserve"> to close that gap. Powered by Google Gemini 3.5's state-of-the-art frontier-model capabilities, it scores how citable your site is by the major AI answer engines — Gemini, ChatGPT, and Perplexity — in about 90 seconds.</w:t>
       </w:r>
     </w:p>
     <w:p>
@@ -12632,651 +12633,29 @@
       </w:pPr>
       <w:r>
         <w:rPr>
-          <w:b/>
-          <w:bCs/>
-          <w:color w:val="333333"/>
-          <w:sz w:val="22"/>
-          <w:szCs w:val="22"/>
-        </w:rPr>
-        <w:t xml:space="preserve">1. It never makes you paste a lie into your website.</w:t>
-      </w:r>
-    </w:p>
-    <w:p>
-      <w:pPr>
-        <w:spacing w:after="100"/>
-      </w:pPr>
-      <w:r>
-        <w:rPr>
-          <w:color w:val="333333"/>
-          <w:sz w:val="22"/>
-          <w:szCs w:val="22"/>
-        </w:rPr>
-        <w:t xml:space="preserve">Other tools generate JSON-LD schema you're told to paste into your &lt;head&gt; — including values they *guessed*. We split every schema into a </w:t>
-      </w:r>
-      <w:r>
-        <w:rPr>
-          <w:b/>
-          <w:bCs/>
-          <w:color w:val="333333"/>
-          <w:sz w:val="22"/>
-          <w:szCs w:val="22"/>
-        </w:rPr>
-        <w:t xml:space="preserve">"Verified — safe to paste"</w:t>
-      </w:r>
-      <w:r>
-        <w:rPr>
-          <w:color w:val="333333"/>
-          <w:sz w:val="22"/>
-          <w:szCs w:val="22"/>
-        </w:rPr>
-        <w:t xml:space="preserve"> block (only values actually found on your page, with the source quote that proves each one) and a </w:t>
-      </w:r>
-      <w:r>
-        <w:rPr>
-          <w:b/>
-          <w:bCs/>
-          <w:color w:val="333333"/>
-          <w:sz w:val="22"/>
-          <w:szCs w:val="22"/>
-        </w:rPr>
-        <w:t xml:space="preserve">"Candidate — verify first"</w:t>
-      </w:r>
-      <w:r>
-        <w:rPr>
-          <w:color w:val="333333"/>
-          <w:sz w:val="22"/>
-          <w:szCs w:val="22"/>
-        </w:rPr>
-        <w:t xml:space="preserve"> block (anything inferred, clearly flagged).</w:t>
-      </w:r>
-    </w:p>
-    <w:p>
-      <w:pPr>
-        <w:spacing w:after="100"/>
-      </w:pPr>
-      <w:r>
-        <w:rPr>
-          <w:b/>
-          <w:bCs/>
-          <w:color w:val="333333"/>
-          <w:sz w:val="22"/>
-          <w:szCs w:val="22"/>
-        </w:rPr>
-        <w:t xml:space="preserve">Outcome:</w:t>
-      </w:r>
-      <w:r>
-        <w:rPr>
-          <w:color w:val="333333"/>
-          <w:sz w:val="22"/>
-          <w:szCs w:val="22"/>
-        </w:rPr>
-        <w:t xml:space="preserve"> you never publish a fabricated fact that teaches AI engines something false about your business.</w:t>
-      </w:r>
-    </w:p>
-    <w:p>
-      <w:pPr>
-        <w:spacing w:after="80"/>
-      </w:pPr>
-    </w:p>
-    <w:p>
-      <w:pPr>
-        <w:spacing w:after="100"/>
-      </w:pPr>
-      <w:r>
-        <w:rPr>
-          <w:b/>
-          <w:bCs/>
-          <w:color w:val="333333"/>
-          <w:sz w:val="22"/>
-          <w:szCs w:val="22"/>
-        </w:rPr>
-        <w:t xml:space="preserve">2. It knows what kind of business you are — and gives the right advice.</w:t>
-      </w:r>
-    </w:p>
-    <w:p>
-      <w:pPr>
-        <w:spacing w:after="100"/>
-      </w:pPr>
-      <w:r>
-        <w:rPr>
-          <w:color w:val="333333"/>
-          <w:sz w:val="22"/>
-          <w:szCs w:val="22"/>
-        </w:rPr>
-        <w:t xml:space="preserve">Editorial brand? SaaS landing page? Ecommerce store? Most tools run one generic playbook over everything and tell a carefully-voiced publication to sound like a B2B funnel. We detect your register first and </w:t>
-      </w:r>
-      <w:r>
-        <w:rPr>
-          <w:b/>
-          <w:bCs/>
-          <w:color w:val="333333"/>
-          <w:sz w:val="22"/>
-          <w:szCs w:val="22"/>
-        </w:rPr>
-        <w:t xml:space="preserve">protect an editorial brand's voice</w:t>
-      </w:r>
-      <w:r>
-        <w:rPr>
-          <w:color w:val="333333"/>
-          <w:sz w:val="22"/>
-          <w:szCs w:val="22"/>
-        </w:rPr>
-        <w:t xml:space="preserve"> while giving a SaaS page conversion-focused guidance.</w:t>
-      </w:r>
-    </w:p>
-    <w:p>
-      <w:pPr>
-        <w:spacing w:after="100"/>
-      </w:pPr>
-      <w:r>
-        <w:rPr>
-          <w:b/>
-          <w:bCs/>
-          <w:color w:val="333333"/>
-          <w:sz w:val="22"/>
-          <w:szCs w:val="22"/>
-        </w:rPr>
-        <w:t xml:space="preserve">Outcome:</w:t>
-      </w:r>
-      <w:r>
-        <w:rPr>
-          <w:color w:val="333333"/>
-          <w:sz w:val="22"/>
-          <w:szCs w:val="22"/>
-        </w:rPr>
-        <w:t xml:space="preserve"> recommendations that fit your business and don't erase the brand voice that makes you, you.</w:t>
-      </w:r>
-    </w:p>
-    <w:p>
-      <w:pPr>
-        <w:spacing w:after="80"/>
-      </w:pPr>
-    </w:p>
-    <w:p>
-      <w:pPr>
-        <w:spacing w:after="100"/>
-      </w:pPr>
-      <w:r>
-        <w:rPr>
-          <w:b/>
-          <w:bCs/>
-          <w:color w:val="333333"/>
-          <w:sz w:val="22"/>
-          <w:szCs w:val="22"/>
-        </w:rPr>
-        <w:t xml:space="preserve">3. It tells you the truth about what's missing.</w:t>
-      </w:r>
-    </w:p>
-    <w:p>
-      <w:pPr>
-        <w:spacing w:after="100"/>
-      </w:pPr>
-      <w:r>
-        <w:rPr>
-          <w:color w:val="333333"/>
-          <w:sz w:val="22"/>
-          <w:szCs w:val="22"/>
-        </w:rPr>
-        <w:t xml:space="preserve">Other tools flag content as "missing" just because it isn't in the right schema — sending you to write duplicate content you already have. We distinguish *genuinely absent* from *present-but-not-marked-up*, show you the exact on-page sentence, and tell you to </w:t>
-      </w:r>
-      <w:r>
-        <w:rPr>
-          <w:b/>
-          <w:bCs/>
-          <w:color w:val="333333"/>
-          <w:sz w:val="22"/>
-          <w:szCs w:val="22"/>
-        </w:rPr>
-        <w:t xml:space="preserve">wrap it, not rewrite it.</w:t>
-      </w:r>
-      <w:r>
-        <w:rPr>
-          <w:color w:val="333333"/>
-          <w:sz w:val="22"/>
-          <w:szCs w:val="22"/>
-        </w:rPr>
-        <w:t xml:space="preserve"> And it won't recommend creating content for features you don't even offer.</w:t>
-      </w:r>
-    </w:p>
-    <w:p>
-      <w:pPr>
-        <w:spacing w:after="100"/>
-      </w:pPr>
-      <w:r>
-        <w:rPr>
-          <w:b/>
-          <w:bCs/>
-          <w:color w:val="333333"/>
-          <w:sz w:val="22"/>
-          <w:szCs w:val="22"/>
-        </w:rPr>
-        <w:t xml:space="preserve">Outcome:</w:t>
-      </w:r>
-      <w:r>
-        <w:rPr>
-          <w:color w:val="333333"/>
-          <w:sz w:val="22"/>
-          <w:szCs w:val="22"/>
-        </w:rPr>
-        <w:t xml:space="preserve"> less busywork, no duplicate content, faster wins your developer can execute verbatim.</w:t>
-      </w:r>
-    </w:p>
-    <w:p>
-      <w:pPr>
-        <w:spacing w:after="80"/>
-      </w:pPr>
-    </w:p>
-    <w:p>
-      <w:pPr>
-        <w:spacing w:after="100"/>
-      </w:pPr>
-      <w:r>
-        <w:rPr>
-          <w:b/>
-          <w:bCs/>
-          <w:color w:val="333333"/>
-          <w:sz w:val="22"/>
-          <w:szCs w:val="22"/>
-        </w:rPr>
-        <w:t xml:space="preserve">4. It gives you the cure, not just the diagnosis.</w:t>
-      </w:r>
-    </w:p>
-    <w:p>
-      <w:pPr>
-        <w:spacing w:after="100"/>
-      </w:pPr>
-      <w:r>
-        <w:rPr>
-          <w:color w:val="333333"/>
-          <w:sz w:val="22"/>
-          <w:szCs w:val="22"/>
-        </w:rPr>
-        <w:t xml:space="preserve">A score is interesting; a fix is valuable. You get </w:t>
-      </w:r>
-      <w:r>
-        <w:rPr>
-          <w:b/>
-          <w:bCs/>
-          <w:color w:val="333333"/>
-          <w:sz w:val="22"/>
-          <w:szCs w:val="22"/>
-        </w:rPr>
-        <w:t xml:space="preserve">paste-ready JSON-LD, before/after content rewrites, a meta-description rewrite, a prioritized implementation checklist, a downloadable Word report, and a copy-paste handoff template</w:t>
-      </w:r>
-      <w:r>
-        <w:rPr>
-          <w:color w:val="333333"/>
-          <w:sz w:val="22"/>
-          <w:szCs w:val="22"/>
-        </w:rPr>
-        <w:t xml:space="preserve"> for your web team.</w:t>
-      </w:r>
-    </w:p>
-    <w:p>
-      <w:pPr>
-        <w:spacing w:after="100"/>
-      </w:pPr>
-      <w:r>
-        <w:rPr>
-          <w:b/>
-          <w:bCs/>
-          <w:color w:val="333333"/>
-          <w:sz w:val="22"/>
-          <w:szCs w:val="22"/>
-        </w:rPr>
-        <w:t xml:space="preserve">Outcome:</w:t>
-      </w:r>
-      <w:r>
-        <w:rPr>
-          <w:color w:val="333333"/>
-          <w:sz w:val="22"/>
-          <w:szCs w:val="22"/>
-        </w:rPr>
-        <w:t xml:space="preserve"> you don't just learn you have a problem — you get the exact, deploy-ready solution.</w:t>
-      </w:r>
-    </w:p>
-    <w:p>
-      <w:pPr>
-        <w:spacing w:after="80"/>
-      </w:pPr>
-    </w:p>
-    <w:p>
-      <w:pPr>
-        <w:spacing w:after="100"/>
-      </w:pPr>
-      <w:r>
-        <w:rPr>
-          <w:b/>
-          <w:bCs/>
-          <w:color w:val="333333"/>
-          <w:sz w:val="22"/>
-          <w:szCs w:val="22"/>
-        </w:rPr>
-        <w:t xml:space="preserve">5. It shows you the invisible competition.</w:t>
-      </w:r>
-    </w:p>
-    <w:p>
-      <w:pPr>
-        <w:spacing w:after="100"/>
-      </w:pPr>
-      <w:r>
-        <w:rPr>
-          <w:color w:val="333333"/>
-          <w:sz w:val="22"/>
-          <w:szCs w:val="22"/>
-        </w:rPr>
-        <w:t xml:space="preserve">Gemini 3.5–powered AEO analysis (how Gemini, ChatGPT, and Perplexity each perceive you), a </w:t>
-      </w:r>
-      <w:r>
-        <w:rPr>
-          <w:b/>
-          <w:bCs/>
-          <w:color w:val="333333"/>
-          <w:sz w:val="22"/>
-          <w:szCs w:val="22"/>
-        </w:rPr>
-        <w:t xml:space="preserve">Citation Probability</w:t>
-      </w:r>
-      <w:r>
-        <w:rPr>
-          <w:color w:val="333333"/>
-          <w:sz w:val="22"/>
-          <w:szCs w:val="22"/>
-        </w:rPr>
-        <w:t xml:space="preserve"> score, and a head-to-head </w:t>
-      </w:r>
-      <w:r>
-        <w:rPr>
-          <w:b/>
-          <w:bCs/>
-          <w:color w:val="333333"/>
-          <w:sz w:val="22"/>
-          <w:szCs w:val="22"/>
-        </w:rPr>
-        <w:t xml:space="preserve">Competitive Duel</w:t>
-      </w:r>
-      <w:r>
-        <w:rPr>
-          <w:color w:val="333333"/>
-          <w:sz w:val="22"/>
-          <w:szCs w:val="22"/>
-        </w:rPr>
-        <w:t xml:space="preserve"> against a named rival.</w:t>
-      </w:r>
-    </w:p>
-    <w:p>
-      <w:pPr>
-        <w:spacing w:after="100"/>
-      </w:pPr>
-      <w:r>
-        <w:rPr>
-          <w:b/>
-          <w:bCs/>
-          <w:color w:val="333333"/>
-          <w:sz w:val="22"/>
-          <w:szCs w:val="22"/>
-        </w:rPr>
-        <w:t xml:space="preserve">Outcome:</w:t>
-      </w:r>
-      <w:r>
-        <w:rPr>
-          <w:color w:val="333333"/>
-          <w:sz w:val="22"/>
-          <w:szCs w:val="22"/>
-        </w:rPr>
-        <w:t xml:space="preserve"> you finally see where a competitor is winning the citation you should own.</w:t>
-      </w:r>
-    </w:p>
-    <w:p>
-      <w:pPr>
-        <w:spacing w:after="80"/>
-      </w:pPr>
-    </w:p>
-    <w:p>
-      <w:pPr>
-        <w:spacing w:after="100"/>
-      </w:pPr>
-      <w:r>
-        <w:rPr>
-          <w:b/>
-          <w:bCs/>
-          <w:color w:val="333333"/>
-          <w:sz w:val="22"/>
-          <w:szCs w:val="22"/>
-        </w:rPr>
-        <w:t xml:space="preserve">6. It practices what it sells.</w:t>
-      </w:r>
-    </w:p>
-    <w:p>
-      <w:pPr>
-        <w:spacing w:after="100"/>
-      </w:pPr>
-      <w:r>
-        <w:rPr>
-          <w:color w:val="333333"/>
-          <w:sz w:val="22"/>
-          <w:szCs w:val="22"/>
-        </w:rPr>
-        <w:t xml:space="preserve">We ran AEO Analyzers on our *own* site, discovered it was invisible to AI crawlers, and fixed it — our pages are now fully readable and citable by AI engines. We dogfood the exact thing we ask you to do.</w:t>
-      </w:r>
-    </w:p>
-    <w:p>
-      <w:pPr>
-        <w:spacing w:after="100"/>
-      </w:pPr>
-      <w:r>
-        <w:rPr>
-          <w:b/>
-          <w:bCs/>
-          <w:color w:val="333333"/>
-          <w:sz w:val="22"/>
-          <w:szCs w:val="22"/>
-        </w:rPr>
-        <w:t xml:space="preserve">Outcome:</w:t>
-      </w:r>
-      <w:r>
-        <w:rPr>
-          <w:color w:val="333333"/>
-          <w:sz w:val="22"/>
-          <w:szCs w:val="22"/>
-        </w:rPr>
-        <w:t xml:space="preserve"> a tool built by people who actually live the problem.</w:t>
-      </w:r>
-    </w:p>
-    <w:p>
-      <w:pPr>
-        <w:spacing w:after="80"/>
-      </w:pPr>
-    </w:p>
-    <w:p>
-      <w:pPr>
-        <w:spacing w:after="100"/>
-      </w:pPr>
-      <w:r>
-        <w:rPr>
-          <w:color w:val="333333"/>
-          <w:sz w:val="22"/>
-          <w:szCs w:val="22"/>
-        </w:rPr>
-        <w:t xml:space="preserve">And it does all of this in </w:t>
-      </w:r>
-      <w:r>
-        <w:rPr>
-          <w:b/>
-          <w:bCs/>
-          <w:color w:val="333333"/>
-          <w:sz w:val="22"/>
-          <w:szCs w:val="22"/>
-        </w:rPr>
-        <w:t xml:space="preserve">90 seconds</w:t>
-      </w:r>
-      <w:r>
-        <w:rPr>
-          <w:color w:val="333333"/>
-          <w:sz w:val="22"/>
-          <w:szCs w:val="22"/>
-        </w:rPr>
-        <w:t xml:space="preserve"> — work that would take a web team </w:t>
-      </w:r>
-      <w:r>
-        <w:rPr>
-          <w:b/>
-          <w:bCs/>
-          <w:color w:val="333333"/>
-          <w:sz w:val="22"/>
-          <w:szCs w:val="22"/>
-        </w:rPr>
-        <w:t xml:space="preserve">hundreds of hours</w:t>
-      </w:r>
-      <w:r>
-        <w:rPr>
-          <w:color w:val="333333"/>
-          <w:sz w:val="22"/>
-          <w:szCs w:val="22"/>
-        </w:rPr>
-        <w:t xml:space="preserve"> by hand.</w:t>
-      </w:r>
-    </w:p>
-    <w:p>
-      <w:pPr>
-        <w:spacing w:after="80"/>
-      </w:pPr>
-    </w:p>
-    <w:p>
-      <w:pPr>
-        <w:pBdr>
-          <w:bottom w:val="single" w:color="cccccc" w:sz="1"/>
-        </w:pBdr>
-        <w:spacing w:after="120"/>
-      </w:pPr>
-    </w:p>
-    <w:p>
-      <w:pPr>
-        <w:spacing w:after="80"/>
-      </w:pPr>
-    </w:p>
-    <w:p>
-      <w:pPr>
-        <w:pStyle w:val="Heading2"/>
-        <w:spacing w:after="100" w:before="220"/>
-      </w:pPr>
-      <w:r>
-        <w:rPr>
-          <w:b/>
-          <w:bCs/>
-          <w:color w:val="1a1a2e"/>
-          <w:sz w:val="26"/>
-          <w:szCs w:val="26"/>
-        </w:rPr>
-        <w:t xml:space="preserve">What you get, by who you are</w:t>
-      </w:r>
-    </w:p>
-    <w:p>
-      <w:pPr>
-        <w:spacing w:after="80"/>
-      </w:pPr>
-    </w:p>
-    <w:p>
-      <w:pPr>
-        <w:spacing w:after="100"/>
-      </w:pPr>
-      <w:r>
-        <w:rPr>
-          <w:b/>
-          <w:bCs/>
-          <w:color w:val="333333"/>
-          <w:sz w:val="22"/>
-          <w:szCs w:val="22"/>
-        </w:rPr>
-        <w:t xml:space="preserve">Marketing teams &amp; CMOs</w:t>
-      </w:r>
-      <w:r>
-        <w:rPr>
-          <w:color w:val="333333"/>
-          <w:sz w:val="22"/>
-          <w:szCs w:val="22"/>
-        </w:rPr>
-        <w:t xml:space="preserve"> — Visibility into the channel that's quietly replacing search, a repeatable scorecard to prove impact over time, and early warning when a competitor starts displacing you in AI answers.</w:t>
-      </w:r>
-    </w:p>
-    <w:p>
-      <w:pPr>
-        <w:spacing w:after="100"/>
-      </w:pPr>
-      <w:r>
-        <w:rPr>
-          <w:b/>
-          <w:bCs/>
-          <w:color w:val="333333"/>
-          <w:sz w:val="22"/>
-          <w:szCs w:val="22"/>
-        </w:rPr>
-        <w:t xml:space="preserve">Web admins &amp; developers</w:t>
-      </w:r>
-      <w:r>
-        <w:rPr>
-          <w:color w:val="333333"/>
-          <w:sz w:val="22"/>
-          <w:szCs w:val="22"/>
-        </w:rPr>
-        <w:t xml:space="preserve"> — An accurate, deploy-ready report you can execute without guesswork or embarrassment: valid JSON-LD, specific rewrites, a prioritized checklist, and a clean handoff doc.</w:t>
-      </w:r>
-    </w:p>
-    <w:p>
-      <w:pPr>
-        <w:spacing w:after="100"/>
-      </w:pPr>
-      <w:r>
-        <w:rPr>
-          <w:b/>
-          <w:bCs/>
-          <w:color w:val="333333"/>
-          <w:sz w:val="22"/>
-          <w:szCs w:val="22"/>
-        </w:rPr>
-        <w:t xml:space="preserve">Founders &amp; business owners</w:t>
-      </w:r>
-      <w:r>
-        <w:rPr>
-          <w:color w:val="333333"/>
-          <w:sz w:val="22"/>
-          <w:szCs w:val="22"/>
-        </w:rPr>
-        <w:t xml:space="preserve"> — A straight answer to "when someone asks AI about my space, does it recommend me — or my competitor?" — and a clear, cheap path to fix it.</w:t>
-      </w:r>
-    </w:p>
-    <w:p>
-      <w:pPr>
-        <w:spacing w:after="80"/>
-      </w:pPr>
-    </w:p>
-    <w:p>
-      <w:pPr>
-        <w:pBdr>
-          <w:bottom w:val="single" w:color="cccccc" w:sz="1"/>
-        </w:pBdr>
-        <w:spacing w:after="120"/>
-      </w:pPr>
-    </w:p>
-    <w:p>
-      <w:pPr>
-        <w:spacing w:after="80"/>
-      </w:pPr>
-    </w:p>
-    <w:p>
-      <w:pPr>
-        <w:pStyle w:val="Heading2"/>
-        <w:spacing w:after="100" w:before="220"/>
-      </w:pPr>
-      <w:r>
-        <w:rPr>
-          <w:b/>
-          <w:bCs/>
-          <w:color w:val="1a1a2e"/>
-          <w:sz w:val="26"/>
-          <w:szCs w:val="26"/>
-        </w:rPr>
-        <w:t xml:space="preserve">Pricing — including a way for everyone to say yes</w:t>
+          <w:color w:val="333333"/>
+          <w:sz w:val="22"/>
+          <w:szCs w:val="22"/>
+        </w:rPr>
+        <w:t xml:space="preserve">But a score is only interesting; a fix is valuable. Unlike tools that hand you a number and walk away, AEO Analyzers tells you </w:t>
+      </w:r>
+      <w:r>
+        <w:rPr>
+          <w:b/>
+          <w:bCs/>
+          <w:color w:val="333333"/>
+          <w:sz w:val="22"/>
+          <w:szCs w:val="22"/>
+        </w:rPr>
+        <w:t xml:space="preserve">exactly what to do to get cited</w:t>
+      </w:r>
+      <w:r>
+        <w:rPr>
+          <w:color w:val="333333"/>
+          <w:sz w:val="22"/>
+          <w:szCs w:val="22"/>
+        </w:rPr>
+        <w:t xml:space="preserve">, and hands you the cure:</w:t>
       </w:r>
     </w:p>
     <w:p>
@@ -13301,15 +12680,51 @@
           <w:sz w:val="22"/>
           <w:szCs w:val="22"/>
         </w:rPr>
-        <w:t xml:space="preserve">Free:</w:t>
-      </w:r>
-      <w:r>
-        <w:rPr>
-          <w:color w:val="333333"/>
-          <w:sz w:val="22"/>
-          <w:szCs w:val="22"/>
-        </w:rPr>
-        <w:t xml:space="preserve"> one full diagnostic audit — your score, your gaps, your brand type. See exactly where you stand.</w:t>
+        <w:t xml:space="preserve">Paste-ready JSON-LD</w:t>
+      </w:r>
+      <w:r>
+        <w:rPr>
+          <w:color w:val="333333"/>
+          <w:sz w:val="22"/>
+          <w:szCs w:val="22"/>
+        </w:rPr>
+        <w:t xml:space="preserve">, split into </w:t>
+      </w:r>
+      <w:r>
+        <w:rPr>
+          <w:b/>
+          <w:bCs/>
+          <w:color w:val="333333"/>
+          <w:sz w:val="22"/>
+          <w:szCs w:val="22"/>
+        </w:rPr>
+        <w:t xml:space="preserve">Verified</w:t>
+      </w:r>
+      <w:r>
+        <w:rPr>
+          <w:color w:val="333333"/>
+          <w:sz w:val="22"/>
+          <w:szCs w:val="22"/>
+        </w:rPr>
+        <w:t xml:space="preserve"> (only values actually found on your page, with the source quote that proves each one) and </w:t>
+      </w:r>
+      <w:r>
+        <w:rPr>
+          <w:b/>
+          <w:bCs/>
+          <w:color w:val="333333"/>
+          <w:sz w:val="22"/>
+          <w:szCs w:val="22"/>
+        </w:rPr>
+        <w:t xml:space="preserve">Candidate</w:t>
+      </w:r>
+      <w:r>
+        <w:rPr>
+          <w:color w:val="333333"/>
+          <w:sz w:val="22"/>
+          <w:szCs w:val="22"/>
+        </w:rPr>
+        <w:t xml:space="preserve"> (anything inferred, clearly flagged) — *so you never publish a guessed "fact" that teaches AI engines something false about your business.*</w:t>
       </w:r>
     </w:p>
     <w:p>
@@ -13329,33 +12744,15 @@
           <w:sz w:val="22"/>
           <w:szCs w:val="22"/>
         </w:rPr>
-        <w:t xml:space="preserve">Day Pass — one-time:</w:t>
-      </w:r>
-      <w:r>
-        <w:rPr>
-          <w:color w:val="333333"/>
-          <w:sz w:val="22"/>
-          <w:szCs w:val="22"/>
-        </w:rPr>
-        <w:t xml:space="preserve"> only have a site or two? Unlock </w:t>
-      </w:r>
-      <w:r>
-        <w:rPr>
-          <w:b/>
-          <w:bCs/>
-          <w:color w:val="333333"/>
-          <w:sz w:val="22"/>
-          <w:szCs w:val="22"/>
-        </w:rPr>
-        <w:t xml:space="preserve">every fix and download for 24 hours</w:t>
-      </w:r>
-      <w:r>
-        <w:rPr>
-          <w:color w:val="333333"/>
-          <w:sz w:val="22"/>
-          <w:szCs w:val="22"/>
-        </w:rPr>
-        <w:t xml:space="preserve">, no subscription. Fix it today, done.</w:t>
+        <w:t xml:space="preserve">Before/after content rewrites</w:t>
+      </w:r>
+      <w:r>
+        <w:rPr>
+          <w:color w:val="333333"/>
+          <w:sz w:val="22"/>
+          <w:szCs w:val="22"/>
+        </w:rPr>
+        <w:t xml:space="preserve"> that turn vague marketing into specific, citable claims.</w:t>
       </w:r>
     </w:p>
     <w:p>
@@ -13375,15 +12772,15 @@
           <w:sz w:val="22"/>
           <w:szCs w:val="22"/>
         </w:rPr>
-        <w:t xml:space="preserve">Pro:</w:t>
-      </w:r>
-      <w:r>
-        <w:rPr>
-          <w:color w:val="333333"/>
-          <w:sz w:val="22"/>
-          <w:szCs w:val="22"/>
-        </w:rPr>
-        <w:t xml:space="preserve"> for freelancers and small teams.</w:t>
+        <w:t xml:space="preserve">A prioritized fix checklist and a downloadable Word report</w:t>
+      </w:r>
+      <w:r>
+        <w:rPr>
+          <w:color w:val="333333"/>
+          <w:sz w:val="22"/>
+          <w:szCs w:val="22"/>
+        </w:rPr>
+        <w:t xml:space="preserve"> your developer can execute verbatim.</w:t>
       </w:r>
     </w:p>
     <w:p>
@@ -13403,15 +12800,356 @@
           <w:sz w:val="22"/>
           <w:szCs w:val="22"/>
         </w:rPr>
-        <w:t xml:space="preserve">Business:</w:t>
-      </w:r>
-      <w:r>
-        <w:rPr>
-          <w:color w:val="333333"/>
-          <w:sz w:val="22"/>
-          <w:szCs w:val="22"/>
-        </w:rPr>
-        <w:t xml:space="preserve"> for agencies and growing SaaS — competitor benchmarking and higher volume.</w:t>
+        <w:t xml:space="preserve">A Competitive Duel</w:t>
+      </w:r>
+      <w:r>
+        <w:rPr>
+          <w:color w:val="333333"/>
+          <w:sz w:val="22"/>
+          <w:szCs w:val="22"/>
+        </w:rPr>
+        <w:t xml:space="preserve"> — enter your URL and a rival's, and see who AI would name, side by side.</w:t>
+      </w:r>
+    </w:p>
+    <w:p>
+      <w:pPr>
+        <w:pStyle w:val="ListParagraph"/>
+        <w:numPr>
+          <w:ilvl w:val="0"/>
+          <w:numId w:val="1"/>
+        </w:numPr>
+        <w:spacing w:after="40"/>
+      </w:pPr>
+      <w:r>
+        <w:rPr>
+          <w:b/>
+          <w:bCs/>
+          <w:color w:val="333333"/>
+          <w:sz w:val="22"/>
+          <w:szCs w:val="22"/>
+        </w:rPr>
+        <w:t xml:space="preserve">A Citation Probability score</w:t>
+      </w:r>
+      <w:r>
+        <w:rPr>
+          <w:color w:val="333333"/>
+          <w:sz w:val="22"/>
+          <w:szCs w:val="22"/>
+        </w:rPr>
+        <w:t xml:space="preserve"> — how likely AI is to cite you when answering questions in your domain.</w:t>
+      </w:r>
+    </w:p>
+    <w:p>
+      <w:pPr>
+        <w:spacing w:after="80"/>
+      </w:pPr>
+    </w:p>
+    <w:p>
+      <w:pPr>
+        <w:spacing w:after="100"/>
+      </w:pPr>
+      <w:r>
+        <w:rPr>
+          <w:color w:val="333333"/>
+          <w:sz w:val="22"/>
+          <w:szCs w:val="22"/>
+        </w:rPr>
+        <w:t xml:space="preserve">It's also </w:t>
+      </w:r>
+      <w:r>
+        <w:rPr>
+          <w:b/>
+          <w:bCs/>
+          <w:color w:val="333333"/>
+          <w:sz w:val="22"/>
+          <w:szCs w:val="22"/>
+        </w:rPr>
+        <w:t xml:space="preserve">brand-aware</w:t>
+      </w:r>
+      <w:r>
+        <w:rPr>
+          <w:color w:val="333333"/>
+          <w:sz w:val="22"/>
+          <w:szCs w:val="22"/>
+        </w:rPr>
+        <w:t xml:space="preserve">: it protects an editorial voice instead of corporatizing it, and it won't tell you to write content for features you don't offer.</w:t>
+      </w:r>
+    </w:p>
+    <w:p>
+      <w:pPr>
+        <w:spacing w:after="80"/>
+      </w:pPr>
+    </w:p>
+    <w:p>
+      <w:pPr>
+        <w:pStyle w:val="Heading2"/>
+        <w:spacing w:after="100" w:before="220"/>
+      </w:pPr>
+      <w:r>
+        <w:rPr>
+          <w:b/>
+          <w:bCs/>
+          <w:color w:val="1a1a2e"/>
+          <w:sz w:val="26"/>
+          <w:szCs w:val="26"/>
+        </w:rPr>
+        <w:t xml:space="preserve">We ran it on ourselves</w:t>
+      </w:r>
+    </w:p>
+    <w:p>
+      <w:pPr>
+        <w:spacing w:after="80"/>
+      </w:pPr>
+    </w:p>
+    <w:p>
+      <w:pPr>
+        <w:spacing w:after="100"/>
+      </w:pPr>
+      <w:r>
+        <w:rPr>
+          <w:color w:val="333333"/>
+          <w:sz w:val="22"/>
+          <w:szCs w:val="22"/>
+        </w:rPr>
+        <w:t xml:space="preserve">Here's the part we're proud of: we ran AEO Analyzers on our </w:t>
+      </w:r>
+      <w:r>
+        <w:rPr>
+          <w:b/>
+          <w:bCs/>
+          <w:color w:val="333333"/>
+          <w:sz w:val="22"/>
+          <w:szCs w:val="22"/>
+        </w:rPr>
+        <w:t xml:space="preserve">own</w:t>
+      </w:r>
+      <w:r>
+        <w:rPr>
+          <w:color w:val="333333"/>
+          <w:sz w:val="22"/>
+          <w:szCs w:val="22"/>
+        </w:rPr>
+        <w:t xml:space="preserve"> site, discovered it was effectively invisible to AI crawlers, and fixed it — our pages are now fully readable and citable. We dogfood the exact thing we ask you to do. A tool built by people who live the problem.</w:t>
+      </w:r>
+    </w:p>
+    <w:p>
+      <w:pPr>
+        <w:spacing w:after="80"/>
+      </w:pPr>
+    </w:p>
+    <w:p>
+      <w:pPr>
+        <w:pStyle w:val="Heading2"/>
+        <w:spacing w:after="100" w:before="220"/>
+      </w:pPr>
+      <w:r>
+        <w:rPr>
+          <w:b/>
+          <w:bCs/>
+          <w:color w:val="1a1a2e"/>
+          <w:sz w:val="26"/>
+          <w:szCs w:val="26"/>
+        </w:rPr>
+        <w:t xml:space="preserve">See where you stand — free</w:t>
+      </w:r>
+    </w:p>
+    <w:p>
+      <w:pPr>
+        <w:spacing w:after="80"/>
+      </w:pPr>
+    </w:p>
+    <w:p>
+      <w:pPr>
+        <w:spacing w:after="100"/>
+      </w:pPr>
+      <w:r>
+        <w:rPr>
+          <w:color w:val="333333"/>
+          <w:sz w:val="22"/>
+          <w:szCs w:val="22"/>
+        </w:rPr>
+        <w:t xml:space="preserve">Your first audit is free: your AEO score, your Citation Probability, and exactly where your gaps are. Run it on your site — then run it on your toughest competitor. </w:t>
+      </w:r>
+      <w:r>
+        <w:rPr>
+          <w:b/>
+          <w:bCs/>
+          <w:color w:val="333333"/>
+          <w:sz w:val="22"/>
+          <w:szCs w:val="22"/>
+        </w:rPr>
+        <w:t xml:space="preserve">The gap between those two scores is the gap AI is using to choose between you, today.</w:t>
+      </w:r>
+    </w:p>
+    <w:p>
+      <w:pPr>
+        <w:spacing w:after="80"/>
+      </w:pPr>
+    </w:p>
+    <w:p>
+      <w:pPr>
+        <w:spacing w:after="100"/>
+      </w:pPr>
+      <w:r>
+        <w:rPr>
+          <w:color w:val="333333"/>
+          <w:sz w:val="22"/>
+          <w:szCs w:val="22"/>
+        </w:rPr>
+        <w:t xml:space="preserve">Only need to fix one site? There's a </w:t>
+      </w:r>
+      <w:r>
+        <w:rPr>
+          <w:b/>
+          <w:bCs/>
+          <w:color w:val="333333"/>
+          <w:sz w:val="22"/>
+          <w:szCs w:val="22"/>
+        </w:rPr>
+        <w:t xml:space="preserve">Day Pass</w:t>
+      </w:r>
+      <w:r>
+        <w:rPr>
+          <w:color w:val="333333"/>
+          <w:sz w:val="22"/>
+          <w:szCs w:val="22"/>
+        </w:rPr>
+        <w:t xml:space="preserve"> — full access for 24 hours, every fix and download, no subscription.</w:t>
+      </w:r>
+    </w:p>
+    <w:p>
+      <w:pPr>
+        <w:spacing w:after="80"/>
+      </w:pPr>
+    </w:p>
+    <w:p>
+      <w:pPr>
+        <w:spacing w:after="100"/>
+      </w:pPr>
+      <w:r>
+        <w:rPr>
+          <w:color w:val="333333"/>
+          <w:sz w:val="22"/>
+          <w:szCs w:val="22"/>
+        </w:rPr>
+        <w:t xml:space="preserve">👉 </w:t>
+      </w:r>
+      <w:r>
+        <w:rPr>
+          <w:b/>
+          <w:bCs/>
+          <w:color w:val="333333"/>
+          <w:sz w:val="22"/>
+          <w:szCs w:val="22"/>
+        </w:rPr>
+        <w:t xml:space="preserve">Run your free audit: https://www.aeoanalyzers.com (https://www.aeoanalyzers.com)</w:t>
+      </w:r>
+    </w:p>
+    <w:p>
+      <w:pPr>
+        <w:spacing w:after="80"/>
+      </w:pPr>
+    </w:p>
+    <w:p>
+      <w:pPr>
+        <w:spacing w:after="100"/>
+      </w:pPr>
+      <w:r>
+        <w:rPr>
+          <w:color w:val="333333"/>
+          <w:sz w:val="22"/>
+          <w:szCs w:val="22"/>
+        </w:rPr>
+        <w:t xml:space="preserve">The brands that win the next decade of discovery won't be the loudest. They'll be the ones AI trusts enough to quote. Find out if that's you — before your competitor does.</w:t>
+      </w:r>
+    </w:p>
+    <w:p>
+      <w:pPr>
+        <w:spacing w:after="80"/>
+      </w:pPr>
+    </w:p>
+    <w:p>
+      <w:pPr>
+        <w:spacing w:after="100"/>
+      </w:pPr>
+      <w:r>
+        <w:rPr>
+          <w:color w:val="333333"/>
+          <w:sz w:val="22"/>
+          <w:szCs w:val="22"/>
+        </w:rPr>
+        <w:t xml:space="preserve">*— Lindsay Hiebert, Founder, AEO Analyzers (PI GenAI LLC)*</w:t>
+      </w:r>
+    </w:p>
+    <w:p>
+      <w:pPr>
+        <w:spacing w:after="80"/>
+      </w:pPr>
+    </w:p>
+    <w:p>
+      <w:pPr>
+        <w:pStyle w:val="Heading1"/>
+        <w:pageBreakBefore/>
+        <w:spacing w:after="160"/>
+      </w:pPr>
+      <w:r>
+        <w:rPr>
+          <w:b/>
+          <w:bCs/>
+          <w:color w:val="1a1a2e"/>
+          <w:sz w:val="30"/>
+          <w:szCs w:val="30"/>
+        </w:rPr>
+        <w:t xml:space="preserve">Part 5 — The Long-Form Relaunch Article (alternate)</w:t>
+      </w:r>
+    </w:p>
+    <w:p>
+      <w:pPr>
+        <w:pStyle w:val="Heading1"/>
+        <w:spacing w:after="120" w:before="240"/>
+      </w:pPr>
+      <w:r>
+        <w:rPr>
+          <w:b/>
+          <w:bCs/>
+          <w:color w:val="1a1a2e"/>
+          <w:sz w:val="32"/>
+          <w:szCs w:val="32"/>
+        </w:rPr>
+        <w:t xml:space="preserve">AEO Analyzers, Reintroduced: The AI-Visibility Tool You Can Actually Trust — and Act On</w:t>
+      </w:r>
+    </w:p>
+    <w:p>
+      <w:pPr>
+        <w:spacing w:after="80"/>
+      </w:pPr>
+    </w:p>
+    <w:p>
+      <w:pPr>
+        <w:spacing w:after="100"/>
+      </w:pPr>
+      <w:r>
+        <w:rPr>
+          <w:b/>
+          <w:bCs/>
+          <w:color w:val="333333"/>
+          <w:sz w:val="22"/>
+          <w:szCs w:val="22"/>
+        </w:rPr>
+        <w:t xml:space="preserve">By Lindsay Hiebert, Founder · PI GenAI LLC</w:t>
+      </w:r>
+    </w:p>
+    <w:p>
+      <w:pPr>
+        <w:spacing w:after="100"/>
+      </w:pPr>
+      <w:r>
+        <w:rPr>
+          <w:color w:val="333333"/>
+          <w:sz w:val="22"/>
+          <w:szCs w:val="22"/>
+        </w:rPr>
+        <w:t xml:space="preserve">*Re-launch announcement · 2026*</w:t>
       </w:r>
     </w:p>
     <w:p>
@@ -13445,6 +13183,1352 @@
           <w:sz w:val="26"/>
           <w:szCs w:val="26"/>
         </w:rPr>
+        <w:t xml:space="preserve">Start here: your customers stopped scrolling. They're asking AI.</w:t>
+      </w:r>
+    </w:p>
+    <w:p>
+      <w:pPr>
+        <w:spacing w:after="80"/>
+      </w:pPr>
+    </w:p>
+    <w:p>
+      <w:pPr>
+        <w:spacing w:after="100"/>
+      </w:pPr>
+      <w:r>
+        <w:rPr>
+          <w:color w:val="333333"/>
+          <w:sz w:val="22"/>
+          <w:szCs w:val="22"/>
+        </w:rPr>
+        <w:t xml:space="preserve">Your buyers no longer scan ten blue links. They ask </w:t>
+      </w:r>
+      <w:r>
+        <w:rPr>
+          <w:b/>
+          <w:bCs/>
+          <w:color w:val="333333"/>
+          <w:sz w:val="22"/>
+          <w:szCs w:val="22"/>
+        </w:rPr>
+        <w:t xml:space="preserve">Gemini, ChatGPT, or Perplexity</w:t>
+      </w:r>
+      <w:r>
+        <w:rPr>
+          <w:color w:val="333333"/>
+          <w:sz w:val="22"/>
+          <w:szCs w:val="22"/>
+        </w:rPr>
+        <w:t xml:space="preserve"> a question and read </w:t>
+      </w:r>
+      <w:r>
+        <w:rPr>
+          <w:b/>
+          <w:bCs/>
+          <w:color w:val="333333"/>
+          <w:sz w:val="22"/>
+          <w:szCs w:val="22"/>
+        </w:rPr>
+        <w:t xml:space="preserve">one answer</w:t>
+      </w:r>
+      <w:r>
+        <w:rPr>
+          <w:color w:val="333333"/>
+          <w:sz w:val="22"/>
+          <w:szCs w:val="22"/>
+        </w:rPr>
+        <w:t xml:space="preserve"> — stitched together from the handful of sites the AI decided to trust. If that's you, you win the customer before they even compare options. If it's your competitor, </w:t>
+      </w:r>
+      <w:r>
+        <w:rPr>
+          <w:b/>
+          <w:bCs/>
+          <w:color w:val="333333"/>
+          <w:sz w:val="22"/>
+          <w:szCs w:val="22"/>
+        </w:rPr>
+        <w:t xml:space="preserve">you lose the sale and never see it happen</w:t>
+      </w:r>
+      <w:r>
+        <w:rPr>
+          <w:color w:val="333333"/>
+          <w:sz w:val="22"/>
+          <w:szCs w:val="22"/>
+        </w:rPr>
+        <w:t xml:space="preserve"> — it doesn't show up in your analytics, your rankings, or your dashboards. It's an invisible leak.</w:t>
+      </w:r>
+    </w:p>
+    <w:p>
+      <w:pPr>
+        <w:spacing w:after="80"/>
+      </w:pPr>
+    </w:p>
+    <w:p>
+      <w:pPr>
+        <w:spacing w:after="100"/>
+      </w:pPr>
+      <w:r>
+        <w:rPr>
+          <w:color w:val="333333"/>
+          <w:sz w:val="22"/>
+          <w:szCs w:val="22"/>
+        </w:rPr>
+        <w:t xml:space="preserve">That's the new game. It's called </w:t>
+      </w:r>
+      <w:r>
+        <w:rPr>
+          <w:b/>
+          <w:bCs/>
+          <w:color w:val="333333"/>
+          <w:sz w:val="22"/>
+          <w:szCs w:val="22"/>
+        </w:rPr>
+        <w:t xml:space="preserve">Answer Engine Optimization (AEO)</w:t>
+      </w:r>
+      <w:r>
+        <w:rPr>
+          <w:color w:val="333333"/>
+          <w:sz w:val="22"/>
+          <w:szCs w:val="22"/>
+        </w:rPr>
+        <w:t xml:space="preserve">, and it is *not* SEO with a new label. SEO got you onto a results page. AEO decides whether </w:t>
+      </w:r>
+      <w:r>
+        <w:rPr>
+          <w:b/>
+          <w:bCs/>
+          <w:color w:val="333333"/>
+          <w:sz w:val="22"/>
+          <w:szCs w:val="22"/>
+        </w:rPr>
+        <w:t xml:space="preserve">you are the result.</w:t>
+      </w:r>
+    </w:p>
+    <w:p>
+      <w:pPr>
+        <w:spacing w:after="80"/>
+      </w:pPr>
+    </w:p>
+    <w:p>
+      <w:pPr>
+        <w:spacing w:after="100"/>
+      </w:pPr>
+      <w:r>
+        <w:rPr>
+          <w:b/>
+          <w:bCs/>
+          <w:color w:val="333333"/>
+          <w:sz w:val="22"/>
+          <w:szCs w:val="22"/>
+        </w:rPr>
+        <w:t xml:space="preserve">AEO Analyzers tells you — in about 90 seconds — whether AI engines cite you, and exactly what to change so they do.</w:t>
+      </w:r>
+    </w:p>
+    <w:p>
+      <w:pPr>
+        <w:spacing w:after="80"/>
+      </w:pPr>
+    </w:p>
+    <w:p>
+      <w:pPr>
+        <w:spacing w:after="100"/>
+      </w:pPr>
+      <w:r>
+        <w:rPr>
+          <w:color w:val="333333"/>
+          <w:sz w:val="22"/>
+          <w:szCs w:val="22"/>
+        </w:rPr>
+        <w:t xml:space="preserve">👉 </w:t>
+      </w:r>
+      <w:r>
+        <w:rPr>
+          <w:b/>
+          <w:bCs/>
+          <w:color w:val="333333"/>
+          <w:sz w:val="22"/>
+          <w:szCs w:val="22"/>
+        </w:rPr>
+        <w:t xml:space="preserve">Run a free audit on your site (and your #1 competitor): https://www.aeoanalyzers.com (https://www.aeoanalyzers.com)</w:t>
+      </w:r>
+    </w:p>
+    <w:p>
+      <w:pPr>
+        <w:spacing w:after="80"/>
+      </w:pPr>
+    </w:p>
+    <w:p>
+      <w:pPr>
+        <w:pBdr>
+          <w:bottom w:val="single" w:color="cccccc" w:sz="1"/>
+        </w:pBdr>
+        <w:spacing w:after="120"/>
+      </w:pPr>
+    </w:p>
+    <w:p>
+      <w:pPr>
+        <w:spacing w:after="80"/>
+      </w:pPr>
+    </w:p>
+    <w:p>
+      <w:pPr>
+        <w:pStyle w:val="Heading2"/>
+        <w:spacing w:after="100" w:before="220"/>
+      </w:pPr>
+      <w:r>
+        <w:rPr>
+          <w:b/>
+          <w:bCs/>
+          <w:color w:val="1a1a2e"/>
+          <w:sz w:val="26"/>
+          <w:szCs w:val="26"/>
+        </w:rPr>
+        <w:t xml:space="preserve">The shift, by the numbers</w:t>
+      </w:r>
+    </w:p>
+    <w:p>
+      <w:pPr>
+        <w:spacing w:after="80"/>
+      </w:pPr>
+    </w:p>
+    <w:p>
+      <w:pPr>
+        <w:spacing w:after="100"/>
+      </w:pPr>
+      <w:r>
+        <w:rPr>
+          <w:color w:val="333333"/>
+          <w:sz w:val="22"/>
+          <w:szCs w:val="22"/>
+        </w:rPr>
+        <w:t xml:space="preserve">This isn't a hunch — the data is stark:</w:t>
+      </w:r>
+    </w:p>
+    <w:p>
+      <w:pPr>
+        <w:spacing w:after="80"/>
+      </w:pPr>
+    </w:p>
+    <w:p>
+      <w:pPr>
+        <w:pStyle w:val="ListParagraph"/>
+        <w:numPr>
+          <w:ilvl w:val="0"/>
+          <w:numId w:val="1"/>
+        </w:numPr>
+        <w:spacing w:after="40"/>
+      </w:pPr>
+      <w:r>
+        <w:rPr>
+          <w:b/>
+          <w:bCs/>
+          <w:color w:val="333333"/>
+          <w:sz w:val="22"/>
+          <w:szCs w:val="22"/>
+        </w:rPr>
+        <w:t xml:space="preserve">Gartner projects traditional search engine volume will fall 25% by 2026</w:t>
+      </w:r>
+      <w:r>
+        <w:rPr>
+          <w:color w:val="333333"/>
+          <w:sz w:val="22"/>
+          <w:szCs w:val="22"/>
+        </w:rPr>
+        <w:t xml:space="preserve"> as people turn to AI chatbots and answer engines instead. (Gartner (https://www.gartner.com/en/newsroom/press-releases/2024-02-19-gartner-predicts-search-engine-volume-will-drop-25-percent-by-2026-due-to-ai-chatbots-and-other-virtual-agents))</w:t>
+      </w:r>
+    </w:p>
+    <w:p>
+      <w:pPr>
+        <w:pStyle w:val="ListParagraph"/>
+        <w:numPr>
+          <w:ilvl w:val="0"/>
+          <w:numId w:val="1"/>
+        </w:numPr>
+        <w:spacing w:after="40"/>
+      </w:pPr>
+      <w:r>
+        <w:rPr>
+          <w:b/>
+          <w:bCs/>
+          <w:color w:val="333333"/>
+          <w:sz w:val="22"/>
+          <w:szCs w:val="22"/>
+        </w:rPr>
+        <w:t xml:space="preserve">Roughly 60% of Google searches now end without a click</w:t>
+      </w:r>
+      <w:r>
+        <w:rPr>
+          <w:color w:val="333333"/>
+          <w:sz w:val="22"/>
+          <w:szCs w:val="22"/>
+        </w:rPr>
+        <w:t xml:space="preserve"> — the answer is read right on the results page — and that climbs to </w:t>
+      </w:r>
+      <w:r>
+        <w:rPr>
+          <w:b/>
+          <w:bCs/>
+          <w:color w:val="333333"/>
+          <w:sz w:val="22"/>
+          <w:szCs w:val="22"/>
+        </w:rPr>
+        <w:t xml:space="preserve">~83% when an AI Overview appears</w:t>
+      </w:r>
+      <w:r>
+        <w:rPr>
+          <w:color w:val="333333"/>
+          <w:sz w:val="22"/>
+          <w:szCs w:val="22"/>
+        </w:rPr>
+        <w:t xml:space="preserve"> (and ~93% in Google's AI Mode). (zero-click research, 2026 (https://www.digitalapplied.com/blog/zero-click-search-statistics-2026-complete-data))</w:t>
+      </w:r>
+    </w:p>
+    <w:p>
+      <w:pPr>
+        <w:pStyle w:val="ListParagraph"/>
+        <w:numPr>
+          <w:ilvl w:val="0"/>
+          <w:numId w:val="1"/>
+        </w:numPr>
+        <w:spacing w:after="40"/>
+      </w:pPr>
+      <w:r>
+        <w:rPr>
+          <w:b/>
+          <w:bCs/>
+          <w:color w:val="333333"/>
+          <w:sz w:val="22"/>
+          <w:szCs w:val="22"/>
+        </w:rPr>
+        <w:t xml:space="preserve">AI Overviews now appear in about half of all searches</w:t>
+      </w:r>
+      <w:r>
+        <w:rPr>
+          <w:color w:val="333333"/>
+          <w:sz w:val="22"/>
+          <w:szCs w:val="22"/>
+        </w:rPr>
+        <w:t xml:space="preserve"> and reach ~2 billion users a month; </w:t>
+      </w:r>
+      <w:r>
+        <w:rPr>
+          <w:b/>
+          <w:bCs/>
+          <w:color w:val="333333"/>
+          <w:sz w:val="22"/>
+          <w:szCs w:val="22"/>
+        </w:rPr>
+        <w:t xml:space="preserve">ChatGPT alone has ~800–900 million weekly users.</w:t>
+      </w:r>
+      <w:r>
+        <w:rPr>
+          <w:color w:val="333333"/>
+          <w:sz w:val="22"/>
+          <w:szCs w:val="22"/>
+        </w:rPr>
+        <w:t xml:space="preserve"> (market data, 2026 (https://firstpagesage.com/seo-blog/google-vs-chatgpt-market-share-report/))</w:t>
+      </w:r>
+    </w:p>
+    <w:p>
+      <w:pPr>
+        <w:spacing w:after="80"/>
+      </w:pPr>
+    </w:p>
+    <w:p>
+      <w:pPr>
+        <w:spacing w:after="100"/>
+      </w:pPr>
+      <w:r>
+        <w:rPr>
+          <w:color w:val="333333"/>
+          <w:sz w:val="22"/>
+          <w:szCs w:val="22"/>
+        </w:rPr>
+        <w:t xml:space="preserve">The takeaway isn't "SEO is dead." SEO still earns the crawl and the ranking. But ranking on a page fewer people click is no longer the same as being </w:t>
+      </w:r>
+      <w:r>
+        <w:rPr>
+          <w:b/>
+          <w:bCs/>
+          <w:color w:val="333333"/>
+          <w:sz w:val="22"/>
+          <w:szCs w:val="22"/>
+        </w:rPr>
+        <w:t xml:space="preserve">the answer AI gives</w:t>
+      </w:r>
+      <w:r>
+        <w:rPr>
+          <w:color w:val="333333"/>
+          <w:sz w:val="22"/>
+          <w:szCs w:val="22"/>
+        </w:rPr>
+        <w:t xml:space="preserve"> — and that answer is increasingly where the customer decides. AEO is the layer that makes you citable in that moment.</w:t>
+      </w:r>
+    </w:p>
+    <w:p>
+      <w:pPr>
+        <w:spacing w:after="80"/>
+      </w:pPr>
+    </w:p>
+    <w:p>
+      <w:pPr>
+        <w:pBdr>
+          <w:bottom w:val="single" w:color="cccccc" w:sz="1"/>
+        </w:pBdr>
+        <w:spacing w:after="120"/>
+      </w:pPr>
+    </w:p>
+    <w:p>
+      <w:pPr>
+        <w:spacing w:after="80"/>
+      </w:pPr>
+    </w:p>
+    <w:p>
+      <w:pPr>
+        <w:pStyle w:val="Heading2"/>
+        <w:spacing w:after="100" w:before="220"/>
+      </w:pPr>
+      <w:r>
+        <w:rPr>
+          <w:b/>
+          <w:bCs/>
+          <w:color w:val="1a1a2e"/>
+          <w:sz w:val="26"/>
+          <w:szCs w:val="26"/>
+        </w:rPr>
+        <w:t xml:space="preserve">Why we're reintroducing it</w:t>
+      </w:r>
+    </w:p>
+    <w:p>
+      <w:pPr>
+        <w:spacing w:after="80"/>
+      </w:pPr>
+    </w:p>
+    <w:p>
+      <w:pPr>
+        <w:spacing w:after="100"/>
+      </w:pPr>
+      <w:r>
+        <w:rPr>
+          <w:color w:val="333333"/>
+          <w:sz w:val="22"/>
+          <w:szCs w:val="22"/>
+        </w:rPr>
+        <w:t xml:space="preserve">We've rebuilt AEO Analyzers around one standard: </w:t>
+      </w:r>
+      <w:r>
+        <w:rPr>
+          <w:b/>
+          <w:bCs/>
+          <w:color w:val="333333"/>
+          <w:sz w:val="22"/>
+          <w:szCs w:val="22"/>
+        </w:rPr>
+        <w:t xml:space="preserve">a report a sophisticated brand owner can't catch making a mistake — and can hand straight to their web team.</w:t>
+      </w:r>
+      <w:r>
+        <w:rPr>
+          <w:color w:val="333333"/>
+          <w:sz w:val="22"/>
+          <w:szCs w:val="22"/>
+        </w:rPr>
+        <w:t xml:space="preserve"> Along the way we even fixed our *own* site (more on that below). This is the version worth your attention.</w:t>
+      </w:r>
+    </w:p>
+    <w:p>
+      <w:pPr>
+        <w:spacing w:after="80"/>
+      </w:pPr>
+    </w:p>
+    <w:p>
+      <w:pPr>
+        <w:pBdr>
+          <w:bottom w:val="single" w:color="cccccc" w:sz="1"/>
+        </w:pBdr>
+        <w:spacing w:after="120"/>
+      </w:pPr>
+    </w:p>
+    <w:p>
+      <w:pPr>
+        <w:spacing w:after="80"/>
+      </w:pPr>
+    </w:p>
+    <w:p>
+      <w:pPr>
+        <w:pStyle w:val="Heading2"/>
+        <w:spacing w:after="100" w:before="220"/>
+      </w:pPr>
+      <w:r>
+        <w:rPr>
+          <w:b/>
+          <w:bCs/>
+          <w:color w:val="1a1a2e"/>
+          <w:sz w:val="26"/>
+          <w:szCs w:val="26"/>
+        </w:rPr>
+        <w:t xml:space="preserve">What makes it different — and why it's better</w:t>
+      </w:r>
+    </w:p>
+    <w:p>
+      <w:pPr>
+        <w:spacing w:after="80"/>
+      </w:pPr>
+    </w:p>
+    <w:p>
+      <w:pPr>
+        <w:spacing w:after="100"/>
+      </w:pPr>
+      <w:r>
+        <w:rPr>
+          <w:color w:val="333333"/>
+          <w:sz w:val="22"/>
+          <w:szCs w:val="22"/>
+        </w:rPr>
+        <w:t xml:space="preserve">Most "AI audit" tools hand you a plausible-looking score and some generic advice. Plausible isn't the same as correct, and a smart marketer spots the difference in five seconds. Here's what AEO Analyzers does that we haven't seen done this way anywhere else — each tied to an </w:t>
+      </w:r>
+      <w:r>
+        <w:rPr>
+          <w:b/>
+          <w:bCs/>
+          <w:color w:val="333333"/>
+          <w:sz w:val="22"/>
+          <w:szCs w:val="22"/>
+        </w:rPr>
+        <w:t xml:space="preserve">outcome</w:t>
+      </w:r>
+      <w:r>
+        <w:rPr>
+          <w:color w:val="333333"/>
+          <w:sz w:val="22"/>
+          <w:szCs w:val="22"/>
+        </w:rPr>
+        <w:t xml:space="preserve">, not a feature.</w:t>
+      </w:r>
+    </w:p>
+    <w:p>
+      <w:pPr>
+        <w:spacing w:after="80"/>
+      </w:pPr>
+    </w:p>
+    <w:p>
+      <w:pPr>
+        <w:spacing w:after="100"/>
+      </w:pPr>
+      <w:r>
+        <w:rPr>
+          <w:b/>
+          <w:bCs/>
+          <w:color w:val="333333"/>
+          <w:sz w:val="22"/>
+          <w:szCs w:val="22"/>
+        </w:rPr>
+        <w:t xml:space="preserve">1. It never makes you paste a lie into your website.</w:t>
+      </w:r>
+    </w:p>
+    <w:p>
+      <w:pPr>
+        <w:spacing w:after="100"/>
+      </w:pPr>
+      <w:r>
+        <w:rPr>
+          <w:color w:val="333333"/>
+          <w:sz w:val="22"/>
+          <w:szCs w:val="22"/>
+        </w:rPr>
+        <w:t xml:space="preserve">Other tools generate JSON-LD schema you're told to paste into your &lt;head&gt; — including values they *guessed*. We split every schema into a </w:t>
+      </w:r>
+      <w:r>
+        <w:rPr>
+          <w:b/>
+          <w:bCs/>
+          <w:color w:val="333333"/>
+          <w:sz w:val="22"/>
+          <w:szCs w:val="22"/>
+        </w:rPr>
+        <w:t xml:space="preserve">"Verified — safe to paste"</w:t>
+      </w:r>
+      <w:r>
+        <w:rPr>
+          <w:color w:val="333333"/>
+          <w:sz w:val="22"/>
+          <w:szCs w:val="22"/>
+        </w:rPr>
+        <w:t xml:space="preserve"> block (only values actually found on your page, with the source quote that proves each one) and a </w:t>
+      </w:r>
+      <w:r>
+        <w:rPr>
+          <w:b/>
+          <w:bCs/>
+          <w:color w:val="333333"/>
+          <w:sz w:val="22"/>
+          <w:szCs w:val="22"/>
+        </w:rPr>
+        <w:t xml:space="preserve">"Candidate — verify first"</w:t>
+      </w:r>
+      <w:r>
+        <w:rPr>
+          <w:color w:val="333333"/>
+          <w:sz w:val="22"/>
+          <w:szCs w:val="22"/>
+        </w:rPr>
+        <w:t xml:space="preserve"> block (anything inferred, clearly flagged).</w:t>
+      </w:r>
+    </w:p>
+    <w:p>
+      <w:pPr>
+        <w:spacing w:after="100"/>
+      </w:pPr>
+      <w:r>
+        <w:rPr>
+          <w:b/>
+          <w:bCs/>
+          <w:color w:val="333333"/>
+          <w:sz w:val="22"/>
+          <w:szCs w:val="22"/>
+        </w:rPr>
+        <w:t xml:space="preserve">Outcome:</w:t>
+      </w:r>
+      <w:r>
+        <w:rPr>
+          <w:color w:val="333333"/>
+          <w:sz w:val="22"/>
+          <w:szCs w:val="22"/>
+        </w:rPr>
+        <w:t xml:space="preserve"> you never publish a fabricated fact that teaches AI engines something false about your business.</w:t>
+      </w:r>
+    </w:p>
+    <w:p>
+      <w:pPr>
+        <w:spacing w:after="80"/>
+      </w:pPr>
+    </w:p>
+    <w:p>
+      <w:pPr>
+        <w:spacing w:after="100"/>
+      </w:pPr>
+      <w:r>
+        <w:rPr>
+          <w:b/>
+          <w:bCs/>
+          <w:color w:val="333333"/>
+          <w:sz w:val="22"/>
+          <w:szCs w:val="22"/>
+        </w:rPr>
+        <w:t xml:space="preserve">2. It knows what kind of business you are — and gives the right advice.</w:t>
+      </w:r>
+    </w:p>
+    <w:p>
+      <w:pPr>
+        <w:spacing w:after="100"/>
+      </w:pPr>
+      <w:r>
+        <w:rPr>
+          <w:color w:val="333333"/>
+          <w:sz w:val="22"/>
+          <w:szCs w:val="22"/>
+        </w:rPr>
+        <w:t xml:space="preserve">Editorial brand? SaaS landing page? Ecommerce store? Most tools run one generic playbook over everything and tell a carefully-voiced publication to sound like a B2B funnel. We detect your register first and </w:t>
+      </w:r>
+      <w:r>
+        <w:rPr>
+          <w:b/>
+          <w:bCs/>
+          <w:color w:val="333333"/>
+          <w:sz w:val="22"/>
+          <w:szCs w:val="22"/>
+        </w:rPr>
+        <w:t xml:space="preserve">protect an editorial brand's voice</w:t>
+      </w:r>
+      <w:r>
+        <w:rPr>
+          <w:color w:val="333333"/>
+          <w:sz w:val="22"/>
+          <w:szCs w:val="22"/>
+        </w:rPr>
+        <w:t xml:space="preserve"> while giving a SaaS page conversion-focused guidance.</w:t>
+      </w:r>
+    </w:p>
+    <w:p>
+      <w:pPr>
+        <w:spacing w:after="100"/>
+      </w:pPr>
+      <w:r>
+        <w:rPr>
+          <w:b/>
+          <w:bCs/>
+          <w:color w:val="333333"/>
+          <w:sz w:val="22"/>
+          <w:szCs w:val="22"/>
+        </w:rPr>
+        <w:t xml:space="preserve">Outcome:</w:t>
+      </w:r>
+      <w:r>
+        <w:rPr>
+          <w:color w:val="333333"/>
+          <w:sz w:val="22"/>
+          <w:szCs w:val="22"/>
+        </w:rPr>
+        <w:t xml:space="preserve"> recommendations that fit your business and don't erase the brand voice that makes you, you.</w:t>
+      </w:r>
+    </w:p>
+    <w:p>
+      <w:pPr>
+        <w:spacing w:after="80"/>
+      </w:pPr>
+    </w:p>
+    <w:p>
+      <w:pPr>
+        <w:spacing w:after="100"/>
+      </w:pPr>
+      <w:r>
+        <w:rPr>
+          <w:b/>
+          <w:bCs/>
+          <w:color w:val="333333"/>
+          <w:sz w:val="22"/>
+          <w:szCs w:val="22"/>
+        </w:rPr>
+        <w:t xml:space="preserve">3. It tells you the truth about what's missing.</w:t>
+      </w:r>
+    </w:p>
+    <w:p>
+      <w:pPr>
+        <w:spacing w:after="100"/>
+      </w:pPr>
+      <w:r>
+        <w:rPr>
+          <w:color w:val="333333"/>
+          <w:sz w:val="22"/>
+          <w:szCs w:val="22"/>
+        </w:rPr>
+        <w:t xml:space="preserve">Other tools flag content as "missing" just because it isn't in the right schema — sending you to write duplicate content you already have. We distinguish *genuinely absent* from *present-but-not-marked-up*, show you the exact on-page sentence, and tell you to </w:t>
+      </w:r>
+      <w:r>
+        <w:rPr>
+          <w:b/>
+          <w:bCs/>
+          <w:color w:val="333333"/>
+          <w:sz w:val="22"/>
+          <w:szCs w:val="22"/>
+        </w:rPr>
+        <w:t xml:space="preserve">wrap it, not rewrite it.</w:t>
+      </w:r>
+      <w:r>
+        <w:rPr>
+          <w:color w:val="333333"/>
+          <w:sz w:val="22"/>
+          <w:szCs w:val="22"/>
+        </w:rPr>
+        <w:t xml:space="preserve"> And it won't recommend creating content for features you don't even offer.</w:t>
+      </w:r>
+    </w:p>
+    <w:p>
+      <w:pPr>
+        <w:spacing w:after="100"/>
+      </w:pPr>
+      <w:r>
+        <w:rPr>
+          <w:b/>
+          <w:bCs/>
+          <w:color w:val="333333"/>
+          <w:sz w:val="22"/>
+          <w:szCs w:val="22"/>
+        </w:rPr>
+        <w:t xml:space="preserve">Outcome:</w:t>
+      </w:r>
+      <w:r>
+        <w:rPr>
+          <w:color w:val="333333"/>
+          <w:sz w:val="22"/>
+          <w:szCs w:val="22"/>
+        </w:rPr>
+        <w:t xml:space="preserve"> less busywork, no duplicate content, faster wins your developer can execute verbatim.</w:t>
+      </w:r>
+    </w:p>
+    <w:p>
+      <w:pPr>
+        <w:spacing w:after="80"/>
+      </w:pPr>
+    </w:p>
+    <w:p>
+      <w:pPr>
+        <w:spacing w:after="100"/>
+      </w:pPr>
+      <w:r>
+        <w:rPr>
+          <w:b/>
+          <w:bCs/>
+          <w:color w:val="333333"/>
+          <w:sz w:val="22"/>
+          <w:szCs w:val="22"/>
+        </w:rPr>
+        <w:t xml:space="preserve">4. It gives you the cure, not just the diagnosis.</w:t>
+      </w:r>
+    </w:p>
+    <w:p>
+      <w:pPr>
+        <w:spacing w:after="100"/>
+      </w:pPr>
+      <w:r>
+        <w:rPr>
+          <w:color w:val="333333"/>
+          <w:sz w:val="22"/>
+          <w:szCs w:val="22"/>
+        </w:rPr>
+        <w:t xml:space="preserve">A score is interesting; a fix is valuable. You get </w:t>
+      </w:r>
+      <w:r>
+        <w:rPr>
+          <w:b/>
+          <w:bCs/>
+          <w:color w:val="333333"/>
+          <w:sz w:val="22"/>
+          <w:szCs w:val="22"/>
+        </w:rPr>
+        <w:t xml:space="preserve">paste-ready JSON-LD, before/after content rewrites, a meta-description rewrite, a prioritized implementation checklist, a downloadable Word report, and a copy-paste handoff template</w:t>
+      </w:r>
+      <w:r>
+        <w:rPr>
+          <w:color w:val="333333"/>
+          <w:sz w:val="22"/>
+          <w:szCs w:val="22"/>
+        </w:rPr>
+        <w:t xml:space="preserve"> for your web team.</w:t>
+      </w:r>
+    </w:p>
+    <w:p>
+      <w:pPr>
+        <w:spacing w:after="100"/>
+      </w:pPr>
+      <w:r>
+        <w:rPr>
+          <w:b/>
+          <w:bCs/>
+          <w:color w:val="333333"/>
+          <w:sz w:val="22"/>
+          <w:szCs w:val="22"/>
+        </w:rPr>
+        <w:t xml:space="preserve">Outcome:</w:t>
+      </w:r>
+      <w:r>
+        <w:rPr>
+          <w:color w:val="333333"/>
+          <w:sz w:val="22"/>
+          <w:szCs w:val="22"/>
+        </w:rPr>
+        <w:t xml:space="preserve"> you don't just learn you have a problem — you get the exact, deploy-ready solution.</w:t>
+      </w:r>
+    </w:p>
+    <w:p>
+      <w:pPr>
+        <w:spacing w:after="80"/>
+      </w:pPr>
+    </w:p>
+    <w:p>
+      <w:pPr>
+        <w:spacing w:after="100"/>
+      </w:pPr>
+      <w:r>
+        <w:rPr>
+          <w:b/>
+          <w:bCs/>
+          <w:color w:val="333333"/>
+          <w:sz w:val="22"/>
+          <w:szCs w:val="22"/>
+        </w:rPr>
+        <w:t xml:space="preserve">5. It shows you the invisible competition.</w:t>
+      </w:r>
+    </w:p>
+    <w:p>
+      <w:pPr>
+        <w:spacing w:after="100"/>
+      </w:pPr>
+      <w:r>
+        <w:rPr>
+          <w:color w:val="333333"/>
+          <w:sz w:val="22"/>
+          <w:szCs w:val="22"/>
+        </w:rPr>
+        <w:t xml:space="preserve">Gemini 3.5–powered AEO analysis (how Gemini, ChatGPT, and Perplexity each perceive you), a </w:t>
+      </w:r>
+      <w:r>
+        <w:rPr>
+          <w:b/>
+          <w:bCs/>
+          <w:color w:val="333333"/>
+          <w:sz w:val="22"/>
+          <w:szCs w:val="22"/>
+        </w:rPr>
+        <w:t xml:space="preserve">Citation Probability</w:t>
+      </w:r>
+      <w:r>
+        <w:rPr>
+          <w:color w:val="333333"/>
+          <w:sz w:val="22"/>
+          <w:szCs w:val="22"/>
+        </w:rPr>
+        <w:t xml:space="preserve"> score, and a head-to-head </w:t>
+      </w:r>
+      <w:r>
+        <w:rPr>
+          <w:b/>
+          <w:bCs/>
+          <w:color w:val="333333"/>
+          <w:sz w:val="22"/>
+          <w:szCs w:val="22"/>
+        </w:rPr>
+        <w:t xml:space="preserve">Competitive Duel</w:t>
+      </w:r>
+      <w:r>
+        <w:rPr>
+          <w:color w:val="333333"/>
+          <w:sz w:val="22"/>
+          <w:szCs w:val="22"/>
+        </w:rPr>
+        <w:t xml:space="preserve"> against a named rival.</w:t>
+      </w:r>
+    </w:p>
+    <w:p>
+      <w:pPr>
+        <w:spacing w:after="100"/>
+      </w:pPr>
+      <w:r>
+        <w:rPr>
+          <w:b/>
+          <w:bCs/>
+          <w:color w:val="333333"/>
+          <w:sz w:val="22"/>
+          <w:szCs w:val="22"/>
+        </w:rPr>
+        <w:t xml:space="preserve">Outcome:</w:t>
+      </w:r>
+      <w:r>
+        <w:rPr>
+          <w:color w:val="333333"/>
+          <w:sz w:val="22"/>
+          <w:szCs w:val="22"/>
+        </w:rPr>
+        <w:t xml:space="preserve"> you finally see where a competitor is winning the citation you should own.</w:t>
+      </w:r>
+    </w:p>
+    <w:p>
+      <w:pPr>
+        <w:spacing w:after="80"/>
+      </w:pPr>
+    </w:p>
+    <w:p>
+      <w:pPr>
+        <w:spacing w:after="100"/>
+      </w:pPr>
+      <w:r>
+        <w:rPr>
+          <w:b/>
+          <w:bCs/>
+          <w:color w:val="333333"/>
+          <w:sz w:val="22"/>
+          <w:szCs w:val="22"/>
+        </w:rPr>
+        <w:t xml:space="preserve">6. It practices what it sells.</w:t>
+      </w:r>
+    </w:p>
+    <w:p>
+      <w:pPr>
+        <w:spacing w:after="100"/>
+      </w:pPr>
+      <w:r>
+        <w:rPr>
+          <w:color w:val="333333"/>
+          <w:sz w:val="22"/>
+          <w:szCs w:val="22"/>
+        </w:rPr>
+        <w:t xml:space="preserve">We ran AEO Analyzers on our *own* site, discovered it was invisible to AI crawlers, and fixed it — our pages are now fully readable and citable by AI engines. We dogfood the exact thing we ask you to do.</w:t>
+      </w:r>
+    </w:p>
+    <w:p>
+      <w:pPr>
+        <w:spacing w:after="100"/>
+      </w:pPr>
+      <w:r>
+        <w:rPr>
+          <w:b/>
+          <w:bCs/>
+          <w:color w:val="333333"/>
+          <w:sz w:val="22"/>
+          <w:szCs w:val="22"/>
+        </w:rPr>
+        <w:t xml:space="preserve">Outcome:</w:t>
+      </w:r>
+      <w:r>
+        <w:rPr>
+          <w:color w:val="333333"/>
+          <w:sz w:val="22"/>
+          <w:szCs w:val="22"/>
+        </w:rPr>
+        <w:t xml:space="preserve"> a tool built by people who actually live the problem.</w:t>
+      </w:r>
+    </w:p>
+    <w:p>
+      <w:pPr>
+        <w:spacing w:after="80"/>
+      </w:pPr>
+    </w:p>
+    <w:p>
+      <w:pPr>
+        <w:spacing w:after="100"/>
+      </w:pPr>
+      <w:r>
+        <w:rPr>
+          <w:color w:val="333333"/>
+          <w:sz w:val="22"/>
+          <w:szCs w:val="22"/>
+        </w:rPr>
+        <w:t xml:space="preserve">And it does all of this in </w:t>
+      </w:r>
+      <w:r>
+        <w:rPr>
+          <w:b/>
+          <w:bCs/>
+          <w:color w:val="333333"/>
+          <w:sz w:val="22"/>
+          <w:szCs w:val="22"/>
+        </w:rPr>
+        <w:t xml:space="preserve">90 seconds</w:t>
+      </w:r>
+      <w:r>
+        <w:rPr>
+          <w:color w:val="333333"/>
+          <w:sz w:val="22"/>
+          <w:szCs w:val="22"/>
+        </w:rPr>
+        <w:t xml:space="preserve"> — work that would take a web team </w:t>
+      </w:r>
+      <w:r>
+        <w:rPr>
+          <w:b/>
+          <w:bCs/>
+          <w:color w:val="333333"/>
+          <w:sz w:val="22"/>
+          <w:szCs w:val="22"/>
+        </w:rPr>
+        <w:t xml:space="preserve">hundreds of hours</w:t>
+      </w:r>
+      <w:r>
+        <w:rPr>
+          <w:color w:val="333333"/>
+          <w:sz w:val="22"/>
+          <w:szCs w:val="22"/>
+        </w:rPr>
+        <w:t xml:space="preserve"> by hand.</w:t>
+      </w:r>
+    </w:p>
+    <w:p>
+      <w:pPr>
+        <w:spacing w:after="80"/>
+      </w:pPr>
+    </w:p>
+    <w:p>
+      <w:pPr>
+        <w:pBdr>
+          <w:bottom w:val="single" w:color="cccccc" w:sz="1"/>
+        </w:pBdr>
+        <w:spacing w:after="120"/>
+      </w:pPr>
+    </w:p>
+    <w:p>
+      <w:pPr>
+        <w:spacing w:after="80"/>
+      </w:pPr>
+    </w:p>
+    <w:p>
+      <w:pPr>
+        <w:pStyle w:val="Heading2"/>
+        <w:spacing w:after="100" w:before="220"/>
+      </w:pPr>
+      <w:r>
+        <w:rPr>
+          <w:b/>
+          <w:bCs/>
+          <w:color w:val="1a1a2e"/>
+          <w:sz w:val="26"/>
+          <w:szCs w:val="26"/>
+        </w:rPr>
+        <w:t xml:space="preserve">What you get, by who you are</w:t>
+      </w:r>
+    </w:p>
+    <w:p>
+      <w:pPr>
+        <w:spacing w:after="80"/>
+      </w:pPr>
+    </w:p>
+    <w:p>
+      <w:pPr>
+        <w:spacing w:after="100"/>
+      </w:pPr>
+      <w:r>
+        <w:rPr>
+          <w:b/>
+          <w:bCs/>
+          <w:color w:val="333333"/>
+          <w:sz w:val="22"/>
+          <w:szCs w:val="22"/>
+        </w:rPr>
+        <w:t xml:space="preserve">Marketing teams &amp; CMOs</w:t>
+      </w:r>
+      <w:r>
+        <w:rPr>
+          <w:color w:val="333333"/>
+          <w:sz w:val="22"/>
+          <w:szCs w:val="22"/>
+        </w:rPr>
+        <w:t xml:space="preserve"> — Visibility into the channel that's quietly replacing search, a repeatable scorecard to prove impact over time, and early warning when a competitor starts displacing you in AI answers.</w:t>
+      </w:r>
+    </w:p>
+    <w:p>
+      <w:pPr>
+        <w:spacing w:after="100"/>
+      </w:pPr>
+      <w:r>
+        <w:rPr>
+          <w:b/>
+          <w:bCs/>
+          <w:color w:val="333333"/>
+          <w:sz w:val="22"/>
+          <w:szCs w:val="22"/>
+        </w:rPr>
+        <w:t xml:space="preserve">Web admins &amp; developers</w:t>
+      </w:r>
+      <w:r>
+        <w:rPr>
+          <w:color w:val="333333"/>
+          <w:sz w:val="22"/>
+          <w:szCs w:val="22"/>
+        </w:rPr>
+        <w:t xml:space="preserve"> — An accurate, deploy-ready report you can execute without guesswork or embarrassment: valid JSON-LD, specific rewrites, a prioritized checklist, and a clean handoff doc.</w:t>
+      </w:r>
+    </w:p>
+    <w:p>
+      <w:pPr>
+        <w:spacing w:after="100"/>
+      </w:pPr>
+      <w:r>
+        <w:rPr>
+          <w:b/>
+          <w:bCs/>
+          <w:color w:val="333333"/>
+          <w:sz w:val="22"/>
+          <w:szCs w:val="22"/>
+        </w:rPr>
+        <w:t xml:space="preserve">Founders &amp; business owners</w:t>
+      </w:r>
+      <w:r>
+        <w:rPr>
+          <w:color w:val="333333"/>
+          <w:sz w:val="22"/>
+          <w:szCs w:val="22"/>
+        </w:rPr>
+        <w:t xml:space="preserve"> — A straight answer to "when someone asks AI about my space, does it recommend me — or my competitor?" — and a clear, cheap path to fix it.</w:t>
+      </w:r>
+    </w:p>
+    <w:p>
+      <w:pPr>
+        <w:spacing w:after="80"/>
+      </w:pPr>
+    </w:p>
+    <w:p>
+      <w:pPr>
+        <w:pBdr>
+          <w:bottom w:val="single" w:color="cccccc" w:sz="1"/>
+        </w:pBdr>
+        <w:spacing w:after="120"/>
+      </w:pPr>
+    </w:p>
+    <w:p>
+      <w:pPr>
+        <w:spacing w:after="80"/>
+      </w:pPr>
+    </w:p>
+    <w:p>
+      <w:pPr>
+        <w:pStyle w:val="Heading2"/>
+        <w:spacing w:after="100" w:before="220"/>
+      </w:pPr>
+      <w:r>
+        <w:rPr>
+          <w:b/>
+          <w:bCs/>
+          <w:color w:val="1a1a2e"/>
+          <w:sz w:val="26"/>
+          <w:szCs w:val="26"/>
+        </w:rPr>
+        <w:t xml:space="preserve">Pricing — including a way for everyone to say yes</w:t>
+      </w:r>
+    </w:p>
+    <w:p>
+      <w:pPr>
+        <w:spacing w:after="80"/>
+      </w:pPr>
+    </w:p>
+    <w:p>
+      <w:pPr>
+        <w:pStyle w:val="ListParagraph"/>
+        <w:numPr>
+          <w:ilvl w:val="0"/>
+          <w:numId w:val="1"/>
+        </w:numPr>
+        <w:spacing w:after="40"/>
+      </w:pPr>
+      <w:r>
+        <w:rPr>
+          <w:b/>
+          <w:bCs/>
+          <w:color w:val="333333"/>
+          <w:sz w:val="22"/>
+          <w:szCs w:val="22"/>
+        </w:rPr>
+        <w:t xml:space="preserve">Free:</w:t>
+      </w:r>
+      <w:r>
+        <w:rPr>
+          <w:color w:val="333333"/>
+          <w:sz w:val="22"/>
+          <w:szCs w:val="22"/>
+        </w:rPr>
+        <w:t xml:space="preserve"> one full diagnostic audit — your score, your gaps, your brand type. See exactly where you stand.</w:t>
+      </w:r>
+    </w:p>
+    <w:p>
+      <w:pPr>
+        <w:pStyle w:val="ListParagraph"/>
+        <w:numPr>
+          <w:ilvl w:val="0"/>
+          <w:numId w:val="1"/>
+        </w:numPr>
+        <w:spacing w:after="40"/>
+      </w:pPr>
+      <w:r>
+        <w:rPr>
+          <w:b/>
+          <w:bCs/>
+          <w:color w:val="333333"/>
+          <w:sz w:val="22"/>
+          <w:szCs w:val="22"/>
+        </w:rPr>
+        <w:t xml:space="preserve">Day Pass — one-time:</w:t>
+      </w:r>
+      <w:r>
+        <w:rPr>
+          <w:color w:val="333333"/>
+          <w:sz w:val="22"/>
+          <w:szCs w:val="22"/>
+        </w:rPr>
+        <w:t xml:space="preserve"> only have a site or two? Unlock </w:t>
+      </w:r>
+      <w:r>
+        <w:rPr>
+          <w:b/>
+          <w:bCs/>
+          <w:color w:val="333333"/>
+          <w:sz w:val="22"/>
+          <w:szCs w:val="22"/>
+        </w:rPr>
+        <w:t xml:space="preserve">every fix and download for 24 hours</w:t>
+      </w:r>
+      <w:r>
+        <w:rPr>
+          <w:color w:val="333333"/>
+          <w:sz w:val="22"/>
+          <w:szCs w:val="22"/>
+        </w:rPr>
+        <w:t xml:space="preserve">, no subscription. Fix it today, done.</w:t>
+      </w:r>
+    </w:p>
+    <w:p>
+      <w:pPr>
+        <w:pStyle w:val="ListParagraph"/>
+        <w:numPr>
+          <w:ilvl w:val="0"/>
+          <w:numId w:val="1"/>
+        </w:numPr>
+        <w:spacing w:after="40"/>
+      </w:pPr>
+      <w:r>
+        <w:rPr>
+          <w:b/>
+          <w:bCs/>
+          <w:color w:val="333333"/>
+          <w:sz w:val="22"/>
+          <w:szCs w:val="22"/>
+        </w:rPr>
+        <w:t xml:space="preserve">Pro:</w:t>
+      </w:r>
+      <w:r>
+        <w:rPr>
+          <w:color w:val="333333"/>
+          <w:sz w:val="22"/>
+          <w:szCs w:val="22"/>
+        </w:rPr>
+        <w:t xml:space="preserve"> for freelancers and small teams.</w:t>
+      </w:r>
+    </w:p>
+    <w:p>
+      <w:pPr>
+        <w:pStyle w:val="ListParagraph"/>
+        <w:numPr>
+          <w:ilvl w:val="0"/>
+          <w:numId w:val="1"/>
+        </w:numPr>
+        <w:spacing w:after="40"/>
+      </w:pPr>
+      <w:r>
+        <w:rPr>
+          <w:b/>
+          <w:bCs/>
+          <w:color w:val="333333"/>
+          <w:sz w:val="22"/>
+          <w:szCs w:val="22"/>
+        </w:rPr>
+        <w:t xml:space="preserve">Business:</w:t>
+      </w:r>
+      <w:r>
+        <w:rPr>
+          <w:color w:val="333333"/>
+          <w:sz w:val="22"/>
+          <w:szCs w:val="22"/>
+        </w:rPr>
+        <w:t xml:space="preserve"> for agencies and growing SaaS — competitor benchmarking and higher volume.</w:t>
+      </w:r>
+    </w:p>
+    <w:p>
+      <w:pPr>
+        <w:spacing w:after="80"/>
+      </w:pPr>
+    </w:p>
+    <w:p>
+      <w:pPr>
+        <w:pBdr>
+          <w:bottom w:val="single" w:color="cccccc" w:sz="1"/>
+        </w:pBdr>
+        <w:spacing w:after="120"/>
+      </w:pPr>
+    </w:p>
+    <w:p>
+      <w:pPr>
+        <w:spacing w:after="80"/>
+      </w:pPr>
+    </w:p>
+    <w:p>
+      <w:pPr>
+        <w:pStyle w:val="Heading2"/>
+        <w:spacing w:after="100" w:before="220"/>
+      </w:pPr>
+      <w:r>
+        <w:rPr>
+          <w:b/>
+          <w:bCs/>
+          <w:color w:val="1a1a2e"/>
+          <w:sz w:val="26"/>
+          <w:szCs w:val="26"/>
+        </w:rPr>
         <w:t xml:space="preserve">The call to action</w:t>
       </w:r>
     </w:p>
@@ -13572,7 +14656,7 @@
           <w:sz w:val="30"/>
           <w:szCs w:val="30"/>
         </w:rPr>
-        <w:t xml:space="preserve">Part 5 — Image Prompt Playbook (regenerate / enhance)</w:t>
+        <w:t xml:space="preserve">Part 6 — Image Prompt Playbook (regenerate / enhance)</w:t>
       </w:r>
     </w:p>
     <w:p>
@@ -17114,7 +18198,7 @@
           <w:sz w:val="30"/>
           <w:szCs w:val="30"/>
         </w:rPr>
-        <w:t xml:space="preserve">Part 6 — Visual Canon (existing-image ↔ story mapping)</w:t>
+        <w:t xml:space="preserve">Part 7 — Visual Canon (existing-image ↔ story mapping)</w:t>
       </w:r>
     </w:p>
     <w:p>

</xml_diff>